<commit_message>
Post Sales invoice button mid
</commit_message>
<xml_diff>
--- a/Certificate.docx
+++ b/Certificate.docx
@@ -1,9 +1,12 @@
 
 <file path=word/document.xml><?xml version="1.0" encoding="utf-8"?>
-<w:document xmlns:a="http://schemas.openxmlformats.org/drawingml/2006/main" xmlns:pic="http://schemas.openxmlformats.org/drawingml/2006/picture" xmlns:a14="http://schemas.microsoft.com/office/drawing/2010/main" xmlns:wpc="http://schemas.microsoft.com/office/word/2010/wordprocessingCanvas" xmlns:cx="http://schemas.microsoft.com/office/drawing/2014/chartex" xmlns:cx1="http://schemas.microsoft.com/office/drawing/2015/9/8/chartex" xmlns:cx2="http://schemas.microsoft.com/office/drawing/2015/10/21/chartex" xmlns:cx3="http://schemas.microsoft.com/office/drawing/2016/5/9/chartex" xmlns:cx4="http://schemas.microsoft.com/office/drawing/2016/5/10/chartex" xmlns:cx5="http://schemas.microsoft.com/office/drawing/2016/5/11/chartex" xmlns:cx6="http://schemas.microsoft.com/office/drawing/2016/5/12/chartex" xmlns:cx7="http://schemas.microsoft.com/office/drawing/2016/5/13/chartex" xmlns:cx8="http://schemas.microsoft.com/office/drawing/2016/5/14/chartex" xmlns:mc="http://schemas.openxmlformats.org/markup-compatibility/2006" xmlns:aink="http://schemas.microsoft.com/office/drawing/2016/ink" xmlns:am3d="http://schemas.microsoft.com/office/drawing/2017/model3d" xmlns:o="urn:schemas-microsoft-com:office:office" xmlns:oel="http://schemas.microsoft.com/office/2019/extlst" xmlns:r="http://schemas.openxmlformats.org/officeDocument/2006/relationships" xmlns:m="http://schemas.openxmlformats.org/officeDocument/2006/math" xmlns:v="urn:schemas-microsoft-com:vml" xmlns:wp14="http://schemas.microsoft.com/office/word/2010/wordprocessingDrawing" xmlns:wp="http://schemas.openxmlformats.org/drawingml/2006/wordprocessingDrawing" xmlns:w10="urn:schemas-microsoft-com:office:word" xmlns:w="http://schemas.openxmlformats.org/wordprocessingml/2006/main" xmlns:w14="http://schemas.microsoft.com/office/word/2010/wordml" xmlns:w15="http://schemas.microsoft.com/office/word/2012/wordml" xmlns:w16cex="http://schemas.microsoft.com/office/word/2018/wordml/cex" xmlns:w16cid="http://schemas.microsoft.com/office/word/2016/wordml/cid" xmlns:w16="http://schemas.microsoft.com/office/word/2018/wordml" xmlns:w16du="http://schemas.microsoft.com/office/word/2023/wordml/word16du" xmlns:w16sdtdh="http://schemas.microsoft.com/office/word/2020/wordml/sdtdatahash" xmlns:w16sdtfl="http://schemas.microsoft.com/office/word/2024/wordml/sdtformatlock" xmlns:w16se="http://schemas.microsoft.com/office/word/2015/wordml/symex" xmlns:wpg="http://schemas.microsoft.com/office/word/2010/wordprocessingGroup" xmlns:wpi="http://schemas.microsoft.com/office/word/2010/wordprocessingInk" xmlns:wne="http://schemas.microsoft.com/office/word/2006/wordml" xmlns:wps="http://schemas.microsoft.com/office/word/2010/wordprocessingShape" mc:Ignorable="w14 w15 w16se w16cid w16 w16cex w16sdtdh w16sdtfl w16du wp14">
+<w:document xmlns:wpc="http://schemas.microsoft.com/office/word/2010/wordprocessingCanvas" xmlns:cx="http://schemas.microsoft.com/office/drawing/2014/chartex" xmlns:cx1="http://schemas.microsoft.com/office/drawing/2015/9/8/chartex" xmlns:cx2="http://schemas.microsoft.com/office/drawing/2015/10/21/chartex" xmlns:cx3="http://schemas.microsoft.com/office/drawing/2016/5/9/chartex" xmlns:cx4="http://schemas.microsoft.com/office/drawing/2016/5/10/chartex" xmlns:cx5="http://schemas.microsoft.com/office/drawing/2016/5/11/chartex" xmlns:cx6="http://schemas.microsoft.com/office/drawing/2016/5/12/chartex" xmlns:cx7="http://schemas.microsoft.com/office/drawing/2016/5/13/chartex" xmlns:cx8="http://schemas.microsoft.com/office/drawing/2016/5/14/chartex" xmlns:mc="http://schemas.openxmlformats.org/markup-compatibility/2006" xmlns:aink="http://schemas.microsoft.com/office/drawing/2016/ink" xmlns:am3d="http://schemas.microsoft.com/office/drawing/2017/model3d" xmlns:o="urn:schemas-microsoft-com:office:office" xmlns:oel="http://schemas.microsoft.com/office/2019/extlst" xmlns:r="http://schemas.openxmlformats.org/officeDocument/2006/relationships" xmlns:m="http://schemas.openxmlformats.org/officeDocument/2006/math" xmlns:v="urn:schemas-microsoft-com:vml" xmlns:wp14="http://schemas.microsoft.com/office/word/2010/wordprocessingDrawing" xmlns:wp="http://schemas.openxmlformats.org/drawingml/2006/wordprocessingDrawing" xmlns:w10="urn:schemas-microsoft-com:office:word" xmlns:w="http://schemas.openxmlformats.org/wordprocessingml/2006/main" xmlns:w14="http://schemas.microsoft.com/office/word/2010/wordml" xmlns:w15="http://schemas.microsoft.com/office/word/2012/wordml" xmlns:w16cex="http://schemas.microsoft.com/office/word/2018/wordml/cex" xmlns:w16cid="http://schemas.microsoft.com/office/word/2016/wordml/cid" xmlns:w16="http://schemas.microsoft.com/office/word/2018/wordml" xmlns:w16du="http://schemas.microsoft.com/office/word/2023/wordml/word16du" xmlns:w16sdtdh="http://schemas.microsoft.com/office/word/2020/wordml/sdtdatahash" xmlns:w16sdtfl="http://schemas.microsoft.com/office/word/2024/wordml/sdtformatlock" xmlns:w16se="http://schemas.microsoft.com/office/word/2015/wordml/symex" xmlns:wpg="http://schemas.microsoft.com/office/word/2010/wordprocessingGroup" xmlns:wpi="http://schemas.microsoft.com/office/word/2010/wordprocessingInk" xmlns:wne="http://schemas.microsoft.com/office/word/2006/wordml" xmlns:wps="http://schemas.microsoft.com/office/word/2010/wordprocessingShape" mc:Ignorable="w14 w15 w16se w16cid w16 w16cex w16sdtdh w16sdtfl w16du wp14">
   <w:body>
     <w:p>
       <w:r>
+        <w:rPr>
+          <w:noProof/>
+        </w:rPr>
         <w:drawing>
           <wp:inline distT="0" distB="0" distL="0" distR="0" wp14:anchorId="52D7CA0C" wp14:editId="541D6949">
             <wp:extent cx="2065020" cy="312420"/>
@@ -106,49 +109,11 @@
       <w:r>
         <w:t>Date of Sale: </w:t>
       </w:r>
-      <w:proofErr w:type="spellStart"/>
-      <w:sdt>
-        <w:sdtPr>
-          <w:id w:val="-1926566067"/>
-          <w:placeholder>
-            <w:docPart w:val="DefaultPlaceholder_-1854013440"/>
-          </w:placeholder>
-          <w:dataBinding w:prefixMappings="xmlns:ns0='urn:microsoft-dynamics-nav/reports/Certificate/50200/' " w:xpath="/ns0:NavWordReportXmlPart[1]/ns0:SafetyCertificate[1]/ns0:DateOfSale[1]" w:storeItemID="{6A36634F-392F-4F9D-A102-FC53C401238A}"/>
-          <w:text/>
-          <w:alias w:val="#Nav: /SafetyCertificate/DateOfSale"/>
-          <w:tag w:val="#Nav: Certificate/50200"/>
-        </w:sdtPr>
-        <w:sdtContent>
-          <w:r>
-            <w:t>DateOfSale</w:t>
-          </w:r>
-          <w:proofErr w:type="spellEnd"/>
-        </w:sdtContent>
-      </w:sdt>
     </w:p>
     <w:p>
       <w:r>
         <w:t>Order No.: </w:t>
       </w:r>
-      <w:proofErr w:type="spellStart"/>
-      <w:sdt>
-        <w:sdtPr>
-          <w:id w:val="-863521601"/>
-          <w:placeholder>
-            <w:docPart w:val="DefaultPlaceholder_-1854013440"/>
-          </w:placeholder>
-          <w:dataBinding w:prefixMappings="xmlns:ns0='urn:microsoft-dynamics-nav/reports/Certificate/50200/' " w:xpath="/ns0:NavWordReportXmlPart[1]/ns0:SafetyCertificate[1]/ns0:SalesOrderNo[1]" w:storeItemID="{6A36634F-392F-4F9D-A102-FC53C401238A}"/>
-          <w:text/>
-          <w:alias w:val="#Nav: /SafetyCertificate/SalesOrderNo"/>
-          <w:tag w:val="#Nav: Certificate/50200"/>
-        </w:sdtPr>
-        <w:sdtContent>
-          <w:r>
-            <w:t>SalesOrderNo</w:t>
-          </w:r>
-          <w:proofErr w:type="spellEnd"/>
-        </w:sdtContent>
-      </w:sdt>
     </w:p>
     <w:p>
       <w:r>
@@ -179,91 +144,21 @@
       <w:r>
         <w:t>Product Name: </w:t>
       </w:r>
-      <w:sdt>
-        <w:sdtPr>
-          <w:id w:val="-1455939408"/>
-          <w:placeholder>
-            <w:docPart w:val="DefaultPlaceholder_-1854013440"/>
-          </w:placeholder>
-          <w:dataBinding w:prefixMappings="xmlns:ns0='urn:microsoft-dynamics-nav/reports/Certificate/50200/' " w:xpath="/ns0:NavWordReportXmlPart[1]/ns0:SafetyCertificate[1]/ns0:ProductName[1]" w:storeItemID="{6A36634F-392F-4F9D-A102-FC53C401238A}"/>
-          <w:text/>
-          <w:alias w:val="#Nav: /SafetyCertificate/ProductName"/>
-          <w:tag w:val="#Nav: Certificate/50200"/>
-        </w:sdtPr>
-        <w:sdtContent>
-          <w:r>
-            <w:t>ProductName</w:t>
-          </w:r>
-        </w:sdtContent>
-      </w:sdt>
-    </w:p>
-    <w:p>
-      <w:r>
-        <w:t>Manufacturer: </w:t>
-      </w:r>
-      <w:sdt>
-        <w:sdtPr>
-          <w:id w:val="-1807617787"/>
-          <w:placeholder>
-            <w:docPart w:val="DefaultPlaceholder_-1854013440"/>
-          </w:placeholder>
-          <w:dataBinding w:prefixMappings="xmlns:ns0='urn:microsoft-dynamics-nav/reports/Certificate/50200/' " w:xpath="/ns0:NavWordReportXmlPart[1]/ns0:SafetyCertificate[1]/ns0:Manufacturer[1]" w:storeItemID="{6A36634F-392F-4F9D-A102-FC53C401238A}"/>
-          <w:text/>
-          <w:alias w:val="#Nav: /SafetyCertificate/Manufacturer"/>
-          <w:tag w:val="#Nav: Certificate/50200"/>
-        </w:sdtPr>
-        <w:sdtContent>
-          <w:r>
-            <w:t>Manufacturer</w:t>
-          </w:r>
-        </w:sdtContent>
-      </w:sdt>
+    </w:p>
+    <w:p>
+      <w:r>
+        <w:t>Manufacturer:</w:t>
+      </w:r>
     </w:p>
     <w:p>
       <w:r>
         <w:t>Certificate No.: </w:t>
       </w:r>
-      <w:proofErr w:type="spellStart"/>
-      <w:sdt>
-        <w:sdtPr>
-          <w:id w:val="-2013439223"/>
-          <w:placeholder>
-            <w:docPart w:val="DefaultPlaceholder_-1854013440"/>
-          </w:placeholder>
-          <w:dataBinding w:prefixMappings="xmlns:ns0='urn:microsoft-dynamics-nav/reports/Certificate/50200/' " w:xpath="/ns0:NavWordReportXmlPart[1]/ns0:SafetyCertificate[1]/ns0:CertificateNo[1]" w:storeItemID="{6A36634F-392F-4F9D-A102-FC53C401238A}"/>
-          <w:text/>
-          <w:alias w:val="#Nav: /SafetyCertificate/CertificateNo"/>
-          <w:tag w:val="#Nav: Certificate/50200"/>
-        </w:sdtPr>
-        <w:sdtContent>
-          <w:r>
-            <w:t>CertificateNo</w:t>
-          </w:r>
-          <w:proofErr w:type="spellEnd"/>
-        </w:sdtContent>
-      </w:sdt>
     </w:p>
     <w:p>
       <w:r>
         <w:t>Valid To: </w:t>
       </w:r>
-      <w:sdt>
-        <w:sdtPr>
-          <w:id w:val="-44302926"/>
-          <w:placeholder>
-            <w:docPart w:val="DefaultPlaceholder_-1854013440"/>
-          </w:placeholder>
-          <w:dataBinding w:prefixMappings="xmlns:ns0='urn:microsoft-dynamics-nav/reports/Certificate/50200/' " w:xpath="/ns0:NavWordReportXmlPart[1]/ns0:SafetyCertificate[1]/ns0:ValidTo[1]" w:storeItemID="{6A36634F-392F-4F9D-A102-FC53C401238A}"/>
-          <w:text/>
-          <w:alias w:val="#Nav: /SafetyCertificate/ValidTo"/>
-          <w:tag w:val="#Nav: Certificate/50200"/>
-        </w:sdtPr>
-        <w:sdtContent>
-          <w:r>
-            <w:t>ValidTo</w:t>
-          </w:r>
-        </w:sdtContent>
-      </w:sdt>
     </w:p>
     <w:p>
       <w:r>
@@ -296,13 +191,8 @@
       </w:r>
     </w:p>
     <w:p>
-      <w:proofErr w:type="gramStart"/>
-      <w:r>
-        <w:t>electrical</w:t>
-      </w:r>
-      <w:proofErr w:type="gramEnd"/>
-      <w:r>
-        <w:t>, mechanical, and environmental safety evaluation and meets the compliance requirements for our distribution within the UK C EU markets. </w:t>
+      <w:r>
+        <w:t>electrical, mechanical, and environmental safety evaluation and meets the compliance requirements for our distribution within the UK C EU markets. </w:t>
       </w:r>
     </w:p>
     <w:p/>
@@ -317,543 +207,6 @@
 </file>
 
 <file path=word/styles.xml><?xml version="1.0" encoding="utf-8"?>
-<w:styles xmlns:mc="http://schemas.openxmlformats.org/markup-compatibility/2006" xmlns:r="http://schemas.openxmlformats.org/officeDocument/2006/relationships" xmlns:w="http://schemas.openxmlformats.org/wordprocessingml/2006/main" xmlns:w14="http://schemas.microsoft.com/office/word/2010/wordml" xmlns:w15="http://schemas.microsoft.com/office/word/2012/wordml" xmlns:w16cex="http://schemas.microsoft.com/office/word/2018/wordml/cex" xmlns:w16cid="http://schemas.microsoft.com/office/word/2016/wordml/cid" xmlns:w16="http://schemas.microsoft.com/office/word/2018/wordml" xmlns:w16du="http://schemas.microsoft.com/office/word/2023/wordml/word16du" xmlns:w16sdtdh="http://schemas.microsoft.com/office/word/2020/wordml/sdtdatahash" xmlns:w16sdtfl="http://schemas.microsoft.com/office/word/2024/wordml/sdtformatlock" xmlns:w16se="http://schemas.microsoft.com/office/word/2015/wordml/symex" mc:Ignorable="w14 w15 w16se w16cid w16 w16cex w16sdtdh w16sdtfl w16du">
-  <w:docDefaults>
-    <w:rPrDefault>
-      <w:rPr>
-        <w:rFonts w:asciiTheme="minorHAnsi" w:eastAsiaTheme="minorEastAsia" w:hAnsiTheme="minorHAnsi" w:cstheme="minorBidi"/>
-        <w:kern w:val="2"/>
-        <w:sz w:val="24"/>
-        <w:szCs w:val="24"/>
-        <w:lang w:val="en-US" w:eastAsia="en-US" w:bidi="ar-SA"/>
-        <w14:ligatures w14:val="standardContextual"/>
-      </w:rPr>
-    </w:rPrDefault>
-    <w:pPrDefault>
-      <w:pPr>
-        <w:spacing w:after="160" w:line="278" w:lineRule="auto"/>
-      </w:pPr>
-    </w:pPrDefault>
-  </w:docDefaults>
-  <w:latentStyles w:defLockedState="0" w:defUIPriority="99" w:defSemiHidden="0" w:defUnhideWhenUsed="0" w:defQFormat="0" w:count="376">
-    <w:lsdException w:name="Normal" w:uiPriority="0" w:qFormat="1"/>
-    <w:lsdException w:name="heading 1" w:uiPriority="9" w:qFormat="1"/>
-    <w:lsdException w:name="heading 2" w:semiHidden="1" w:uiPriority="9" w:unhideWhenUsed="1" w:qFormat="1"/>
-    <w:lsdException w:name="heading 3" w:semiHidden="1" w:uiPriority="9" w:unhideWhenUsed="1" w:qFormat="1"/>
-    <w:lsdException w:name="heading 4" w:semiHidden="1" w:uiPriority="9" w:unhideWhenUsed="1" w:qFormat="1"/>
-    <w:lsdException w:name="heading 5" w:semiHidden="1" w:uiPriority="9" w:unhideWhenUsed="1" w:qFormat="1"/>
-    <w:lsdException w:name="heading 6" w:semiHidden="1" w:uiPriority="9" w:unhideWhenUsed="1" w:qFormat="1"/>
-    <w:lsdException w:name="heading 7" w:semiHidden="1" w:uiPriority="9" w:unhideWhenUsed="1" w:qFormat="1"/>
-    <w:lsdException w:name="heading 8" w:semiHidden="1" w:uiPriority="9" w:unhideWhenUsed="1" w:qFormat="1"/>
-    <w:lsdException w:name="heading 9" w:semiHidden="1" w:uiPriority="9" w:unhideWhenUsed="1" w:qFormat="1"/>
-    <w:lsdException w:name="index 1" w:semiHidden="1" w:unhideWhenUsed="1"/>
-    <w:lsdException w:name="index 2" w:semiHidden="1" w:unhideWhenUsed="1"/>
-    <w:lsdException w:name="index 3" w:semiHidden="1" w:unhideWhenUsed="1"/>
-    <w:lsdException w:name="index 4" w:semiHidden="1" w:unhideWhenUsed="1"/>
-    <w:lsdException w:name="index 5" w:semiHidden="1" w:unhideWhenUsed="1"/>
-    <w:lsdException w:name="index 6" w:semiHidden="1" w:unhideWhenUsed="1"/>
-    <w:lsdException w:name="index 7" w:semiHidden="1" w:unhideWhenUsed="1"/>
-    <w:lsdException w:name="index 8" w:semiHidden="1" w:unhideWhenUsed="1"/>
-    <w:lsdException w:name="index 9" w:semiHidden="1" w:unhideWhenUsed="1"/>
-    <w:lsdException w:name="toc 1" w:semiHidden="1" w:uiPriority="39" w:unhideWhenUsed="1"/>
-    <w:lsdException w:name="toc 2" w:semiHidden="1" w:uiPriority="39" w:unhideWhenUsed="1"/>
-    <w:lsdException w:name="toc 3" w:semiHidden="1" w:uiPriority="39" w:unhideWhenUsed="1"/>
-    <w:lsdException w:name="toc 4" w:semiHidden="1" w:uiPriority="39" w:unhideWhenUsed="1"/>
-    <w:lsdException w:name="toc 5" w:semiHidden="1" w:uiPriority="39" w:unhideWhenUsed="1"/>
-    <w:lsdException w:name="toc 6" w:semiHidden="1" w:uiPriority="39" w:unhideWhenUsed="1"/>
-    <w:lsdException w:name="toc 7" w:semiHidden="1" w:uiPriority="39" w:unhideWhenUsed="1"/>
-    <w:lsdException w:name="toc 8" w:semiHidden="1" w:uiPriority="39" w:unhideWhenUsed="1"/>
-    <w:lsdException w:name="toc 9" w:semiHidden="1" w:uiPriority="39" w:unhideWhenUsed="1"/>
-    <w:lsdException w:name="Normal Indent" w:semiHidden="1" w:unhideWhenUsed="1"/>
-    <w:lsdException w:name="footnote text" w:semiHidden="1" w:unhideWhenUsed="1"/>
-    <w:lsdException w:name="annotation text" w:semiHidden="1" w:unhideWhenUsed="1"/>
-    <w:lsdException w:name="header" w:semiHidden="1" w:unhideWhenUsed="1"/>
-    <w:lsdException w:name="footer" w:semiHidden="1" w:unhideWhenUsed="1"/>
-    <w:lsdException w:name="index heading" w:semiHidden="1" w:unhideWhenUsed="1"/>
-    <w:lsdException w:name="caption" w:semiHidden="1" w:uiPriority="35" w:unhideWhenUsed="1" w:qFormat="1"/>
-    <w:lsdException w:name="table of figures" w:semiHidden="1" w:unhideWhenUsed="1"/>
-    <w:lsdException w:name="envelope address" w:semiHidden="1" w:unhideWhenUsed="1"/>
-    <w:lsdException w:name="envelope return" w:semiHidden="1" w:unhideWhenUsed="1"/>
-    <w:lsdException w:name="footnote reference" w:semiHidden="1" w:unhideWhenUsed="1"/>
-    <w:lsdException w:name="annotation reference" w:semiHidden="1" w:unhideWhenUsed="1"/>
-    <w:lsdException w:name="line number" w:semiHidden="1" w:unhideWhenUsed="1"/>
-    <w:lsdException w:name="page number" w:semiHidden="1" w:unhideWhenUsed="1"/>
-    <w:lsdException w:name="endnote reference" w:semiHidden="1" w:unhideWhenUsed="1"/>
-    <w:lsdException w:name="endnote text" w:semiHidden="1" w:unhideWhenUsed="1"/>
-    <w:lsdException w:name="table of authorities" w:semiHidden="1" w:unhideWhenUsed="1"/>
-    <w:lsdException w:name="macro" w:semiHidden="1" w:unhideWhenUsed="1"/>
-    <w:lsdException w:name="toa heading" w:semiHidden="1" w:unhideWhenUsed="1"/>
-    <w:lsdException w:name="List" w:semiHidden="1" w:unhideWhenUsed="1"/>
-    <w:lsdException w:name="List Bullet" w:semiHidden="1" w:unhideWhenUsed="1"/>
-    <w:lsdException w:name="List Number" w:semiHidden="1" w:unhideWhenUsed="1"/>
-    <w:lsdException w:name="List 2" w:semiHidden="1" w:unhideWhenUsed="1"/>
-    <w:lsdException w:name="List 3" w:semiHidden="1" w:unhideWhenUsed="1"/>
-    <w:lsdException w:name="List 4" w:semiHidden="1" w:unhideWhenUsed="1"/>
-    <w:lsdException w:name="List 5" w:semiHidden="1" w:unhideWhenUsed="1"/>
-    <w:lsdException w:name="List Bullet 2" w:semiHidden="1" w:unhideWhenUsed="1"/>
-    <w:lsdException w:name="List Bullet 3" w:semiHidden="1" w:unhideWhenUsed="1"/>
-    <w:lsdException w:name="List Bullet 4" w:semiHidden="1" w:unhideWhenUsed="1"/>
-    <w:lsdException w:name="List Bullet 5" w:semiHidden="1" w:unhideWhenUsed="1"/>
-    <w:lsdException w:name="List Number 2" w:semiHidden="1" w:unhideWhenUsed="1"/>
-    <w:lsdException w:name="List Number 3" w:semiHidden="1" w:unhideWhenUsed="1"/>
-    <w:lsdException w:name="List Number 4" w:semiHidden="1" w:unhideWhenUsed="1"/>
-    <w:lsdException w:name="List Number 5" w:semiHidden="1" w:unhideWhenUsed="1"/>
-    <w:lsdException w:name="Title" w:uiPriority="10" w:qFormat="1"/>
-    <w:lsdException w:name="Closing" w:semiHidden="1" w:unhideWhenUsed="1"/>
-    <w:lsdException w:name="Signature" w:semiHidden="1" w:unhideWhenUsed="1"/>
-    <w:lsdException w:name="Default Paragraph Font" w:semiHidden="1" w:uiPriority="1" w:unhideWhenUsed="1"/>
-    <w:lsdException w:name="Body Text" w:semiHidden="1" w:unhideWhenUsed="1"/>
-    <w:lsdException w:name="Body Text Indent" w:semiHidden="1" w:unhideWhenUsed="1"/>
-    <w:lsdException w:name="List Continue" w:semiHidden="1" w:unhideWhenUsed="1"/>
-    <w:lsdException w:name="List Continue 2" w:semiHidden="1" w:unhideWhenUsed="1"/>
-    <w:lsdException w:name="List Continue 3" w:semiHidden="1" w:unhideWhenUsed="1"/>
-    <w:lsdException w:name="List Continue 4" w:semiHidden="1" w:unhideWhenUsed="1"/>
-    <w:lsdException w:name="List Continue 5" w:semiHidden="1" w:unhideWhenUsed="1"/>
-    <w:lsdException w:name="Message Header" w:semiHidden="1" w:unhideWhenUsed="1"/>
-    <w:lsdException w:name="Subtitle" w:uiPriority="11" w:qFormat="1"/>
-    <w:lsdException w:name="Salutation" w:semiHidden="1" w:unhideWhenUsed="1"/>
-    <w:lsdException w:name="Date" w:semiHidden="1" w:unhideWhenUsed="1"/>
-    <w:lsdException w:name="Body Text First Indent" w:semiHidden="1" w:unhideWhenUsed="1"/>
-    <w:lsdException w:name="Body Text First Indent 2" w:semiHidden="1" w:unhideWhenUsed="1"/>
-    <w:lsdException w:name="Note Heading" w:semiHidden="1" w:unhideWhenUsed="1"/>
-    <w:lsdException w:name="Body Text 2" w:semiHidden="1" w:unhideWhenUsed="1"/>
-    <w:lsdException w:name="Body Text 3" w:semiHidden="1" w:unhideWhenUsed="1"/>
-    <w:lsdException w:name="Body Text Indent 2" w:semiHidden="1" w:unhideWhenUsed="1"/>
-    <w:lsdException w:name="Body Text Indent 3" w:semiHidden="1" w:unhideWhenUsed="1"/>
-    <w:lsdException w:name="Block Text" w:semiHidden="1" w:unhideWhenUsed="1"/>
-    <w:lsdException w:name="Hyperlink" w:semiHidden="1" w:unhideWhenUsed="1"/>
-    <w:lsdException w:name="FollowedHyperlink" w:semiHidden="1" w:unhideWhenUsed="1"/>
-    <w:lsdException w:name="Strong" w:uiPriority="22" w:qFormat="1"/>
-    <w:lsdException w:name="Emphasis" w:uiPriority="20" w:qFormat="1"/>
-    <w:lsdException w:name="Document Map" w:semiHidden="1" w:unhideWhenUsed="1"/>
-    <w:lsdException w:name="Plain Text" w:semiHidden="1" w:unhideWhenUsed="1"/>
-    <w:lsdException w:name="E-mail Signature" w:semiHidden="1" w:unhideWhenUsed="1"/>
-    <w:lsdException w:name="HTML Top of Form" w:semiHidden="1" w:unhideWhenUsed="1"/>
-    <w:lsdException w:name="HTML Bottom of Form" w:semiHidden="1" w:unhideWhenUsed="1"/>
-    <w:lsdException w:name="Normal (Web)" w:semiHidden="1" w:unhideWhenUsed="1"/>
-    <w:lsdException w:name="HTML Acronym" w:semiHidden="1" w:unhideWhenUsed="1"/>
-    <w:lsdException w:name="HTML Address" w:semiHidden="1" w:unhideWhenUsed="1"/>
-    <w:lsdException w:name="HTML Cite" w:semiHidden="1" w:unhideWhenUsed="1"/>
-    <w:lsdException w:name="HTML Code" w:semiHidden="1" w:unhideWhenUsed="1"/>
-    <w:lsdException w:name="HTML Definition" w:semiHidden="1" w:unhideWhenUsed="1"/>
-    <w:lsdException w:name="HTML Keyboard" w:semiHidden="1" w:unhideWhenUsed="1"/>
-    <w:lsdException w:name="HTML Preformatted" w:semiHidden="1" w:unhideWhenUsed="1"/>
-    <w:lsdException w:name="HTML Sample" w:semiHidden="1" w:unhideWhenUsed="1"/>
-    <w:lsdException w:name="HTML Typewriter" w:semiHidden="1" w:unhideWhenUsed="1"/>
-    <w:lsdException w:name="HTML Variable" w:semiHidden="1" w:unhideWhenUsed="1"/>
-    <w:lsdException w:name="Normal Table" w:semiHidden="1" w:unhideWhenUsed="1"/>
-    <w:lsdException w:name="annotation subject" w:semiHidden="1" w:unhideWhenUsed="1"/>
-    <w:lsdException w:name="No List" w:semiHidden="1" w:unhideWhenUsed="1"/>
-    <w:lsdException w:name="Outline List 1" w:semiHidden="1" w:unhideWhenUsed="1"/>
-    <w:lsdException w:name="Outline List 2" w:semiHidden="1" w:unhideWhenUsed="1"/>
-    <w:lsdException w:name="Outline List 3" w:semiHidden="1" w:unhideWhenUsed="1"/>
-    <w:lsdException w:name="Table Simple 1" w:semiHidden="1" w:unhideWhenUsed="1"/>
-    <w:lsdException w:name="Table Simple 2" w:semiHidden="1" w:unhideWhenUsed="1"/>
-    <w:lsdException w:name="Table Simple 3" w:semiHidden="1" w:unhideWhenUsed="1"/>
-    <w:lsdException w:name="Table Classic 1" w:semiHidden="1" w:unhideWhenUsed="1"/>
-    <w:lsdException w:name="Table Classic 2" w:semiHidden="1" w:unhideWhenUsed="1"/>
-    <w:lsdException w:name="Table Classic 3" w:semiHidden="1" w:unhideWhenUsed="1"/>
-    <w:lsdException w:name="Table Classic 4" w:semiHidden="1" w:unhideWhenUsed="1"/>
-    <w:lsdException w:name="Table Colorful 1" w:semiHidden="1" w:unhideWhenUsed="1"/>
-    <w:lsdException w:name="Table Colorful 2" w:semiHidden="1" w:unhideWhenUsed="1"/>
-    <w:lsdException w:name="Table Colorful 3" w:semiHidden="1" w:unhideWhenUsed="1"/>
-    <w:lsdException w:name="Table Columns 1" w:semiHidden="1" w:unhideWhenUsed="1"/>
-    <w:lsdException w:name="Table Columns 2" w:semiHidden="1" w:unhideWhenUsed="1"/>
-    <w:lsdException w:name="Table Columns 3" w:semiHidden="1" w:unhideWhenUsed="1"/>
-    <w:lsdException w:name="Table Columns 4" w:semiHidden="1" w:unhideWhenUsed="1"/>
-    <w:lsdException w:name="Table Columns 5" w:semiHidden="1" w:unhideWhenUsed="1"/>
-    <w:lsdException w:name="Table Grid 1" w:semiHidden="1" w:unhideWhenUsed="1"/>
-    <w:lsdException w:name="Table Grid 2" w:semiHidden="1" w:unhideWhenUsed="1"/>
-    <w:lsdException w:name="Table Grid 3" w:semiHidden="1" w:unhideWhenUsed="1"/>
-    <w:lsdException w:name="Table Grid 4" w:semiHidden="1" w:unhideWhenUsed="1"/>
-    <w:lsdException w:name="Table Grid 5" w:semiHidden="1" w:unhideWhenUsed="1"/>
-    <w:lsdException w:name="Table Grid 6" w:semiHidden="1" w:unhideWhenUsed="1"/>
-    <w:lsdException w:name="Table Grid 7" w:semiHidden="1" w:unhideWhenUsed="1"/>
-    <w:lsdException w:name="Table Grid 8" w:semiHidden="1" w:unhideWhenUsed="1"/>
-    <w:lsdException w:name="Table List 1" w:semiHidden="1" w:unhideWhenUsed="1"/>
-    <w:lsdException w:name="Table List 2" w:semiHidden="1" w:unhideWhenUsed="1"/>
-    <w:lsdException w:name="Table List 3" w:semiHidden="1" w:unhideWhenUsed="1"/>
-    <w:lsdException w:name="Table List 4" w:semiHidden="1" w:unhideWhenUsed="1"/>
-    <w:lsdException w:name="Table List 5" w:semiHidden="1" w:unhideWhenUsed="1"/>
-    <w:lsdException w:name="Table List 6" w:semiHidden="1" w:unhideWhenUsed="1"/>
-    <w:lsdException w:name="Table List 7" w:semiHidden="1" w:unhideWhenUsed="1"/>
-    <w:lsdException w:name="Table List 8" w:semiHidden="1" w:unhideWhenUsed="1"/>
-    <w:lsdException w:name="Table 3D effects 1" w:semiHidden="1" w:unhideWhenUsed="1"/>
-    <w:lsdException w:name="Table 3D effects 2" w:semiHidden="1" w:unhideWhenUsed="1"/>
-    <w:lsdException w:name="Table 3D effects 3" w:semiHidden="1" w:unhideWhenUsed="1"/>
-    <w:lsdException w:name="Table Contemporary" w:semiHidden="1" w:unhideWhenUsed="1"/>
-    <w:lsdException w:name="Table Elegant" w:semiHidden="1" w:unhideWhenUsed="1"/>
-    <w:lsdException w:name="Table Professional" w:semiHidden="1" w:unhideWhenUsed="1"/>
-    <w:lsdException w:name="Table Subtle 1" w:semiHidden="1" w:unhideWhenUsed="1"/>
-    <w:lsdException w:name="Table Subtle 2" w:semiHidden="1" w:unhideWhenUsed="1"/>
-    <w:lsdException w:name="Table Web 1" w:semiHidden="1" w:unhideWhenUsed="1"/>
-    <w:lsdException w:name="Table Web 2" w:semiHidden="1" w:unhideWhenUsed="1"/>
-    <w:lsdException w:name="Table Web 3" w:semiHidden="1" w:unhideWhenUsed="1"/>
-    <w:lsdException w:name="Balloon Text" w:semiHidden="1" w:unhideWhenUsed="1"/>
-    <w:lsdException w:name="Table Grid" w:uiPriority="39"/>
-    <w:lsdException w:name="Table Theme" w:semiHidden="1" w:unhideWhenUsed="1"/>
-    <w:lsdException w:name="Placeholder Text" w:semiHidden="1"/>
-    <w:lsdException w:name="No Spacing" w:uiPriority="1" w:qFormat="1"/>
-    <w:lsdException w:name="Light Shading" w:uiPriority="60"/>
-    <w:lsdException w:name="Light List" w:uiPriority="61"/>
-    <w:lsdException w:name="Light Grid" w:uiPriority="62"/>
-    <w:lsdException w:name="Medium Shading 1" w:uiPriority="63"/>
-    <w:lsdException w:name="Medium Shading 2" w:uiPriority="64"/>
-    <w:lsdException w:name="Medium List 1" w:uiPriority="65"/>
-    <w:lsdException w:name="Medium List 2" w:uiPriority="66"/>
-    <w:lsdException w:name="Medium Grid 1" w:uiPriority="67"/>
-    <w:lsdException w:name="Medium Grid 2" w:uiPriority="68"/>
-    <w:lsdException w:name="Medium Grid 3" w:uiPriority="69"/>
-    <w:lsdException w:name="Dark List" w:uiPriority="70"/>
-    <w:lsdException w:name="Colorful Shading" w:uiPriority="71"/>
-    <w:lsdException w:name="Colorful List" w:uiPriority="72"/>
-    <w:lsdException w:name="Colorful Grid" w:uiPriority="73"/>
-    <w:lsdException w:name="Light Shading Accent 1" w:uiPriority="60"/>
-    <w:lsdException w:name="Light List Accent 1" w:uiPriority="61"/>
-    <w:lsdException w:name="Light Grid Accent 1" w:uiPriority="62"/>
-    <w:lsdException w:name="Medium Shading 1 Accent 1" w:uiPriority="63"/>
-    <w:lsdException w:name="Medium Shading 2 Accent 1" w:uiPriority="64"/>
-    <w:lsdException w:name="Medium List 1 Accent 1" w:uiPriority="65"/>
-    <w:lsdException w:name="Revision" w:semiHidden="1"/>
-    <w:lsdException w:name="List Paragraph" w:uiPriority="34" w:qFormat="1"/>
-    <w:lsdException w:name="Quote" w:uiPriority="29" w:qFormat="1"/>
-    <w:lsdException w:name="Intense Quote" w:uiPriority="30" w:qFormat="1"/>
-    <w:lsdException w:name="Medium List 2 Accent 1" w:uiPriority="66"/>
-    <w:lsdException w:name="Medium Grid 1 Accent 1" w:uiPriority="67"/>
-    <w:lsdException w:name="Medium Grid 2 Accent 1" w:uiPriority="68"/>
-    <w:lsdException w:name="Medium Grid 3 Accent 1" w:uiPriority="69"/>
-    <w:lsdException w:name="Dark List Accent 1" w:uiPriority="70"/>
-    <w:lsdException w:name="Colorful Shading Accent 1" w:uiPriority="71"/>
-    <w:lsdException w:name="Colorful List Accent 1" w:uiPriority="72"/>
-    <w:lsdException w:name="Colorful Grid Accent 1" w:uiPriority="73"/>
-    <w:lsdException w:name="Light Shading Accent 2" w:uiPriority="60"/>
-    <w:lsdException w:name="Light List Accent 2" w:uiPriority="61"/>
-    <w:lsdException w:name="Light Grid Accent 2" w:uiPriority="62"/>
-    <w:lsdException w:name="Medium Shading 1 Accent 2" w:uiPriority="63"/>
-    <w:lsdException w:name="Medium Shading 2 Accent 2" w:uiPriority="64"/>
-    <w:lsdException w:name="Medium List 1 Accent 2" w:uiPriority="65"/>
-    <w:lsdException w:name="Medium List 2 Accent 2" w:uiPriority="66"/>
-    <w:lsdException w:name="Medium Grid 1 Accent 2" w:uiPriority="67"/>
-    <w:lsdException w:name="Medium Grid 2 Accent 2" w:uiPriority="68"/>
-    <w:lsdException w:name="Medium Grid 3 Accent 2" w:uiPriority="69"/>
-    <w:lsdException w:name="Dark List Accent 2" w:uiPriority="70"/>
-    <w:lsdException w:name="Colorful Shading Accent 2" w:uiPriority="71"/>
-    <w:lsdException w:name="Colorful List Accent 2" w:uiPriority="72"/>
-    <w:lsdException w:name="Colorful Grid Accent 2" w:uiPriority="73"/>
-    <w:lsdException w:name="Light Shading Accent 3" w:uiPriority="60"/>
-    <w:lsdException w:name="Light List Accent 3" w:uiPriority="61"/>
-    <w:lsdException w:name="Light Grid Accent 3" w:uiPriority="62"/>
-    <w:lsdException w:name="Medium Shading 1 Accent 3" w:uiPriority="63"/>
-    <w:lsdException w:name="Medium Shading 2 Accent 3" w:uiPriority="64"/>
-    <w:lsdException w:name="Medium List 1 Accent 3" w:uiPriority="65"/>
-    <w:lsdException w:name="Medium List 2 Accent 3" w:uiPriority="66"/>
-    <w:lsdException w:name="Medium Grid 1 Accent 3" w:uiPriority="67"/>
-    <w:lsdException w:name="Medium Grid 2 Accent 3" w:uiPriority="68"/>
-    <w:lsdException w:name="Medium Grid 3 Accent 3" w:uiPriority="69"/>
-    <w:lsdException w:name="Dark List Accent 3" w:uiPriority="70"/>
-    <w:lsdException w:name="Colorful Shading Accent 3" w:uiPriority="71"/>
-    <w:lsdException w:name="Colorful List Accent 3" w:uiPriority="72"/>
-    <w:lsdException w:name="Colorful Grid Accent 3" w:uiPriority="73"/>
-    <w:lsdException w:name="Light Shading Accent 4" w:uiPriority="60"/>
-    <w:lsdException w:name="Light List Accent 4" w:uiPriority="61"/>
-    <w:lsdException w:name="Light Grid Accent 4" w:uiPriority="62"/>
-    <w:lsdException w:name="Medium Shading 1 Accent 4" w:uiPriority="63"/>
-    <w:lsdException w:name="Medium Shading 2 Accent 4" w:uiPriority="64"/>
-    <w:lsdException w:name="Medium List 1 Accent 4" w:uiPriority="65"/>
-    <w:lsdException w:name="Medium List 2 Accent 4" w:uiPriority="66"/>
-    <w:lsdException w:name="Medium Grid 1 Accent 4" w:uiPriority="67"/>
-    <w:lsdException w:name="Medium Grid 2 Accent 4" w:uiPriority="68"/>
-    <w:lsdException w:name="Medium Grid 3 Accent 4" w:uiPriority="69"/>
-    <w:lsdException w:name="Dark List Accent 4" w:uiPriority="70"/>
-    <w:lsdException w:name="Colorful Shading Accent 4" w:uiPriority="71"/>
-    <w:lsdException w:name="Colorful List Accent 4" w:uiPriority="72"/>
-    <w:lsdException w:name="Colorful Grid Accent 4" w:uiPriority="73"/>
-    <w:lsdException w:name="Light Shading Accent 5" w:uiPriority="60"/>
-    <w:lsdException w:name="Light List Accent 5" w:uiPriority="61"/>
-    <w:lsdException w:name="Light Grid Accent 5" w:uiPriority="62"/>
-    <w:lsdException w:name="Medium Shading 1 Accent 5" w:uiPriority="63"/>
-    <w:lsdException w:name="Medium Shading 2 Accent 5" w:uiPriority="64"/>
-    <w:lsdException w:name="Medium List 1 Accent 5" w:uiPriority="65"/>
-    <w:lsdException w:name="Medium List 2 Accent 5" w:uiPriority="66"/>
-    <w:lsdException w:name="Medium Grid 1 Accent 5" w:uiPriority="67"/>
-    <w:lsdException w:name="Medium Grid 2 Accent 5" w:uiPriority="68"/>
-    <w:lsdException w:name="Medium Grid 3 Accent 5" w:uiPriority="69"/>
-    <w:lsdException w:name="Dark List Accent 5" w:uiPriority="70"/>
-    <w:lsdException w:name="Colorful Shading Accent 5" w:uiPriority="71"/>
-    <w:lsdException w:name="Colorful List Accent 5" w:uiPriority="72"/>
-    <w:lsdException w:name="Colorful Grid Accent 5" w:uiPriority="73"/>
-    <w:lsdException w:name="Light Shading Accent 6" w:uiPriority="60"/>
-    <w:lsdException w:name="Light List Accent 6" w:uiPriority="61"/>
-    <w:lsdException w:name="Light Grid Accent 6" w:uiPriority="62"/>
-    <w:lsdException w:name="Medium Shading 1 Accent 6" w:uiPriority="63"/>
-    <w:lsdException w:name="Medium Shading 2 Accent 6" w:uiPriority="64"/>
-    <w:lsdException w:name="Medium List 1 Accent 6" w:uiPriority="65"/>
-    <w:lsdException w:name="Medium List 2 Accent 6" w:uiPriority="66"/>
-    <w:lsdException w:name="Medium Grid 1 Accent 6" w:uiPriority="67"/>
-    <w:lsdException w:name="Medium Grid 2 Accent 6" w:uiPriority="68"/>
-    <w:lsdException w:name="Medium Grid 3 Accent 6" w:uiPriority="69"/>
-    <w:lsdException w:name="Dark List Accent 6" w:uiPriority="70"/>
-    <w:lsdException w:name="Colorful Shading Accent 6" w:uiPriority="71"/>
-    <w:lsdException w:name="Colorful List Accent 6" w:uiPriority="72"/>
-    <w:lsdException w:name="Colorful Grid Accent 6" w:uiPriority="73"/>
-    <w:lsdException w:name="Subtle Emphasis" w:uiPriority="19" w:qFormat="1"/>
-    <w:lsdException w:name="Intense Emphasis" w:uiPriority="21" w:qFormat="1"/>
-    <w:lsdException w:name="Subtle Reference" w:uiPriority="31" w:qFormat="1"/>
-    <w:lsdException w:name="Intense Reference" w:uiPriority="32" w:qFormat="1"/>
-    <w:lsdException w:name="Book Title" w:uiPriority="33" w:qFormat="1"/>
-    <w:lsdException w:name="Bibliography" w:semiHidden="1" w:uiPriority="37" w:unhideWhenUsed="1"/>
-    <w:lsdException w:name="TOC Heading" w:semiHidden="1" w:uiPriority="39" w:unhideWhenUsed="1" w:qFormat="1"/>
-    <w:lsdException w:name="Plain Table 1" w:uiPriority="41"/>
-    <w:lsdException w:name="Plain Table 2" w:uiPriority="42"/>
-    <w:lsdException w:name="Plain Table 3" w:uiPriority="43"/>
-    <w:lsdException w:name="Plain Table 4" w:uiPriority="44"/>
-    <w:lsdException w:name="Plain Table 5" w:uiPriority="45"/>
-    <w:lsdException w:name="Grid Table Light" w:uiPriority="40"/>
-    <w:lsdException w:name="Grid Table 1 Light" w:uiPriority="46"/>
-    <w:lsdException w:name="Grid Table 2" w:uiPriority="47"/>
-    <w:lsdException w:name="Grid Table 3" w:uiPriority="48"/>
-    <w:lsdException w:name="Grid Table 4" w:uiPriority="49"/>
-    <w:lsdException w:name="Grid Table 5 Dark" w:uiPriority="50"/>
-    <w:lsdException w:name="Grid Table 6 Colorful" w:uiPriority="51"/>
-    <w:lsdException w:name="Grid Table 7 Colorful" w:uiPriority="52"/>
-    <w:lsdException w:name="Grid Table 1 Light Accent 1" w:uiPriority="46"/>
-    <w:lsdException w:name="Grid Table 2 Accent 1" w:uiPriority="47"/>
-    <w:lsdException w:name="Grid Table 3 Accent 1" w:uiPriority="48"/>
-    <w:lsdException w:name="Grid Table 4 Accent 1" w:uiPriority="49"/>
-    <w:lsdException w:name="Grid Table 5 Dark Accent 1" w:uiPriority="50"/>
-    <w:lsdException w:name="Grid Table 6 Colorful Accent 1" w:uiPriority="51"/>
-    <w:lsdException w:name="Grid Table 7 Colorful Accent 1" w:uiPriority="52"/>
-    <w:lsdException w:name="Grid Table 1 Light Accent 2" w:uiPriority="46"/>
-    <w:lsdException w:name="Grid Table 2 Accent 2" w:uiPriority="47"/>
-    <w:lsdException w:name="Grid Table 3 Accent 2" w:uiPriority="48"/>
-    <w:lsdException w:name="Grid Table 4 Accent 2" w:uiPriority="49"/>
-    <w:lsdException w:name="Grid Table 5 Dark Accent 2" w:uiPriority="50"/>
-    <w:lsdException w:name="Grid Table 6 Colorful Accent 2" w:uiPriority="51"/>
-    <w:lsdException w:name="Grid Table 7 Colorful Accent 2" w:uiPriority="52"/>
-    <w:lsdException w:name="Grid Table 1 Light Accent 3" w:uiPriority="46"/>
-    <w:lsdException w:name="Grid Table 2 Accent 3" w:uiPriority="47"/>
-    <w:lsdException w:name="Grid Table 3 Accent 3" w:uiPriority="48"/>
-    <w:lsdException w:name="Grid Table 4 Accent 3" w:uiPriority="49"/>
-    <w:lsdException w:name="Grid Table 5 Dark Accent 3" w:uiPriority="50"/>
-    <w:lsdException w:name="Grid Table 6 Colorful Accent 3" w:uiPriority="51"/>
-    <w:lsdException w:name="Grid Table 7 Colorful Accent 3" w:uiPriority="52"/>
-    <w:lsdException w:name="Grid Table 1 Light Accent 4" w:uiPriority="46"/>
-    <w:lsdException w:name="Grid Table 2 Accent 4" w:uiPriority="47"/>
-    <w:lsdException w:name="Grid Table 3 Accent 4" w:uiPriority="48"/>
-    <w:lsdException w:name="Grid Table 4 Accent 4" w:uiPriority="49"/>
-    <w:lsdException w:name="Grid Table 5 Dark Accent 4" w:uiPriority="50"/>
-    <w:lsdException w:name="Grid Table 6 Colorful Accent 4" w:uiPriority="51"/>
-    <w:lsdException w:name="Grid Table 7 Colorful Accent 4" w:uiPriority="52"/>
-    <w:lsdException w:name="Grid Table 1 Light Accent 5" w:uiPriority="46"/>
-    <w:lsdException w:name="Grid Table 2 Accent 5" w:uiPriority="47"/>
-    <w:lsdException w:name="Grid Table 3 Accent 5" w:uiPriority="48"/>
-    <w:lsdException w:name="Grid Table 4 Accent 5" w:uiPriority="49"/>
-    <w:lsdException w:name="Grid Table 5 Dark Accent 5" w:uiPriority="50"/>
-    <w:lsdException w:name="Grid Table 6 Colorful Accent 5" w:uiPriority="51"/>
-    <w:lsdException w:name="Grid Table 7 Colorful Accent 5" w:uiPriority="52"/>
-    <w:lsdException w:name="Grid Table 1 Light Accent 6" w:uiPriority="46"/>
-    <w:lsdException w:name="Grid Table 2 Accent 6" w:uiPriority="47"/>
-    <w:lsdException w:name="Grid Table 3 Accent 6" w:uiPriority="48"/>
-    <w:lsdException w:name="Grid Table 4 Accent 6" w:uiPriority="49"/>
-    <w:lsdException w:name="Grid Table 5 Dark Accent 6" w:uiPriority="50"/>
-    <w:lsdException w:name="Grid Table 6 Colorful Accent 6" w:uiPriority="51"/>
-    <w:lsdException w:name="Grid Table 7 Colorful Accent 6" w:uiPriority="52"/>
-    <w:lsdException w:name="List Table 1 Light" w:uiPriority="46"/>
-    <w:lsdException w:name="List Table 2" w:uiPriority="47"/>
-    <w:lsdException w:name="List Table 3" w:uiPriority="48"/>
-    <w:lsdException w:name="List Table 4" w:uiPriority="49"/>
-    <w:lsdException w:name="List Table 5 Dark" w:uiPriority="50"/>
-    <w:lsdException w:name="List Table 6 Colorful" w:uiPriority="51"/>
-    <w:lsdException w:name="List Table 7 Colorful" w:uiPriority="52"/>
-    <w:lsdException w:name="List Table 1 Light Accent 1" w:uiPriority="46"/>
-    <w:lsdException w:name="List Table 2 Accent 1" w:uiPriority="47"/>
-    <w:lsdException w:name="List Table 3 Accent 1" w:uiPriority="48"/>
-    <w:lsdException w:name="List Table 4 Accent 1" w:uiPriority="49"/>
-    <w:lsdException w:name="List Table 5 Dark Accent 1" w:uiPriority="50"/>
-    <w:lsdException w:name="List Table 6 Colorful Accent 1" w:uiPriority="51"/>
-    <w:lsdException w:name="List Table 7 Colorful Accent 1" w:uiPriority="52"/>
-    <w:lsdException w:name="List Table 1 Light Accent 2" w:uiPriority="46"/>
-    <w:lsdException w:name="List Table 2 Accent 2" w:uiPriority="47"/>
-    <w:lsdException w:name="List Table 3 Accent 2" w:uiPriority="48"/>
-    <w:lsdException w:name="List Table 4 Accent 2" w:uiPriority="49"/>
-    <w:lsdException w:name="List Table 5 Dark Accent 2" w:uiPriority="50"/>
-    <w:lsdException w:name="List Table 6 Colorful Accent 2" w:uiPriority="51"/>
-    <w:lsdException w:name="List Table 7 Colorful Accent 2" w:uiPriority="52"/>
-    <w:lsdException w:name="List Table 1 Light Accent 3" w:uiPriority="46"/>
-    <w:lsdException w:name="List Table 2 Accent 3" w:uiPriority="47"/>
-    <w:lsdException w:name="List Table 3 Accent 3" w:uiPriority="48"/>
-    <w:lsdException w:name="List Table 4 Accent 3" w:uiPriority="49"/>
-    <w:lsdException w:name="List Table 5 Dark Accent 3" w:uiPriority="50"/>
-    <w:lsdException w:name="List Table 6 Colorful Accent 3" w:uiPriority="51"/>
-    <w:lsdException w:name="List Table 7 Colorful Accent 3" w:uiPriority="52"/>
-    <w:lsdException w:name="List Table 1 Light Accent 4" w:uiPriority="46"/>
-    <w:lsdException w:name="List Table 2 Accent 4" w:uiPriority="47"/>
-    <w:lsdException w:name="List Table 3 Accent 4" w:uiPriority="48"/>
-    <w:lsdException w:name="List Table 4 Accent 4" w:uiPriority="49"/>
-    <w:lsdException w:name="List Table 5 Dark Accent 4" w:uiPriority="50"/>
-    <w:lsdException w:name="List Table 6 Colorful Accent 4" w:uiPriority="51"/>
-    <w:lsdException w:name="List Table 7 Colorful Accent 4" w:uiPriority="52"/>
-    <w:lsdException w:name="List Table 1 Light Accent 5" w:uiPriority="46"/>
-    <w:lsdException w:name="List Table 2 Accent 5" w:uiPriority="47"/>
-    <w:lsdException w:name="List Table 3 Accent 5" w:uiPriority="48"/>
-    <w:lsdException w:name="List Table 4 Accent 5" w:uiPriority="49"/>
-    <w:lsdException w:name="List Table 5 Dark Accent 5" w:uiPriority="50"/>
-    <w:lsdException w:name="List Table 6 Colorful Accent 5" w:uiPriority="51"/>
-    <w:lsdException w:name="List Table 7 Colorful Accent 5" w:uiPriority="52"/>
-    <w:lsdException w:name="List Table 1 Light Accent 6" w:uiPriority="46"/>
-    <w:lsdException w:name="List Table 2 Accent 6" w:uiPriority="47"/>
-    <w:lsdException w:name="List Table 3 Accent 6" w:uiPriority="48"/>
-    <w:lsdException w:name="List Table 4 Accent 6" w:uiPriority="49"/>
-    <w:lsdException w:name="List Table 5 Dark Accent 6" w:uiPriority="50"/>
-    <w:lsdException w:name="List Table 6 Colorful Accent 6" w:uiPriority="51"/>
-    <w:lsdException w:name="List Table 7 Colorful Accent 6" w:uiPriority="52"/>
-    <w:lsdException w:name="Mention" w:semiHidden="1" w:unhideWhenUsed="1"/>
-    <w:lsdException w:name="Smart Hyperlink" w:semiHidden="1" w:unhideWhenUsed="1"/>
-    <w:lsdException w:name="Hashtag" w:semiHidden="1" w:unhideWhenUsed="1"/>
-    <w:lsdException w:name="Unresolved Mention" w:semiHidden="1" w:unhideWhenUsed="1"/>
-    <w:lsdException w:name="Smart Link" w:semiHidden="1" w:unhideWhenUsed="1"/>
-  </w:latentStyles>
-  <w:style w:type="paragraph" w:default="1" w:styleId="Normal">
-    <w:name w:val="Normal"/>
-    <w:qFormat/>
-  </w:style>
-  <w:style w:type="character" w:default="1" w:styleId="DefaultParagraphFont">
-    <w:name w:val="Default Paragraph Font"/>
-    <w:uiPriority w:val="1"/>
-    <w:unhideWhenUsed/>
-  </w:style>
-  <w:style w:type="table" w:default="1" w:styleId="TableNormal">
-    <w:name w:val="Normal Table"/>
-    <w:uiPriority w:val="99"/>
-    <w:semiHidden/>
-    <w:unhideWhenUsed/>
-    <w:tblPr>
-      <w:tblInd w:w="0" w:type="dxa"/>
-      <w:tblCellMar>
-        <w:top w:w="0" w:type="dxa"/>
-        <w:left w:w="108" w:type="dxa"/>
-        <w:bottom w:w="0" w:type="dxa"/>
-        <w:right w:w="108" w:type="dxa"/>
-      </w:tblCellMar>
-    </w:tblPr>
-  </w:style>
-  <w:style w:type="numbering" w:default="1" w:styleId="NoList">
-    <w:name w:val="No List"/>
-    <w:uiPriority w:val="99"/>
-    <w:semiHidden/>
-    <w:unhideWhenUsed/>
-  </w:style>
-  <w:style w:type="character" w:styleId="PlaceholderText">
-    <w:name w:val="Placeholder Text"/>
-    <w:basedOn w:val="DefaultParagraphFont"/>
-    <w:uiPriority w:val="99"/>
-    <w:semiHidden/>
-    <w:rsid w:val="00667CA6"/>
-    <w:rPr>
-      <w:color w:val="666666"/>
-    </w:rPr>
-  </w:style>
-</w:styles>
-</file>
-
-<file path=word/glossary/document.xml><?xml version="1.0" encoding="utf-8"?>
-<w:glossaryDocument xmlns:wpc="http://schemas.microsoft.com/office/word/2010/wordprocessingCanvas" xmlns:cx="http://schemas.microsoft.com/office/drawing/2014/chartex" xmlns:cx1="http://schemas.microsoft.com/office/drawing/2015/9/8/chartex" xmlns:cx2="http://schemas.microsoft.com/office/drawing/2015/10/21/chartex" xmlns:cx3="http://schemas.microsoft.com/office/drawing/2016/5/9/chartex" xmlns:cx4="http://schemas.microsoft.com/office/drawing/2016/5/10/chartex" xmlns:cx5="http://schemas.microsoft.com/office/drawing/2016/5/11/chartex" xmlns:cx6="http://schemas.microsoft.com/office/drawing/2016/5/12/chartex" xmlns:cx7="http://schemas.microsoft.com/office/drawing/2016/5/13/chartex" xmlns:cx8="http://schemas.microsoft.com/office/drawing/2016/5/14/chartex" xmlns:mc="http://schemas.openxmlformats.org/markup-compatibility/2006" xmlns:aink="http://schemas.microsoft.com/office/drawing/2016/ink" xmlns:am3d="http://schemas.microsoft.com/office/drawing/2017/model3d" xmlns:o="urn:schemas-microsoft-com:office:office" xmlns:oel="http://schemas.microsoft.com/office/2019/extlst" xmlns:r="http://schemas.openxmlformats.org/officeDocument/2006/relationships" xmlns:m="http://schemas.openxmlformats.org/officeDocument/2006/math" xmlns:v="urn:schemas-microsoft-com:vml" xmlns:wp14="http://schemas.microsoft.com/office/word/2010/wordprocessingDrawing" xmlns:wp="http://schemas.openxmlformats.org/drawingml/2006/wordprocessingDrawing" xmlns:w10="urn:schemas-microsoft-com:office:word" xmlns:w="http://schemas.openxmlformats.org/wordprocessingml/2006/main" xmlns:w14="http://schemas.microsoft.com/office/word/2010/wordml" xmlns:w15="http://schemas.microsoft.com/office/word/2012/wordml" xmlns:w16cex="http://schemas.microsoft.com/office/word/2018/wordml/cex" xmlns:w16cid="http://schemas.microsoft.com/office/word/2016/wordml/cid" xmlns:w16="http://schemas.microsoft.com/office/word/2018/wordml" xmlns:w16du="http://schemas.microsoft.com/office/word/2023/wordml/word16du" xmlns:w16sdtdh="http://schemas.microsoft.com/office/word/2020/wordml/sdtdatahash" xmlns:w16sdtfl="http://schemas.microsoft.com/office/word/2024/wordml/sdtformatlock" xmlns:w16se="http://schemas.microsoft.com/office/word/2015/wordml/symex" xmlns:wpg="http://schemas.microsoft.com/office/word/2010/wordprocessingGroup" xmlns:wpi="http://schemas.microsoft.com/office/word/2010/wordprocessingInk" xmlns:wne="http://schemas.microsoft.com/office/word/2006/wordml" xmlns:wps="http://schemas.microsoft.com/office/word/2010/wordprocessingShape" mc:Ignorable="w14 w15 w16se w16cid w16 w16cex w16sdtdh w16sdtfl w16du wp14">
-  <w:docParts>
-    <w:docPart>
-      <w:docPartPr>
-        <w:name w:val="DefaultPlaceholder_-1854013440"/>
-        <w:category>
-          <w:name w:val="General"/>
-          <w:gallery w:val="placeholder"/>
-        </w:category>
-        <w:types>
-          <w:type w:val="bbPlcHdr"/>
-        </w:types>
-        <w:behaviors>
-          <w:behavior w:val="content"/>
-        </w:behaviors>
-        <w:guid w:val="{2E55291C-F3A7-464D-A1AB-0D96A7925255}"/>
-      </w:docPartPr>
-      <w:docPartBody>
-        <w:p>
-          <w:r>
-            <w:rPr>
-              <w:rStyle w:val="PlaceholderText"/>
-            </w:rPr>
-            <w:t>Click or tap here to enter text.</w:t>
-          </w:r>
-        </w:p>
-      </w:docPartBody>
-    </w:docPart>
-  </w:docParts>
-</w:glossaryDocument>
-</file>
-
-<file path=word/glossary/fontTable.xml><?xml version="1.0" encoding="utf-8"?>
-<w:fonts xmlns:mc="http://schemas.openxmlformats.org/markup-compatibility/2006" xmlns:r="http://schemas.openxmlformats.org/officeDocument/2006/relationships" xmlns:w="http://schemas.openxmlformats.org/wordprocessingml/2006/main" xmlns:w14="http://schemas.microsoft.com/office/word/2010/wordml" xmlns:w15="http://schemas.microsoft.com/office/word/2012/wordml" xmlns:w16cex="http://schemas.microsoft.com/office/word/2018/wordml/cex" xmlns:w16cid="http://schemas.microsoft.com/office/word/2016/wordml/cid" xmlns:w16="http://schemas.microsoft.com/office/word/2018/wordml" xmlns:w16du="http://schemas.microsoft.com/office/word/2023/wordml/word16du" xmlns:w16sdtdh="http://schemas.microsoft.com/office/word/2020/wordml/sdtdatahash" xmlns:w16sdtfl="http://schemas.microsoft.com/office/word/2024/wordml/sdtformatlock" xmlns:w16se="http://schemas.microsoft.com/office/word/2015/wordml/symex" mc:Ignorable="w14 w15 w16se w16cid w16 w16cex w16sdtdh w16sdtfl w16du">
-  <w:font w:name="Aptos">
-    <w:charset w:val="00"/>
-    <w:family w:val="swiss"/>
-    <w:pitch w:val="variable"/>
-    <w:sig w:usb0="20000287" w:usb1="00000003" w:usb2="00000000" w:usb3="00000000" w:csb0="0000019F" w:csb1="00000000"/>
-  </w:font>
-  <w:font w:name="Times New Roman">
-    <w:panose1 w:val="02020603050405020304"/>
-    <w:charset w:val="00"/>
-    <w:family w:val="roman"/>
-    <w:pitch w:val="variable"/>
-    <w:sig w:usb0="E0002EFF" w:usb1="C000785B" w:usb2="00000009" w:usb3="00000000" w:csb0="000001FF" w:csb1="00000000"/>
-  </w:font>
-  <w:font w:name="Aptos Display">
-    <w:charset w:val="00"/>
-    <w:family w:val="swiss"/>
-    <w:pitch w:val="variable"/>
-    <w:sig w:usb0="20000287" w:usb1="00000003" w:usb2="00000000" w:usb3="00000000" w:csb0="0000019F" w:csb1="00000000"/>
-  </w:font>
-</w:fonts>
-</file>
-
-<file path=word/glossary/settings.xml><?xml version="1.0" encoding="utf-8"?>
-<w:settings xmlns:mc="http://schemas.openxmlformats.org/markup-compatibility/2006" xmlns:o="urn:schemas-microsoft-com:office:office" xmlns:r="http://schemas.openxmlformats.org/officeDocument/2006/relationships" xmlns:m="http://schemas.openxmlformats.org/officeDocument/2006/math" xmlns:v="urn:schemas-microsoft-com:vml" xmlns:w10="urn:schemas-microsoft-com:office:word" xmlns:w="http://schemas.openxmlformats.org/wordprocessingml/2006/main" xmlns:w14="http://schemas.microsoft.com/office/word/2010/wordml" xmlns:w15="http://schemas.microsoft.com/office/word/2012/wordml" xmlns:w16cex="http://schemas.microsoft.com/office/word/2018/wordml/cex" xmlns:w16cid="http://schemas.microsoft.com/office/word/2016/wordml/cid" xmlns:w16="http://schemas.microsoft.com/office/word/2018/wordml" xmlns:w16du="http://schemas.microsoft.com/office/word/2023/wordml/word16du" xmlns:w16sdtdh="http://schemas.microsoft.com/office/word/2020/wordml/sdtdatahash" xmlns:w16sdtfl="http://schemas.microsoft.com/office/word/2024/wordml/sdtformatlock" xmlns:w16se="http://schemas.microsoft.com/office/word/2015/wordml/symex" xmlns:sl="http://schemas.openxmlformats.org/schemaLibrary/2006/main" mc:Ignorable="w14 w15 w16se w16cid w16 w16cex w16sdtdh w16sdtfl w16du">
-  <w:view w:val="normal"/>
-  <w:defaultTabStop w:val="720"/>
-  <w:characterSpacingControl w:val="doNotCompress"/>
-  <w:compat>
-    <w:useFELayout/>
-    <w:compatSetting w:name="compatibilityMode" w:uri="http://schemas.microsoft.com/office/word" w:val="15"/>
-    <w:compatSetting w:name="overrideTableStyleFontSizeAndJustification" w:uri="http://schemas.microsoft.com/office/word" w:val="1"/>
-    <w:compatSetting w:name="enableOpenTypeFeatures" w:uri="http://schemas.microsoft.com/office/word" w:val="1"/>
-    <w:compatSetting w:name="doNotFlipMirrorIndents" w:uri="http://schemas.microsoft.com/office/word" w:val="1"/>
-    <w:compatSetting w:name="differentiateMultirowTableHeaders" w:uri="http://schemas.microsoft.com/office/word" w:val="1"/>
-    <w:compatSetting w:name="useWord2013TrackBottomHyphenation" w:uri="http://schemas.microsoft.com/office/word" w:val="0"/>
-  </w:compat>
-  <w:rsids>
-    <w:rsidRoot w:val="002B2EEF"/>
-    <w:rsid w:val="000C0969"/>
-    <w:rsid w:val="002B2EEF"/>
-  </w:rsids>
-  <m:mathPr>
-    <m:mathFont m:val="Cambria Math"/>
-    <m:brkBin m:val="before"/>
-    <m:brkBinSub m:val="--"/>
-    <m:smallFrac m:val="0"/>
-    <m:dispDef/>
-    <m:lMargin m:val="0"/>
-    <m:rMargin m:val="0"/>
-    <m:defJc m:val="centerGroup"/>
-    <m:wrapIndent m:val="1440"/>
-    <m:intLim m:val="subSup"/>
-    <m:naryLim m:val="undOvr"/>
-  </m:mathPr>
-  <w:themeFontLang w:val="en-US"/>
-  <w:clrSchemeMapping w:bg1="light1" w:t1="dark1" w:bg2="light2" w:t2="dark2" w:accent1="accent1" w:accent2="accent2" w:accent3="accent3" w:accent4="accent4" w:accent5="accent5" w:accent6="accent6" w:hyperlink="hyperlink" w:followedHyperlink="followedHyperlink"/>
-  <w:decimalSymbol w:val="."/>
-  <w:listSeparator w:val=","/>
-  <w15:chartTrackingRefBased/>
-</w:settings>
-</file>
-
-<file path=word/glossary/styles.xml><?xml version="1.0" encoding="utf-8"?>
 <w:styles xmlns:mc="http://schemas.openxmlformats.org/markup-compatibility/2006" xmlns:r="http://schemas.openxmlformats.org/officeDocument/2006/relationships" xmlns:w="http://schemas.openxmlformats.org/wordprocessingml/2006/main" xmlns:w14="http://schemas.microsoft.com/office/word/2010/wordml" xmlns:w15="http://schemas.microsoft.com/office/word/2012/wordml" xmlns:w16cex="http://schemas.microsoft.com/office/word/2018/wordml/cex" xmlns:w16cid="http://schemas.microsoft.com/office/word/2016/wordml/cid" xmlns:w16="http://schemas.microsoft.com/office/word/2018/wordml" xmlns:w16du="http://schemas.microsoft.com/office/word/2023/wordml/word16du" xmlns:w16sdtdh="http://schemas.microsoft.com/office/word/2020/wordml/sdtdatahash" xmlns:w16sdtfl="http://schemas.microsoft.com/office/word/2024/wordml/sdtformatlock" xmlns:w16se="http://schemas.microsoft.com/office/word/2015/wordml/symex" mc:Ignorable="w14 w15 w16se w16cid w16 w16cex w16sdtdh w16sdtfl w16du">
   <w:docDefaults>
     <w:rPrDefault>
@@ -1286,19 +639,12 @@
     <w:basedOn w:val="DefaultParagraphFont"/>
     <w:uiPriority w:val="99"/>
     <w:semiHidden/>
-    <w:rsid w:val="002B2EEF"/>
+    <w:rsid w:val="00667CA6"/>
     <w:rPr>
       <w:color w:val="666666"/>
     </w:rPr>
   </w:style>
 </w:styles>
-</file>
-
-<file path=word/glossary/webSettings.xml><?xml version="1.0" encoding="utf-8"?>
-<w:webSettings xmlns:mc="http://schemas.openxmlformats.org/markup-compatibility/2006" xmlns:r="http://schemas.openxmlformats.org/officeDocument/2006/relationships" xmlns:w="http://schemas.openxmlformats.org/wordprocessingml/2006/main" xmlns:w14="http://schemas.microsoft.com/office/word/2010/wordml" xmlns:w15="http://schemas.microsoft.com/office/word/2012/wordml" xmlns:w16cex="http://schemas.microsoft.com/office/word/2018/wordml/cex" xmlns:w16cid="http://schemas.microsoft.com/office/word/2016/wordml/cid" xmlns:w16="http://schemas.microsoft.com/office/word/2018/wordml" xmlns:w16du="http://schemas.microsoft.com/office/word/2023/wordml/word16du" xmlns:w16sdtdh="http://schemas.microsoft.com/office/word/2020/wordml/sdtdatahash" xmlns:w16sdtfl="http://schemas.microsoft.com/office/word/2024/wordml/sdtformatlock" xmlns:w16se="http://schemas.microsoft.com/office/word/2015/wordml/symex" mc:Ignorable="w14 w15 w16se w16cid w16 w16cex w16sdtdh w16sdtfl w16du">
-  <w:optimizeForBrowser/>
-  <w:allowPNG/>
-</w:webSettings>
 </file>
 
 <file path=word/theme/theme1.xml><?xml version="1.0" encoding="utf-8"?>
@@ -1616,7 +962,7 @@
 </a:theme>
 </file>
 
-<file path=customXml/item1.xml>��< ? x m l   v e r s i o n = " 1 . 0 "   e n c o d i n g = " u t f - 1 6 " ? > < N a v W o r d R e p o r t X m l P a r t   x m l n s = " u r n : m i c r o s o f t - d y n a m i c s - b u s i n e s s c e n t r a l / i n t e r n a l / e x t e n d e d / r e p o r t s / C e r t i f i c a t e / 5 0 2 0 0 / " > +<file path=customXml/item1.xml>��< ? x m l   v e r s i o n = " 1 . 0 "   e n c o d i n g = " u t f - 1 6 " ? > < N a v W o r d R e p o r t X m l P a r t   x m l n s = " u r n : m i c r o s o f t - d y n a m i c s - n a v / r e p o r t s / C e r t i f i c a t e / 5 0 2 0 0 / " >   
      < B C R e p o r t I n f o r m a t i o n >   
@@ -1682,34 +1028,32 @@
  
      < / B C R e p o r t I n f o r m a t i o n >   
-     < T o o l t i p s / > - 
-     < S a f e t y C e r t i f i c a t e   E l e m e n t T y p e = " D a t a I t e m "   E l e m e n t I d = " 1 2 4 9 7 3 1 6 0 4 " > - 
-         < C e r t i f i c a t e N o   E l e m e n t T y p e = " C o l u m n "   E l e m e n t I d = " 1 5 9 2 1 1 5 9 2 9 "   D a t a T y p e = " C o d e " > C e r t i f i c a t e N o < / C e r t i f i c a t e N o > - 
-         < C u s t o m e r N a m e   E l e m e n t T y p e = " C o l u m n "   E l e m e n t I d = " 2 6 5 4 9 6 8 2 6 "   D a t a T y p e = " T e x t " > C u s t o m e r N a m e < / C u s t o m e r N a m e > - 
-         < C u s t o m e r N o   E l e m e n t T y p e = " C o l u m n "   E l e m e n t I d = " 1 5 4 2 0 5 1 5 6 0 "   D a t a T y p e = " C o d e " > C u s t o m e r N o < / C u s t o m e r N o > - 
-         < D a t e O f S a l e   E l e m e n t T y p e = " C o l u m n "   E l e m e n t I d = " 2 0 0 9 4 8 9 9 1 7 "   D a t a T y p e = " D a t e " > D a t e O f S a l e < / D a t e O f S a l e > - 
-         < E n t r y N o   E l e m e n t T y p e = " C o l u m n "   E l e m e n t I d = " 1 1 3 1 3 5 3 5 3 6 "   D a t a T y p e = " I n t e g e r " > E n t r y N o < / E n t r y N o > - 
-         < M a n u f a c t u r e r   E l e m e n t T y p e = " C o l u m n "   E l e m e n t I d = " 1 4 9 9 6 4 4 9 0 6 "   D a t a T y p e = " T e x t " > M a n u f a c t u r e r < / M a n u f a c t u r e r > - 
-         < P r o d u c t N a m e   E l e m e n t T y p e = " C o l u m n "   E l e m e n t I d = " 6 2 5 7 4 8 3 9 9 "   D a t a T y p e = " T e x t " > P r o d u c t N a m e < / P r o d u c t N a m e > - 
-         < S a l e s O r d e r N o   E l e m e n t T y p e = " C o l u m n "   E l e m e n t I d = " 5 8 7 0 2 0 7 5 4 "   D a t a T y p e = " C o d e " > S a l e s O r d e r N o < / S a l e s O r d e r N o > - 
-         < V a l i d T o   E l e m e n t T y p e = " C o l u m n "   E l e m e n t I d = " 1 8 4 9 2 0 4 3 4 4 "   D a t a T y p e = " D a t e " > V a l i d T o < / V a l i d T o > +     < S a f e t y C e r t i f i c a t e > + 
+         < C e r t i f i c a t e N o > C e r t i f i c a t e N o < / C e r t i f i c a t e N o > + 
+         < C u s t o m e r N a m e > C u s t o m e r N a m e < / C u s t o m e r N a m e > + 
+         < C u s t o m e r N o > C u s t o m e r N o < / C u s t o m e r N o > + 
+         < D a t e O f S a l e > D a t e O f S a l e < / D a t e O f S a l e > + 
+         < E n t r y N o > E n t r y N o < / E n t r y N o > + 
+         < M a n u f a c t u r e r > M a n u f a c t u r e r < / M a n u f a c t u r e r > + 
+         < P r o d u c t N a m e > P r o d u c t N a m e < / P r o d u c t N a m e > + 
+         < S a l e s O r d e r N o > S a l e s O r d e r N o < / S a l e s O r d e r N o > + 
+         < V a l i d T o > V a l i d T o < / V a l i d T o >   
      < / S a f e t y C e r t i f i c a t e >   
  < / N a v W o r d R e p o r t X m l P a r t > 
 </file>
 
-<file path=customXml/item2.xml>��< ? x m l   v e r s i o n = " 1 . 0 "   e n c o d i n g = " u t f - 1 6 " ? > < N a v W o r d R e p o r t X m l P a r t   x m l n s = " u r n : m i c r o s o f t - d y n a m i c s - n a v / r e p o r t s / C e r t i f i c a t e / 5 0 2 0 0 / " > +<file path=customXml/item2.xml>��< ? x m l   v e r s i o n = " 1 . 0 "   e n c o d i n g = " u t f - 1 6 " ? > < N a v W o r d R e p o r t X m l P a r t   x m l n s = " u r n : m i c r o s o f t - d y n a m i c s - b u s i n e s s c e n t r a l / i n t e r n a l / e x t e n d e d / r e p o r t s / C e r t i f i c a t e / 5 0 2 0 0 / " >   
      < B C R e p o r t I n f o r m a t i o n >   
@@ -1775,25 +1119,27 @@
  
      < / B C R e p o r t I n f o r m a t i o n >   
-     < S a f e t y C e r t i f i c a t e > - 
-         < C e r t i f i c a t e N o > C e r t i f i c a t e N o < / C e r t i f i c a t e N o > - 
-         < C u s t o m e r N a m e > C u s t o m e r N a m e < / C u s t o m e r N a m e > - 
-         < C u s t o m e r N o > C u s t o m e r N o < / C u s t o m e r N o > - 
-         < D a t e O f S a l e > D a t e O f S a l e < / D a t e O f S a l e > - 
-         < E n t r y N o > E n t r y N o < / E n t r y N o > - 
-         < M a n u f a c t u r e r > M a n u f a c t u r e r < / M a n u f a c t u r e r > - 
-         < P r o d u c t N a m e > P r o d u c t N a m e < / P r o d u c t N a m e > - 
-         < S a l e s O r d e r N o > S a l e s O r d e r N o < / S a l e s O r d e r N o > - 
-         < V a l i d T o > V a l i d T o < / V a l i d T o > +     < T o o l t i p s / > + 
+     < S a f e t y C e r t i f i c a t e   E l e m e n t T y p e = " D a t a I t e m "   E l e m e n t I d = " 1 2 4 9 7 3 1 6 0 4 " > + 
+         < C e r t i f i c a t e N o   E l e m e n t T y p e = " C o l u m n "   E l e m e n t I d = " 1 5 9 2 1 1 5 9 2 9 "   D a t a T y p e = " C o d e " > C e r t i f i c a t e N o < / C e r t i f i c a t e N o > + 
+         < C u s t o m e r N a m e   E l e m e n t T y p e = " C o l u m n "   E l e m e n t I d = " 2 6 5 4 9 6 8 2 6 "   D a t a T y p e = " T e x t " > C u s t o m e r N a m e < / C u s t o m e r N a m e > + 
+         < C u s t o m e r N o   E l e m e n t T y p e = " C o l u m n "   E l e m e n t I d = " 1 5 4 2 0 5 1 5 6 0 "   D a t a T y p e = " C o d e " > C u s t o m e r N o < / C u s t o m e r N o > + 
+         < D a t e O f S a l e   E l e m e n t T y p e = " C o l u m n "   E l e m e n t I d = " 2 0 0 9 4 8 9 9 1 7 "   D a t a T y p e = " D a t e " > D a t e O f S a l e < / D a t e O f S a l e > + 
+         < E n t r y N o   E l e m e n t T y p e = " C o l u m n "   E l e m e n t I d = " 1 1 3 1 3 5 3 5 3 6 "   D a t a T y p e = " I n t e g e r " > E n t r y N o < / E n t r y N o > + 
+         < M a n u f a c t u r e r   E l e m e n t T y p e = " C o l u m n "   E l e m e n t I d = " 1 4 9 9 6 4 4 9 0 6 "   D a t a T y p e = " T e x t " > M a n u f a c t u r e r < / M a n u f a c t u r e r > + 
+         < P r o d u c t N a m e   E l e m e n t T y p e = " C o l u m n "   E l e m e n t I d = " 6 2 5 7 4 8 3 9 9 "   D a t a T y p e = " T e x t " > P r o d u c t N a m e < / P r o d u c t N a m e > + 
+         < S a l e s O r d e r N o   E l e m e n t T y p e = " C o l u m n "   E l e m e n t I d = " 5 8 7 0 2 0 7 5 4 "   D a t a T y p e = " C o d e " > S a l e s O r d e r N o < / S a l e s O r d e r N o > + 
+         < V a l i d T o   E l e m e n t T y p e = " C o l u m n "   E l e m e n t I d = " 1 8 4 9 2 0 4 3 4 4 "   D a t a T y p e = " D a t e " > V a l i d T o < / V a l i d T o >   
      < / S a f e t y C e r t i f i c a t e >   
@@ -1801,17 +1147,17 @@
 </file>
 
 <file path=customXml/itemProps1.xml><?xml version="1.0" encoding="utf-8"?>
+<ds:datastoreItem xmlns:ds="http://schemas.openxmlformats.org/officeDocument/2006/customXml" ds:itemID="{6A36634F-392F-4F9D-A102-FC53C401238A}">
+  <ds:schemaRefs>
+    <ds:schemaRef ds:uri="urn:microsoft-dynamics-nav/reports/Certificate/50200/"/>
+  </ds:schemaRefs>
+</ds:datastoreItem>
+</file>
+
+<file path=customXml/itemProps2.xml><?xml version="1.0" encoding="utf-8"?>
 <ds:datastoreItem xmlns:ds="http://schemas.openxmlformats.org/officeDocument/2006/customXml" ds:itemID="{2074CFC1-222B-449D-A67E-469654D51151}">
   <ds:schemaRefs>
     <ds:schemaRef ds:uri="urn:microsoft-dynamics-businesscentral/internal/extended/reports/Certificate/50200/"/>
   </ds:schemaRefs>
 </ds:datastoreItem>
-</file>
-
-<file path=customXml/itemProps2.xml><?xml version="1.0" encoding="utf-8"?>
-<ds:datastoreItem xmlns:ds="http://schemas.openxmlformats.org/officeDocument/2006/customXml" ds:itemID="{6A36634F-392F-4F9D-A102-FC53C401238A}">
-  <ds:schemaRefs>
-    <ds:schemaRef ds:uri="urn:microsoft-dynamics-nav/reports/Certificate/50200/"/>
-  </ds:schemaRefs>
-</ds:datastoreItem>
 </file>
</xml_diff>

<commit_message>
Adds safety certificate functionality by item
Implements the ability to generate safety certificates for items on posted sales invoices.
The certificate report retrieves item-specific data (certificate number, expiration date) and displays it in a Word layout.
A new action is added to the Posted Sales Invoice page to trigger the certificate generation.
The action validates item selection and the existence of a certificate number.
</commit_message>
<xml_diff>
--- a/Certificate.docx
+++ b/Certificate.docx
@@ -1,6 +1,6 @@
 
 <file path=word/document.xml><?xml version="1.0" encoding="utf-8"?>
-<w:document xmlns:wpc="http://schemas.microsoft.com/office/word/2010/wordprocessingCanvas" xmlns:cx="http://schemas.microsoft.com/office/drawing/2014/chartex" xmlns:cx1="http://schemas.microsoft.com/office/drawing/2015/9/8/chartex" xmlns:cx2="http://schemas.microsoft.com/office/drawing/2015/10/21/chartex" xmlns:cx3="http://schemas.microsoft.com/office/drawing/2016/5/9/chartex" xmlns:cx4="http://schemas.microsoft.com/office/drawing/2016/5/10/chartex" xmlns:cx5="http://schemas.microsoft.com/office/drawing/2016/5/11/chartex" xmlns:cx6="http://schemas.microsoft.com/office/drawing/2016/5/12/chartex" xmlns:cx7="http://schemas.microsoft.com/office/drawing/2016/5/13/chartex" xmlns:cx8="http://schemas.microsoft.com/office/drawing/2016/5/14/chartex" xmlns:mc="http://schemas.openxmlformats.org/markup-compatibility/2006" xmlns:aink="http://schemas.microsoft.com/office/drawing/2016/ink" xmlns:am3d="http://schemas.microsoft.com/office/drawing/2017/model3d" xmlns:o="urn:schemas-microsoft-com:office:office" xmlns:oel="http://schemas.microsoft.com/office/2019/extlst" xmlns:r="http://schemas.openxmlformats.org/officeDocument/2006/relationships" xmlns:m="http://schemas.openxmlformats.org/officeDocument/2006/math" xmlns:v="urn:schemas-microsoft-com:vml" xmlns:wp14="http://schemas.microsoft.com/office/word/2010/wordprocessingDrawing" xmlns:wp="http://schemas.openxmlformats.org/drawingml/2006/wordprocessingDrawing" xmlns:w10="urn:schemas-microsoft-com:office:word" xmlns:w="http://schemas.openxmlformats.org/wordprocessingml/2006/main" xmlns:w14="http://schemas.microsoft.com/office/word/2010/wordml" xmlns:w15="http://schemas.microsoft.com/office/word/2012/wordml" xmlns:w16cex="http://schemas.microsoft.com/office/word/2018/wordml/cex" xmlns:w16cid="http://schemas.microsoft.com/office/word/2016/wordml/cid" xmlns:w16="http://schemas.microsoft.com/office/word/2018/wordml" xmlns:w16du="http://schemas.microsoft.com/office/word/2023/wordml/word16du" xmlns:w16sdtdh="http://schemas.microsoft.com/office/word/2020/wordml/sdtdatahash" xmlns:w16sdtfl="http://schemas.microsoft.com/office/word/2024/wordml/sdtformatlock" xmlns:w16se="http://schemas.microsoft.com/office/word/2015/wordml/symex" xmlns:wpg="http://schemas.microsoft.com/office/word/2010/wordprocessingGroup" xmlns:wpi="http://schemas.microsoft.com/office/word/2010/wordprocessingInk" xmlns:wne="http://schemas.microsoft.com/office/word/2006/wordml" xmlns:wps="http://schemas.microsoft.com/office/word/2010/wordprocessingShape" mc:Ignorable="w14 w15 w16se w16cid w16 w16cex w16sdtdh w16sdtfl w16du wp14">
+<w:document xmlns:a="http://schemas.openxmlformats.org/drawingml/2006/main" xmlns:pic="http://schemas.openxmlformats.org/drawingml/2006/picture" xmlns:a14="http://schemas.microsoft.com/office/drawing/2010/main" xmlns:wpc="http://schemas.microsoft.com/office/word/2010/wordprocessingCanvas" xmlns:cx="http://schemas.microsoft.com/office/drawing/2014/chartex" xmlns:cx1="http://schemas.microsoft.com/office/drawing/2015/9/8/chartex" xmlns:cx2="http://schemas.microsoft.com/office/drawing/2015/10/21/chartex" xmlns:cx3="http://schemas.microsoft.com/office/drawing/2016/5/9/chartex" xmlns:cx4="http://schemas.microsoft.com/office/drawing/2016/5/10/chartex" xmlns:cx5="http://schemas.microsoft.com/office/drawing/2016/5/11/chartex" xmlns:cx6="http://schemas.microsoft.com/office/drawing/2016/5/12/chartex" xmlns:cx7="http://schemas.microsoft.com/office/drawing/2016/5/13/chartex" xmlns:cx8="http://schemas.microsoft.com/office/drawing/2016/5/14/chartex" xmlns:mc="http://schemas.openxmlformats.org/markup-compatibility/2006" xmlns:aink="http://schemas.microsoft.com/office/drawing/2016/ink" xmlns:am3d="http://schemas.microsoft.com/office/drawing/2017/model3d" xmlns:o="urn:schemas-microsoft-com:office:office" xmlns:oel="http://schemas.microsoft.com/office/2019/extlst" xmlns:r="http://schemas.openxmlformats.org/officeDocument/2006/relationships" xmlns:m="http://schemas.openxmlformats.org/officeDocument/2006/math" xmlns:v="urn:schemas-microsoft-com:vml" xmlns:wp14="http://schemas.microsoft.com/office/word/2010/wordprocessingDrawing" xmlns:wp="http://schemas.openxmlformats.org/drawingml/2006/wordprocessingDrawing" xmlns:w10="urn:schemas-microsoft-com:office:word" xmlns:w="http://schemas.openxmlformats.org/wordprocessingml/2006/main" xmlns:w14="http://schemas.microsoft.com/office/word/2010/wordml" xmlns:w15="http://schemas.microsoft.com/office/word/2012/wordml" xmlns:w16cex="http://schemas.microsoft.com/office/word/2018/wordml/cex" xmlns:w16cid="http://schemas.microsoft.com/office/word/2016/wordml/cid" xmlns:w16="http://schemas.microsoft.com/office/word/2018/wordml" xmlns:w16du="http://schemas.microsoft.com/office/word/2023/wordml/word16du" xmlns:w16sdtdh="http://schemas.microsoft.com/office/word/2020/wordml/sdtdatahash" xmlns:w16sdtfl="http://schemas.microsoft.com/office/word/2024/wordml/sdtformatlock" xmlns:w16se="http://schemas.microsoft.com/office/word/2015/wordml/symex" xmlns:wpg="http://schemas.microsoft.com/office/word/2010/wordprocessingGroup" xmlns:wpi="http://schemas.microsoft.com/office/word/2010/wordprocessingInk" xmlns:wne="http://schemas.microsoft.com/office/word/2006/wordml" xmlns:wps="http://schemas.microsoft.com/office/word/2010/wordprocessingShape" mc:Ignorable="w14 w15 w16se w16cid w16 w16cex w16sdtdh w16sdtfl w16du wp14">
   <w:body>
     <w:p>
       <w:r>
@@ -109,11 +109,51 @@
       <w:r>
         <w:t>Date of Sale: </w:t>
       </w:r>
-    </w:p>
-    <w:p>
-      <w:r>
-        <w:t>Order No.: </w:t>
-      </w:r>
+      <w:sdt>
+        <w:sdtPr>
+          <w:alias w:val="#Nav: /SalesInvoiceHeader/SalesInvoiceLine/DateOfSale"/>
+          <w:tag w:val="#Nav: Certificate/50200"/>
+          <w:id w:val="-1401437275"/>
+          <w:placeholder>
+            <w:docPart w:val="DefaultPlaceholder_-1854013440"/>
+          </w:placeholder>
+          <w:dataBinding w:prefixMappings="xmlns:ns0='urn:microsoft-dynamics-nav/reports/Certificate/50200/' " w:xpath="/ns0:NavWordReportXmlPart[1]/ns0:SalesInvoiceHeader[1]/ns0:SalesInvoiceLine[1]/ns0:DateOfSale[1]" w:storeItemID="{6A36634F-392F-4F9D-A102-FC53C401238A}"/>
+          <w:text/>
+        </w:sdtPr>
+        <w:sdtContent>
+          <w:r>
+            <w:t>DateOfSale</w:t>
+          </w:r>
+        </w:sdtContent>
+      </w:sdt>
+    </w:p>
+    <w:p>
+      <w:r>
+        <w:t xml:space="preserve">Sales </w:t>
+      </w:r>
+      <w:r>
+        <w:t>Order No.:</w:t>
+      </w:r>
+      <w:r>
+        <w:t xml:space="preserve"> </w:t>
+      </w:r>
+      <w:sdt>
+        <w:sdtPr>
+          <w:id w:val="158433671"/>
+          <w:placeholder>
+            <w:docPart w:val="DefaultPlaceholder_-1854013440"/>
+          </w:placeholder>
+          <w:dataBinding w:prefixMappings="xmlns:ns0='urn:microsoft-dynamics-nav/reports/Certificate/50200/' " w:xpath="/ns0:NavWordReportXmlPart[1]/ns0:SalesInvoiceHeader[1]/ns0:SalesInvoiceLine[1]/ns0:SalesOrderNo[1]" w:storeItemID="{6A36634F-392F-4F9D-A102-FC53C401238A}"/>
+          <w:text/>
+          <w:alias w:val="#Nav: /SalesInvoiceHeader/SalesInvoiceLine/SalesOrderNo"/>
+          <w:tag w:val="#Nav: Certificate/50200"/>
+        </w:sdtPr>
+        <w:sdtContent>
+          <w:r>
+            <w:t>SalesOrderNo</w:t>
+          </w:r>
+        </w:sdtContent>
+      </w:sdt>
     </w:p>
     <w:p>
       <w:r>
@@ -144,39 +184,170 @@
       <w:r>
         <w:t>Product Name: </w:t>
       </w:r>
+      <w:sdt>
+        <w:sdtPr>
+          <w:id w:val="1480660213"/>
+          <w:placeholder>
+            <w:docPart w:val="DefaultPlaceholder_-1854013440"/>
+          </w:placeholder>
+          <w:dataBinding w:prefixMappings="xmlns:ns0='urn:microsoft-dynamics-nav/reports/Certificate/50200/' " w:xpath="/ns0:NavWordReportXmlPart[1]/ns0:SalesInvoiceHeader[1]/ns0:SalesInvoiceLine[1]/ns0:ProductName[1]" w:storeItemID="{6A36634F-392F-4F9D-A102-FC53C401238A}"/>
+          <w:text/>
+          <w:alias w:val="#Nav: /SalesInvoiceHeader/SalesInvoiceLine/ProductName"/>
+          <w:tag w:val="#Nav: Certificate/50200"/>
+        </w:sdtPr>
+        <w:sdtContent>
+          <w:r>
+            <w:t>ProductName</w:t>
+          </w:r>
+        </w:sdtContent>
+      </w:sdt>
     </w:p>
     <w:p>
       <w:r>
         <w:t>Manufacturer:</w:t>
       </w:r>
-    </w:p>
-    <w:p>
-      <w:r>
+      <w:r>
+        <w:t xml:space="preserve"> </w:t>
+      </w:r>
+      <w:sdt>
+        <w:sdtPr>
+          <w:id w:val="-345258685"/>
+          <w:placeholder>
+            <w:docPart w:val="DefaultPlaceholder_-1854013440"/>
+          </w:placeholder>
+          <w:dataBinding w:prefixMappings="xmlns:ns0='urn:microsoft-dynamics-nav/reports/Certificate/50200/' " w:xpath="/ns0:NavWordReportXmlPart[1]/ns0:SalesInvoiceHeader[1]/ns0:SalesInvoiceLine[1]/ns0:Manufacturer[1]" w:storeItemID="{6A36634F-392F-4F9D-A102-FC53C401238A}"/>
+          <w:text/>
+          <w:alias w:val="#Nav: /SalesInvoiceHeader/SalesInvoiceLine/Manufacturer"/>
+          <w:tag w:val="#Nav: Certificate/50200"/>
+        </w:sdtPr>
+        <w:sdtContent>
+          <w:r>
+            <w:t>Manufacturer</w:t>
+          </w:r>
+        </w:sdtContent>
+      </w:sdt>
+    </w:p>
+    <w:p>
+      <w:pPr>
+        <w:rPr>
+          <w:lang w:val="pt-PT"/>
+        </w:rPr>
+      </w:pPr>
+      <w:r>
+        <w:rPr>
+          <w:lang w:val="pt-PT"/>
+        </w:rPr>
         <w:t>Certificate No.: </w:t>
       </w:r>
-    </w:p>
-    <w:p>
-      <w:r>
+      <w:sdt>
+        <w:sdtPr>
+          <w:rPr>
+            <w:lang w:val="pt-PT"/>
+          </w:rPr>
+          <w:id w:val="2018733862"/>
+          <w:placeholder>
+            <w:docPart w:val="DefaultPlaceholder_-1854013440"/>
+          </w:placeholder>
+          <w:dataBinding w:prefixMappings="xmlns:ns0='urn:microsoft-dynamics-nav/reports/Certificate/50200/' " w:xpath="/ns0:NavWordReportXmlPart[1]/ns0:SalesInvoiceHeader[1]/ns0:SalesInvoiceLine[1]/ns0:CertificateNo[1]" w:storeItemID="{6A36634F-392F-4F9D-A102-FC53C401238A}"/>
+          <w:text/>
+          <w:alias w:val="#Nav: /SalesInvoiceHeader/SalesInvoiceLine/CertificateNo"/>
+          <w:tag w:val="#Nav: Certificate/50200"/>
+        </w:sdtPr>
+        <w:sdtContent>
+          <w:r>
+            <w:rPr>
+              <w:lang w:val="pt-PT"/>
+            </w:rPr>
+            <w:t>CertificateNo</w:t>
+          </w:r>
+        </w:sdtContent>
+      </w:sdt>
+    </w:p>
+    <w:p>
+      <w:pPr>
+        <w:rPr>
+          <w:lang w:val="pt-PT"/>
+        </w:rPr>
+      </w:pPr>
+      <w:r>
+        <w:rPr>
+          <w:lang w:val="pt-PT"/>
+        </w:rPr>
         <w:t>Valid To: </w:t>
       </w:r>
-    </w:p>
-    <w:p>
-      <w:r>
+      <w:sdt>
+        <w:sdtPr>
+          <w:rPr>
+            <w:lang w:val="pt-PT"/>
+          </w:rPr>
+          <w:id w:val="1879884930"/>
+          <w:placeholder>
+            <w:docPart w:val="DefaultPlaceholder_-1854013440"/>
+          </w:placeholder>
+          <w:dataBinding w:prefixMappings="xmlns:ns0='urn:microsoft-dynamics-nav/reports/Certificate/50200/' " w:xpath="/ns0:NavWordReportXmlPart[1]/ns0:SalesInvoiceHeader[1]/ns0:SalesInvoiceLine[1]/ns0:ValidTo[1]" w:storeItemID="{6A36634F-392F-4F9D-A102-FC53C401238A}"/>
+          <w:text/>
+          <w:alias w:val="#Nav: /SalesInvoiceHeader/SalesInvoiceLine/ValidTo"/>
+          <w:tag w:val="#Nav: Certificate/50200"/>
+        </w:sdtPr>
+        <w:sdtContent>
+          <w:r>
+            <w:rPr>
+              <w:lang w:val="pt-PT"/>
+            </w:rPr>
+            <w:t>ValidTo</w:t>
+          </w:r>
+        </w:sdtContent>
+      </w:sdt>
+    </w:p>
+    <w:p>
+      <w:pPr>
+        <w:rPr>
+          <w:lang w:val="pt-PT"/>
+        </w:rPr>
+      </w:pPr>
+      <w:r>
+        <w:rPr>
+          <w:lang w:val="pt-PT"/>
+        </w:rPr>
         <w:t> </w:t>
       </w:r>
     </w:p>
     <w:p>
-      <w:r>
+      <w:pPr>
+        <w:rPr>
+          <w:lang w:val="pt-PT"/>
+        </w:rPr>
+      </w:pPr>
+      <w:r>
+        <w:rPr>
+          <w:lang w:val="pt-PT"/>
+        </w:rPr>
         <w:t> </w:t>
       </w:r>
     </w:p>
     <w:p>
-      <w:r>
+      <w:pPr>
+        <w:rPr>
+          <w:lang w:val="pt-PT"/>
+        </w:rPr>
+      </w:pPr>
+      <w:r>
+        <w:rPr>
+          <w:lang w:val="pt-PT"/>
+        </w:rPr>
         <w:t> </w:t>
       </w:r>
     </w:p>
     <w:p>
-      <w:r>
+      <w:pPr>
+        <w:rPr>
+          <w:lang w:val="pt-PT"/>
+        </w:rPr>
+      </w:pPr>
+      <w:r>
+        <w:rPr>
+          <w:lang w:val="pt-PT"/>
+        </w:rPr>
         <w:t> </w:t>
       </w:r>
     </w:p>
@@ -647,6 +818,555 @@
 </w:styles>
 </file>
 
+<file path=word/glossary/document.xml><?xml version="1.0" encoding="utf-8"?>
+<w:glossaryDocument xmlns:wpc="http://schemas.microsoft.com/office/word/2010/wordprocessingCanvas" xmlns:cx="http://schemas.microsoft.com/office/drawing/2014/chartex" xmlns:cx1="http://schemas.microsoft.com/office/drawing/2015/9/8/chartex" xmlns:cx2="http://schemas.microsoft.com/office/drawing/2015/10/21/chartex" xmlns:cx3="http://schemas.microsoft.com/office/drawing/2016/5/9/chartex" xmlns:cx4="http://schemas.microsoft.com/office/drawing/2016/5/10/chartex" xmlns:cx5="http://schemas.microsoft.com/office/drawing/2016/5/11/chartex" xmlns:cx6="http://schemas.microsoft.com/office/drawing/2016/5/12/chartex" xmlns:cx7="http://schemas.microsoft.com/office/drawing/2016/5/13/chartex" xmlns:cx8="http://schemas.microsoft.com/office/drawing/2016/5/14/chartex" xmlns:mc="http://schemas.openxmlformats.org/markup-compatibility/2006" xmlns:aink="http://schemas.microsoft.com/office/drawing/2016/ink" xmlns:am3d="http://schemas.microsoft.com/office/drawing/2017/model3d" xmlns:o="urn:schemas-microsoft-com:office:office" xmlns:oel="http://schemas.microsoft.com/office/2019/extlst" xmlns:r="http://schemas.openxmlformats.org/officeDocument/2006/relationships" xmlns:m="http://schemas.openxmlformats.org/officeDocument/2006/math" xmlns:v="urn:schemas-microsoft-com:vml" xmlns:wp14="http://schemas.microsoft.com/office/word/2010/wordprocessingDrawing" xmlns:wp="http://schemas.openxmlformats.org/drawingml/2006/wordprocessingDrawing" xmlns:w10="urn:schemas-microsoft-com:office:word" xmlns:w="http://schemas.openxmlformats.org/wordprocessingml/2006/main" xmlns:w14="http://schemas.microsoft.com/office/word/2010/wordml" xmlns:w15="http://schemas.microsoft.com/office/word/2012/wordml" xmlns:w16cex="http://schemas.microsoft.com/office/word/2018/wordml/cex" xmlns:w16cid="http://schemas.microsoft.com/office/word/2016/wordml/cid" xmlns:w16="http://schemas.microsoft.com/office/word/2018/wordml" xmlns:w16du="http://schemas.microsoft.com/office/word/2023/wordml/word16du" xmlns:w16sdtdh="http://schemas.microsoft.com/office/word/2020/wordml/sdtdatahash" xmlns:w16sdtfl="http://schemas.microsoft.com/office/word/2024/wordml/sdtformatlock" xmlns:w16se="http://schemas.microsoft.com/office/word/2015/wordml/symex" xmlns:wpg="http://schemas.microsoft.com/office/word/2010/wordprocessingGroup" xmlns:wpi="http://schemas.microsoft.com/office/word/2010/wordprocessingInk" xmlns:wne="http://schemas.microsoft.com/office/word/2006/wordml" xmlns:wps="http://schemas.microsoft.com/office/word/2010/wordprocessingShape" mc:Ignorable="w14 w15 w16se w16cid w16 w16cex w16sdtdh w16sdtfl w16du wp14">
+  <w:docParts>
+    <w:docPart>
+      <w:docPartPr>
+        <w:name w:val="DefaultPlaceholder_-1854013440"/>
+        <w:category>
+          <w:name w:val="General"/>
+          <w:gallery w:val="placeholder"/>
+        </w:category>
+        <w:types>
+          <w:type w:val="bbPlcHdr"/>
+        </w:types>
+        <w:behaviors>
+          <w:behavior w:val="content"/>
+        </w:behaviors>
+        <w:guid w:val="{7729ABDD-768E-4461-AE9A-8419191F8840}"/>
+      </w:docPartPr>
+      <w:docPartBody>
+        <w:p>
+          <w:r>
+            <w:rPr>
+              <w:rStyle w:val="PlaceholderText"/>
+            </w:rPr>
+            <w:t>Click or tap here to enter text.</w:t>
+          </w:r>
+        </w:p>
+      </w:docPartBody>
+    </w:docPart>
+  </w:docParts>
+</w:glossaryDocument>
+</file>
+
+<file path=word/glossary/fontTable.xml><?xml version="1.0" encoding="utf-8"?>
+<w:fonts xmlns:mc="http://schemas.openxmlformats.org/markup-compatibility/2006" xmlns:r="http://schemas.openxmlformats.org/officeDocument/2006/relationships" xmlns:w="http://schemas.openxmlformats.org/wordprocessingml/2006/main" xmlns:w14="http://schemas.microsoft.com/office/word/2010/wordml" xmlns:w15="http://schemas.microsoft.com/office/word/2012/wordml" xmlns:w16cex="http://schemas.microsoft.com/office/word/2018/wordml/cex" xmlns:w16cid="http://schemas.microsoft.com/office/word/2016/wordml/cid" xmlns:w16="http://schemas.microsoft.com/office/word/2018/wordml" xmlns:w16du="http://schemas.microsoft.com/office/word/2023/wordml/word16du" xmlns:w16sdtdh="http://schemas.microsoft.com/office/word/2020/wordml/sdtdatahash" xmlns:w16sdtfl="http://schemas.microsoft.com/office/word/2024/wordml/sdtformatlock" xmlns:w16se="http://schemas.microsoft.com/office/word/2015/wordml/symex" mc:Ignorable="w14 w15 w16se w16cid w16 w16cex w16sdtdh w16sdtfl w16du">
+  <w:font w:name="Aptos">
+    <w:charset w:val="00"/>
+    <w:family w:val="swiss"/>
+    <w:pitch w:val="variable"/>
+    <w:sig w:usb0="20000287" w:usb1="00000003" w:usb2="00000000" w:usb3="00000000" w:csb0="0000019F" w:csb1="00000000"/>
+  </w:font>
+  <w:font w:name="Times New Roman">
+    <w:panose1 w:val="02020603050405020304"/>
+    <w:charset w:val="00"/>
+    <w:family w:val="roman"/>
+    <w:pitch w:val="variable"/>
+    <w:sig w:usb0="E0002EFF" w:usb1="C000785B" w:usb2="00000009" w:usb3="00000000" w:csb0="000001FF" w:csb1="00000000"/>
+  </w:font>
+  <w:font w:name="Aptos Display">
+    <w:charset w:val="00"/>
+    <w:family w:val="swiss"/>
+    <w:pitch w:val="variable"/>
+    <w:sig w:usb0="20000287" w:usb1="00000003" w:usb2="00000000" w:usb3="00000000" w:csb0="0000019F" w:csb1="00000000"/>
+  </w:font>
+</w:fonts>
+</file>
+
+<file path=word/glossary/settings.xml><?xml version="1.0" encoding="utf-8"?>
+<w:settings xmlns:mc="http://schemas.openxmlformats.org/markup-compatibility/2006" xmlns:o="urn:schemas-microsoft-com:office:office" xmlns:r="http://schemas.openxmlformats.org/officeDocument/2006/relationships" xmlns:m="http://schemas.openxmlformats.org/officeDocument/2006/math" xmlns:v="urn:schemas-microsoft-com:vml" xmlns:w10="urn:schemas-microsoft-com:office:word" xmlns:w="http://schemas.openxmlformats.org/wordprocessingml/2006/main" xmlns:w14="http://schemas.microsoft.com/office/word/2010/wordml" xmlns:w15="http://schemas.microsoft.com/office/word/2012/wordml" xmlns:w16cex="http://schemas.microsoft.com/office/word/2018/wordml/cex" xmlns:w16cid="http://schemas.microsoft.com/office/word/2016/wordml/cid" xmlns:w16="http://schemas.microsoft.com/office/word/2018/wordml" xmlns:w16du="http://schemas.microsoft.com/office/word/2023/wordml/word16du" xmlns:w16sdtdh="http://schemas.microsoft.com/office/word/2020/wordml/sdtdatahash" xmlns:w16sdtfl="http://schemas.microsoft.com/office/word/2024/wordml/sdtformatlock" xmlns:w16se="http://schemas.microsoft.com/office/word/2015/wordml/symex" xmlns:sl="http://schemas.openxmlformats.org/schemaLibrary/2006/main" mc:Ignorable="w14 w15 w16se w16cid w16 w16cex w16sdtdh w16sdtfl w16du">
+  <w:view w:val="normal"/>
+  <w:defaultTabStop w:val="720"/>
+  <w:characterSpacingControl w:val="doNotCompress"/>
+  <w:compat>
+    <w:useFELayout/>
+    <w:compatSetting w:name="compatibilityMode" w:uri="http://schemas.microsoft.com/office/word" w:val="15"/>
+    <w:compatSetting w:name="overrideTableStyleFontSizeAndJustification" w:uri="http://schemas.microsoft.com/office/word" w:val="1"/>
+    <w:compatSetting w:name="enableOpenTypeFeatures" w:uri="http://schemas.microsoft.com/office/word" w:val="1"/>
+    <w:compatSetting w:name="doNotFlipMirrorIndents" w:uri="http://schemas.microsoft.com/office/word" w:val="1"/>
+    <w:compatSetting w:name="differentiateMultirowTableHeaders" w:uri="http://schemas.microsoft.com/office/word" w:val="1"/>
+    <w:compatSetting w:name="useWord2013TrackBottomHyphenation" w:uri="http://schemas.microsoft.com/office/word" w:val="0"/>
+  </w:compat>
+  <w:rsids>
+    <w:rsidRoot w:val="00457BB0"/>
+    <w:rsid w:val="00457BB0"/>
+    <w:rsid w:val="004D6E62"/>
+    <w:rsid w:val="00530AAA"/>
+    <w:rsid w:val="00AC512B"/>
+    <w:rsid w:val="00B75DE2"/>
+    <w:rsid w:val="00EB25D7"/>
+  </w:rsids>
+  <m:mathPr>
+    <m:mathFont m:val="Cambria Math"/>
+    <m:brkBin m:val="before"/>
+    <m:brkBinSub m:val="--"/>
+    <m:smallFrac m:val="0"/>
+    <m:dispDef/>
+    <m:lMargin m:val="0"/>
+    <m:rMargin m:val="0"/>
+    <m:defJc m:val="centerGroup"/>
+    <m:wrapIndent m:val="1440"/>
+    <m:intLim m:val="subSup"/>
+    <m:naryLim m:val="undOvr"/>
+  </m:mathPr>
+  <w:themeFontLang w:val="en-US"/>
+  <w:clrSchemeMapping w:bg1="light1" w:t1="dark1" w:bg2="light2" w:t2="dark2" w:accent1="accent1" w:accent2="accent2" w:accent3="accent3" w:accent4="accent4" w:accent5="accent5" w:accent6="accent6" w:hyperlink="hyperlink" w:followedHyperlink="followedHyperlink"/>
+  <w:decimalSymbol w:val="."/>
+  <w:listSeparator w:val=","/>
+  <w15:chartTrackingRefBased/>
+</w:settings>
+</file>
+
+<file path=word/glossary/styles.xml><?xml version="1.0" encoding="utf-8"?>
+<w:styles xmlns:mc="http://schemas.openxmlformats.org/markup-compatibility/2006" xmlns:r="http://schemas.openxmlformats.org/officeDocument/2006/relationships" xmlns:w="http://schemas.openxmlformats.org/wordprocessingml/2006/main" xmlns:w14="http://schemas.microsoft.com/office/word/2010/wordml" xmlns:w15="http://schemas.microsoft.com/office/word/2012/wordml" xmlns:w16cex="http://schemas.microsoft.com/office/word/2018/wordml/cex" xmlns:w16cid="http://schemas.microsoft.com/office/word/2016/wordml/cid" xmlns:w16="http://schemas.microsoft.com/office/word/2018/wordml" xmlns:w16du="http://schemas.microsoft.com/office/word/2023/wordml/word16du" xmlns:w16sdtdh="http://schemas.microsoft.com/office/word/2020/wordml/sdtdatahash" xmlns:w16sdtfl="http://schemas.microsoft.com/office/word/2024/wordml/sdtformatlock" xmlns:w16se="http://schemas.microsoft.com/office/word/2015/wordml/symex" mc:Ignorable="w14 w15 w16se w16cid w16 w16cex w16sdtdh w16sdtfl w16du">
+  <w:docDefaults>
+    <w:rPrDefault>
+      <w:rPr>
+        <w:rFonts w:asciiTheme="minorHAnsi" w:eastAsiaTheme="minorEastAsia" w:hAnsiTheme="minorHAnsi" w:cstheme="minorBidi"/>
+        <w:kern w:val="2"/>
+        <w:sz w:val="24"/>
+        <w:szCs w:val="24"/>
+        <w:lang w:val="en-US" w:eastAsia="en-US" w:bidi="ar-SA"/>
+        <w14:ligatures w14:val="standardContextual"/>
+      </w:rPr>
+    </w:rPrDefault>
+    <w:pPrDefault>
+      <w:pPr>
+        <w:spacing w:after="160" w:line="278" w:lineRule="auto"/>
+      </w:pPr>
+    </w:pPrDefault>
+  </w:docDefaults>
+  <w:latentStyles w:defLockedState="0" w:defUIPriority="99" w:defSemiHidden="0" w:defUnhideWhenUsed="0" w:defQFormat="0" w:count="376">
+    <w:lsdException w:name="Normal" w:uiPriority="0" w:qFormat="1"/>
+    <w:lsdException w:name="heading 1" w:uiPriority="9" w:qFormat="1"/>
+    <w:lsdException w:name="heading 2" w:semiHidden="1" w:uiPriority="9" w:unhideWhenUsed="1" w:qFormat="1"/>
+    <w:lsdException w:name="heading 3" w:semiHidden="1" w:uiPriority="9" w:unhideWhenUsed="1" w:qFormat="1"/>
+    <w:lsdException w:name="heading 4" w:semiHidden="1" w:uiPriority="9" w:unhideWhenUsed="1" w:qFormat="1"/>
+    <w:lsdException w:name="heading 5" w:semiHidden="1" w:uiPriority="9" w:unhideWhenUsed="1" w:qFormat="1"/>
+    <w:lsdException w:name="heading 6" w:semiHidden="1" w:uiPriority="9" w:unhideWhenUsed="1" w:qFormat="1"/>
+    <w:lsdException w:name="heading 7" w:semiHidden="1" w:uiPriority="9" w:unhideWhenUsed="1" w:qFormat="1"/>
+    <w:lsdException w:name="heading 8" w:semiHidden="1" w:uiPriority="9" w:unhideWhenUsed="1" w:qFormat="1"/>
+    <w:lsdException w:name="heading 9" w:semiHidden="1" w:uiPriority="9" w:unhideWhenUsed="1" w:qFormat="1"/>
+    <w:lsdException w:name="index 1" w:semiHidden="1" w:unhideWhenUsed="1"/>
+    <w:lsdException w:name="index 2" w:semiHidden="1" w:unhideWhenUsed="1"/>
+    <w:lsdException w:name="index 3" w:semiHidden="1" w:unhideWhenUsed="1"/>
+    <w:lsdException w:name="index 4" w:semiHidden="1" w:unhideWhenUsed="1"/>
+    <w:lsdException w:name="index 5" w:semiHidden="1" w:unhideWhenUsed="1"/>
+    <w:lsdException w:name="index 6" w:semiHidden="1" w:unhideWhenUsed="1"/>
+    <w:lsdException w:name="index 7" w:semiHidden="1" w:unhideWhenUsed="1"/>
+    <w:lsdException w:name="index 8" w:semiHidden="1" w:unhideWhenUsed="1"/>
+    <w:lsdException w:name="index 9" w:semiHidden="1" w:unhideWhenUsed="1"/>
+    <w:lsdException w:name="toc 1" w:semiHidden="1" w:uiPriority="39" w:unhideWhenUsed="1"/>
+    <w:lsdException w:name="toc 2" w:semiHidden="1" w:uiPriority="39" w:unhideWhenUsed="1"/>
+    <w:lsdException w:name="toc 3" w:semiHidden="1" w:uiPriority="39" w:unhideWhenUsed="1"/>
+    <w:lsdException w:name="toc 4" w:semiHidden="1" w:uiPriority="39" w:unhideWhenUsed="1"/>
+    <w:lsdException w:name="toc 5" w:semiHidden="1" w:uiPriority="39" w:unhideWhenUsed="1"/>
+    <w:lsdException w:name="toc 6" w:semiHidden="1" w:uiPriority="39" w:unhideWhenUsed="1"/>
+    <w:lsdException w:name="toc 7" w:semiHidden="1" w:uiPriority="39" w:unhideWhenUsed="1"/>
+    <w:lsdException w:name="toc 8" w:semiHidden="1" w:uiPriority="39" w:unhideWhenUsed="1"/>
+    <w:lsdException w:name="toc 9" w:semiHidden="1" w:uiPriority="39" w:unhideWhenUsed="1"/>
+    <w:lsdException w:name="Normal Indent" w:semiHidden="1" w:unhideWhenUsed="1"/>
+    <w:lsdException w:name="footnote text" w:semiHidden="1" w:unhideWhenUsed="1"/>
+    <w:lsdException w:name="annotation text" w:semiHidden="1" w:unhideWhenUsed="1"/>
+    <w:lsdException w:name="header" w:semiHidden="1" w:unhideWhenUsed="1"/>
+    <w:lsdException w:name="footer" w:semiHidden="1" w:unhideWhenUsed="1"/>
+    <w:lsdException w:name="index heading" w:semiHidden="1" w:unhideWhenUsed="1"/>
+    <w:lsdException w:name="caption" w:semiHidden="1" w:uiPriority="35" w:unhideWhenUsed="1" w:qFormat="1"/>
+    <w:lsdException w:name="table of figures" w:semiHidden="1" w:unhideWhenUsed="1"/>
+    <w:lsdException w:name="envelope address" w:semiHidden="1" w:unhideWhenUsed="1"/>
+    <w:lsdException w:name="envelope return" w:semiHidden="1" w:unhideWhenUsed="1"/>
+    <w:lsdException w:name="footnote reference" w:semiHidden="1" w:unhideWhenUsed="1"/>
+    <w:lsdException w:name="annotation reference" w:semiHidden="1" w:unhideWhenUsed="1"/>
+    <w:lsdException w:name="line number" w:semiHidden="1" w:unhideWhenUsed="1"/>
+    <w:lsdException w:name="page number" w:semiHidden="1" w:unhideWhenUsed="1"/>
+    <w:lsdException w:name="endnote reference" w:semiHidden="1" w:unhideWhenUsed="1"/>
+    <w:lsdException w:name="endnote text" w:semiHidden="1" w:unhideWhenUsed="1"/>
+    <w:lsdException w:name="table of authorities" w:semiHidden="1" w:unhideWhenUsed="1"/>
+    <w:lsdException w:name="macro" w:semiHidden="1" w:unhideWhenUsed="1"/>
+    <w:lsdException w:name="toa heading" w:semiHidden="1" w:unhideWhenUsed="1"/>
+    <w:lsdException w:name="List" w:semiHidden="1" w:unhideWhenUsed="1"/>
+    <w:lsdException w:name="List Bullet" w:semiHidden="1" w:unhideWhenUsed="1"/>
+    <w:lsdException w:name="List Number" w:semiHidden="1" w:unhideWhenUsed="1"/>
+    <w:lsdException w:name="List 2" w:semiHidden="1" w:unhideWhenUsed="1"/>
+    <w:lsdException w:name="List 3" w:semiHidden="1" w:unhideWhenUsed="1"/>
+    <w:lsdException w:name="List 4" w:semiHidden="1" w:unhideWhenUsed="1"/>
+    <w:lsdException w:name="List 5" w:semiHidden="1" w:unhideWhenUsed="1"/>
+    <w:lsdException w:name="List Bullet 2" w:semiHidden="1" w:unhideWhenUsed="1"/>
+    <w:lsdException w:name="List Bullet 3" w:semiHidden="1" w:unhideWhenUsed="1"/>
+    <w:lsdException w:name="List Bullet 4" w:semiHidden="1" w:unhideWhenUsed="1"/>
+    <w:lsdException w:name="List Bullet 5" w:semiHidden="1" w:unhideWhenUsed="1"/>
+    <w:lsdException w:name="List Number 2" w:semiHidden="1" w:unhideWhenUsed="1"/>
+    <w:lsdException w:name="List Number 3" w:semiHidden="1" w:unhideWhenUsed="1"/>
+    <w:lsdException w:name="List Number 4" w:semiHidden="1" w:unhideWhenUsed="1"/>
+    <w:lsdException w:name="List Number 5" w:semiHidden="1" w:unhideWhenUsed="1"/>
+    <w:lsdException w:name="Title" w:uiPriority="10" w:qFormat="1"/>
+    <w:lsdException w:name="Closing" w:semiHidden="1" w:unhideWhenUsed="1"/>
+    <w:lsdException w:name="Signature" w:semiHidden="1" w:unhideWhenUsed="1"/>
+    <w:lsdException w:name="Default Paragraph Font" w:semiHidden="1" w:uiPriority="1" w:unhideWhenUsed="1"/>
+    <w:lsdException w:name="Body Text" w:semiHidden="1" w:unhideWhenUsed="1"/>
+    <w:lsdException w:name="Body Text Indent" w:semiHidden="1" w:unhideWhenUsed="1"/>
+    <w:lsdException w:name="List Continue" w:semiHidden="1" w:unhideWhenUsed="1"/>
+    <w:lsdException w:name="List Continue 2" w:semiHidden="1" w:unhideWhenUsed="1"/>
+    <w:lsdException w:name="List Continue 3" w:semiHidden="1" w:unhideWhenUsed="1"/>
+    <w:lsdException w:name="List Continue 4" w:semiHidden="1" w:unhideWhenUsed="1"/>
+    <w:lsdException w:name="List Continue 5" w:semiHidden="1" w:unhideWhenUsed="1"/>
+    <w:lsdException w:name="Message Header" w:semiHidden="1" w:unhideWhenUsed="1"/>
+    <w:lsdException w:name="Subtitle" w:uiPriority="11" w:qFormat="1"/>
+    <w:lsdException w:name="Salutation" w:semiHidden="1" w:unhideWhenUsed="1"/>
+    <w:lsdException w:name="Date" w:semiHidden="1" w:unhideWhenUsed="1"/>
+    <w:lsdException w:name="Body Text First Indent" w:semiHidden="1" w:unhideWhenUsed="1"/>
+    <w:lsdException w:name="Body Text First Indent 2" w:semiHidden="1" w:unhideWhenUsed="1"/>
+    <w:lsdException w:name="Note Heading" w:semiHidden="1" w:unhideWhenUsed="1"/>
+    <w:lsdException w:name="Body Text 2" w:semiHidden="1" w:unhideWhenUsed="1"/>
+    <w:lsdException w:name="Body Text 3" w:semiHidden="1" w:unhideWhenUsed="1"/>
+    <w:lsdException w:name="Body Text Indent 2" w:semiHidden="1" w:unhideWhenUsed="1"/>
+    <w:lsdException w:name="Body Text Indent 3" w:semiHidden="1" w:unhideWhenUsed="1"/>
+    <w:lsdException w:name="Block Text" w:semiHidden="1" w:unhideWhenUsed="1"/>
+    <w:lsdException w:name="Hyperlink" w:semiHidden="1" w:unhideWhenUsed="1"/>
+    <w:lsdException w:name="FollowedHyperlink" w:semiHidden="1" w:unhideWhenUsed="1"/>
+    <w:lsdException w:name="Strong" w:uiPriority="22" w:qFormat="1"/>
+    <w:lsdException w:name="Emphasis" w:uiPriority="20" w:qFormat="1"/>
+    <w:lsdException w:name="Document Map" w:semiHidden="1" w:unhideWhenUsed="1"/>
+    <w:lsdException w:name="Plain Text" w:semiHidden="1" w:unhideWhenUsed="1"/>
+    <w:lsdException w:name="E-mail Signature" w:semiHidden="1" w:unhideWhenUsed="1"/>
+    <w:lsdException w:name="HTML Top of Form" w:semiHidden="1" w:unhideWhenUsed="1"/>
+    <w:lsdException w:name="HTML Bottom of Form" w:semiHidden="1" w:unhideWhenUsed="1"/>
+    <w:lsdException w:name="Normal (Web)" w:semiHidden="1" w:unhideWhenUsed="1"/>
+    <w:lsdException w:name="HTML Acronym" w:semiHidden="1" w:unhideWhenUsed="1"/>
+    <w:lsdException w:name="HTML Address" w:semiHidden="1" w:unhideWhenUsed="1"/>
+    <w:lsdException w:name="HTML Cite" w:semiHidden="1" w:unhideWhenUsed="1"/>
+    <w:lsdException w:name="HTML Code" w:semiHidden="1" w:unhideWhenUsed="1"/>
+    <w:lsdException w:name="HTML Definition" w:semiHidden="1" w:unhideWhenUsed="1"/>
+    <w:lsdException w:name="HTML Keyboard" w:semiHidden="1" w:unhideWhenUsed="1"/>
+    <w:lsdException w:name="HTML Preformatted" w:semiHidden="1" w:unhideWhenUsed="1"/>
+    <w:lsdException w:name="HTML Sample" w:semiHidden="1" w:unhideWhenUsed="1"/>
+    <w:lsdException w:name="HTML Typewriter" w:semiHidden="1" w:unhideWhenUsed="1"/>
+    <w:lsdException w:name="HTML Variable" w:semiHidden="1" w:unhideWhenUsed="1"/>
+    <w:lsdException w:name="Normal Table" w:semiHidden="1" w:unhideWhenUsed="1"/>
+    <w:lsdException w:name="annotation subject" w:semiHidden="1" w:unhideWhenUsed="1"/>
+    <w:lsdException w:name="No List" w:semiHidden="1" w:unhideWhenUsed="1"/>
+    <w:lsdException w:name="Outline List 1" w:semiHidden="1" w:unhideWhenUsed="1"/>
+    <w:lsdException w:name="Outline List 2" w:semiHidden="1" w:unhideWhenUsed="1"/>
+    <w:lsdException w:name="Outline List 3" w:semiHidden="1" w:unhideWhenUsed="1"/>
+    <w:lsdException w:name="Table Simple 1" w:semiHidden="1" w:unhideWhenUsed="1"/>
+    <w:lsdException w:name="Table Simple 2" w:semiHidden="1" w:unhideWhenUsed="1"/>
+    <w:lsdException w:name="Table Simple 3" w:semiHidden="1" w:unhideWhenUsed="1"/>
+    <w:lsdException w:name="Table Classic 1" w:semiHidden="1" w:unhideWhenUsed="1"/>
+    <w:lsdException w:name="Table Classic 2" w:semiHidden="1" w:unhideWhenUsed="1"/>
+    <w:lsdException w:name="Table Classic 3" w:semiHidden="1" w:unhideWhenUsed="1"/>
+    <w:lsdException w:name="Table Classic 4" w:semiHidden="1" w:unhideWhenUsed="1"/>
+    <w:lsdException w:name="Table Colorful 1" w:semiHidden="1" w:unhideWhenUsed="1"/>
+    <w:lsdException w:name="Table Colorful 2" w:semiHidden="1" w:unhideWhenUsed="1"/>
+    <w:lsdException w:name="Table Colorful 3" w:semiHidden="1" w:unhideWhenUsed="1"/>
+    <w:lsdException w:name="Table Columns 1" w:semiHidden="1" w:unhideWhenUsed="1"/>
+    <w:lsdException w:name="Table Columns 2" w:semiHidden="1" w:unhideWhenUsed="1"/>
+    <w:lsdException w:name="Table Columns 3" w:semiHidden="1" w:unhideWhenUsed="1"/>
+    <w:lsdException w:name="Table Columns 4" w:semiHidden="1" w:unhideWhenUsed="1"/>
+    <w:lsdException w:name="Table Columns 5" w:semiHidden="1" w:unhideWhenUsed="1"/>
+    <w:lsdException w:name="Table Grid 1" w:semiHidden="1" w:unhideWhenUsed="1"/>
+    <w:lsdException w:name="Table Grid 2" w:semiHidden="1" w:unhideWhenUsed="1"/>
+    <w:lsdException w:name="Table Grid 3" w:semiHidden="1" w:unhideWhenUsed="1"/>
+    <w:lsdException w:name="Table Grid 4" w:semiHidden="1" w:unhideWhenUsed="1"/>
+    <w:lsdException w:name="Table Grid 5" w:semiHidden="1" w:unhideWhenUsed="1"/>
+    <w:lsdException w:name="Table Grid 6" w:semiHidden="1" w:unhideWhenUsed="1"/>
+    <w:lsdException w:name="Table Grid 7" w:semiHidden="1" w:unhideWhenUsed="1"/>
+    <w:lsdException w:name="Table Grid 8" w:semiHidden="1" w:unhideWhenUsed="1"/>
+    <w:lsdException w:name="Table List 1" w:semiHidden="1" w:unhideWhenUsed="1"/>
+    <w:lsdException w:name="Table List 2" w:semiHidden="1" w:unhideWhenUsed="1"/>
+    <w:lsdException w:name="Table List 3" w:semiHidden="1" w:unhideWhenUsed="1"/>
+    <w:lsdException w:name="Table List 4" w:semiHidden="1" w:unhideWhenUsed="1"/>
+    <w:lsdException w:name="Table List 5" w:semiHidden="1" w:unhideWhenUsed="1"/>
+    <w:lsdException w:name="Table List 6" w:semiHidden="1" w:unhideWhenUsed="1"/>
+    <w:lsdException w:name="Table List 7" w:semiHidden="1" w:unhideWhenUsed="1"/>
+    <w:lsdException w:name="Table List 8" w:semiHidden="1" w:unhideWhenUsed="1"/>
+    <w:lsdException w:name="Table 3D effects 1" w:semiHidden="1" w:unhideWhenUsed="1"/>
+    <w:lsdException w:name="Table 3D effects 2" w:semiHidden="1" w:unhideWhenUsed="1"/>
+    <w:lsdException w:name="Table 3D effects 3" w:semiHidden="1" w:unhideWhenUsed="1"/>
+    <w:lsdException w:name="Table Contemporary" w:semiHidden="1" w:unhideWhenUsed="1"/>
+    <w:lsdException w:name="Table Elegant" w:semiHidden="1" w:unhideWhenUsed="1"/>
+    <w:lsdException w:name="Table Professional" w:semiHidden="1" w:unhideWhenUsed="1"/>
+    <w:lsdException w:name="Table Subtle 1" w:semiHidden="1" w:unhideWhenUsed="1"/>
+    <w:lsdException w:name="Table Subtle 2" w:semiHidden="1" w:unhideWhenUsed="1"/>
+    <w:lsdException w:name="Table Web 1" w:semiHidden="1" w:unhideWhenUsed="1"/>
+    <w:lsdException w:name="Table Web 2" w:semiHidden="1" w:unhideWhenUsed="1"/>
+    <w:lsdException w:name="Table Web 3" w:semiHidden="1" w:unhideWhenUsed="1"/>
+    <w:lsdException w:name="Balloon Text" w:semiHidden="1" w:unhideWhenUsed="1"/>
+    <w:lsdException w:name="Table Grid" w:uiPriority="39"/>
+    <w:lsdException w:name="Table Theme" w:semiHidden="1" w:unhideWhenUsed="1"/>
+    <w:lsdException w:name="Placeholder Text" w:semiHidden="1"/>
+    <w:lsdException w:name="No Spacing" w:uiPriority="1" w:qFormat="1"/>
+    <w:lsdException w:name="Light Shading" w:uiPriority="60"/>
+    <w:lsdException w:name="Light List" w:uiPriority="61"/>
+    <w:lsdException w:name="Light Grid" w:uiPriority="62"/>
+    <w:lsdException w:name="Medium Shading 1" w:uiPriority="63"/>
+    <w:lsdException w:name="Medium Shading 2" w:uiPriority="64"/>
+    <w:lsdException w:name="Medium List 1" w:uiPriority="65"/>
+    <w:lsdException w:name="Medium List 2" w:uiPriority="66"/>
+    <w:lsdException w:name="Medium Grid 1" w:uiPriority="67"/>
+    <w:lsdException w:name="Medium Grid 2" w:uiPriority="68"/>
+    <w:lsdException w:name="Medium Grid 3" w:uiPriority="69"/>
+    <w:lsdException w:name="Dark List" w:uiPriority="70"/>
+    <w:lsdException w:name="Colorful Shading" w:uiPriority="71"/>
+    <w:lsdException w:name="Colorful List" w:uiPriority="72"/>
+    <w:lsdException w:name="Colorful Grid" w:uiPriority="73"/>
+    <w:lsdException w:name="Light Shading Accent 1" w:uiPriority="60"/>
+    <w:lsdException w:name="Light List Accent 1" w:uiPriority="61"/>
+    <w:lsdException w:name="Light Grid Accent 1" w:uiPriority="62"/>
+    <w:lsdException w:name="Medium Shading 1 Accent 1" w:uiPriority="63"/>
+    <w:lsdException w:name="Medium Shading 2 Accent 1" w:uiPriority="64"/>
+    <w:lsdException w:name="Medium List 1 Accent 1" w:uiPriority="65"/>
+    <w:lsdException w:name="Revision" w:semiHidden="1"/>
+    <w:lsdException w:name="List Paragraph" w:uiPriority="34" w:qFormat="1"/>
+    <w:lsdException w:name="Quote" w:uiPriority="29" w:qFormat="1"/>
+    <w:lsdException w:name="Intense Quote" w:uiPriority="30" w:qFormat="1"/>
+    <w:lsdException w:name="Medium List 2 Accent 1" w:uiPriority="66"/>
+    <w:lsdException w:name="Medium Grid 1 Accent 1" w:uiPriority="67"/>
+    <w:lsdException w:name="Medium Grid 2 Accent 1" w:uiPriority="68"/>
+    <w:lsdException w:name="Medium Grid 3 Accent 1" w:uiPriority="69"/>
+    <w:lsdException w:name="Dark List Accent 1" w:uiPriority="70"/>
+    <w:lsdException w:name="Colorful Shading Accent 1" w:uiPriority="71"/>
+    <w:lsdException w:name="Colorful List Accent 1" w:uiPriority="72"/>
+    <w:lsdException w:name="Colorful Grid Accent 1" w:uiPriority="73"/>
+    <w:lsdException w:name="Light Shading Accent 2" w:uiPriority="60"/>
+    <w:lsdException w:name="Light List Accent 2" w:uiPriority="61"/>
+    <w:lsdException w:name="Light Grid Accent 2" w:uiPriority="62"/>
+    <w:lsdException w:name="Medium Shading 1 Accent 2" w:uiPriority="63"/>
+    <w:lsdException w:name="Medium Shading 2 Accent 2" w:uiPriority="64"/>
+    <w:lsdException w:name="Medium List 1 Accent 2" w:uiPriority="65"/>
+    <w:lsdException w:name="Medium List 2 Accent 2" w:uiPriority="66"/>
+    <w:lsdException w:name="Medium Grid 1 Accent 2" w:uiPriority="67"/>
+    <w:lsdException w:name="Medium Grid 2 Accent 2" w:uiPriority="68"/>
+    <w:lsdException w:name="Medium Grid 3 Accent 2" w:uiPriority="69"/>
+    <w:lsdException w:name="Dark List Accent 2" w:uiPriority="70"/>
+    <w:lsdException w:name="Colorful Shading Accent 2" w:uiPriority="71"/>
+    <w:lsdException w:name="Colorful List Accent 2" w:uiPriority="72"/>
+    <w:lsdException w:name="Colorful Grid Accent 2" w:uiPriority="73"/>
+    <w:lsdException w:name="Light Shading Accent 3" w:uiPriority="60"/>
+    <w:lsdException w:name="Light List Accent 3" w:uiPriority="61"/>
+    <w:lsdException w:name="Light Grid Accent 3" w:uiPriority="62"/>
+    <w:lsdException w:name="Medium Shading 1 Accent 3" w:uiPriority="63"/>
+    <w:lsdException w:name="Medium Shading 2 Accent 3" w:uiPriority="64"/>
+    <w:lsdException w:name="Medium List 1 Accent 3" w:uiPriority="65"/>
+    <w:lsdException w:name="Medium List 2 Accent 3" w:uiPriority="66"/>
+    <w:lsdException w:name="Medium Grid 1 Accent 3" w:uiPriority="67"/>
+    <w:lsdException w:name="Medium Grid 2 Accent 3" w:uiPriority="68"/>
+    <w:lsdException w:name="Medium Grid 3 Accent 3" w:uiPriority="69"/>
+    <w:lsdException w:name="Dark List Accent 3" w:uiPriority="70"/>
+    <w:lsdException w:name="Colorful Shading Accent 3" w:uiPriority="71"/>
+    <w:lsdException w:name="Colorful List Accent 3" w:uiPriority="72"/>
+    <w:lsdException w:name="Colorful Grid Accent 3" w:uiPriority="73"/>
+    <w:lsdException w:name="Light Shading Accent 4" w:uiPriority="60"/>
+    <w:lsdException w:name="Light List Accent 4" w:uiPriority="61"/>
+    <w:lsdException w:name="Light Grid Accent 4" w:uiPriority="62"/>
+    <w:lsdException w:name="Medium Shading 1 Accent 4" w:uiPriority="63"/>
+    <w:lsdException w:name="Medium Shading 2 Accent 4" w:uiPriority="64"/>
+    <w:lsdException w:name="Medium List 1 Accent 4" w:uiPriority="65"/>
+    <w:lsdException w:name="Medium List 2 Accent 4" w:uiPriority="66"/>
+    <w:lsdException w:name="Medium Grid 1 Accent 4" w:uiPriority="67"/>
+    <w:lsdException w:name="Medium Grid 2 Accent 4" w:uiPriority="68"/>
+    <w:lsdException w:name="Medium Grid 3 Accent 4" w:uiPriority="69"/>
+    <w:lsdException w:name="Dark List Accent 4" w:uiPriority="70"/>
+    <w:lsdException w:name="Colorful Shading Accent 4" w:uiPriority="71"/>
+    <w:lsdException w:name="Colorful List Accent 4" w:uiPriority="72"/>
+    <w:lsdException w:name="Colorful Grid Accent 4" w:uiPriority="73"/>
+    <w:lsdException w:name="Light Shading Accent 5" w:uiPriority="60"/>
+    <w:lsdException w:name="Light List Accent 5" w:uiPriority="61"/>
+    <w:lsdException w:name="Light Grid Accent 5" w:uiPriority="62"/>
+    <w:lsdException w:name="Medium Shading 1 Accent 5" w:uiPriority="63"/>
+    <w:lsdException w:name="Medium Shading 2 Accent 5" w:uiPriority="64"/>
+    <w:lsdException w:name="Medium List 1 Accent 5" w:uiPriority="65"/>
+    <w:lsdException w:name="Medium List 2 Accent 5" w:uiPriority="66"/>
+    <w:lsdException w:name="Medium Grid 1 Accent 5" w:uiPriority="67"/>
+    <w:lsdException w:name="Medium Grid 2 Accent 5" w:uiPriority="68"/>
+    <w:lsdException w:name="Medium Grid 3 Accent 5" w:uiPriority="69"/>
+    <w:lsdException w:name="Dark List Accent 5" w:uiPriority="70"/>
+    <w:lsdException w:name="Colorful Shading Accent 5" w:uiPriority="71"/>
+    <w:lsdException w:name="Colorful List Accent 5" w:uiPriority="72"/>
+    <w:lsdException w:name="Colorful Grid Accent 5" w:uiPriority="73"/>
+    <w:lsdException w:name="Light Shading Accent 6" w:uiPriority="60"/>
+    <w:lsdException w:name="Light List Accent 6" w:uiPriority="61"/>
+    <w:lsdException w:name="Light Grid Accent 6" w:uiPriority="62"/>
+    <w:lsdException w:name="Medium Shading 1 Accent 6" w:uiPriority="63"/>
+    <w:lsdException w:name="Medium Shading 2 Accent 6" w:uiPriority="64"/>
+    <w:lsdException w:name="Medium List 1 Accent 6" w:uiPriority="65"/>
+    <w:lsdException w:name="Medium List 2 Accent 6" w:uiPriority="66"/>
+    <w:lsdException w:name="Medium Grid 1 Accent 6" w:uiPriority="67"/>
+    <w:lsdException w:name="Medium Grid 2 Accent 6" w:uiPriority="68"/>
+    <w:lsdException w:name="Medium Grid 3 Accent 6" w:uiPriority="69"/>
+    <w:lsdException w:name="Dark List Accent 6" w:uiPriority="70"/>
+    <w:lsdException w:name="Colorful Shading Accent 6" w:uiPriority="71"/>
+    <w:lsdException w:name="Colorful List Accent 6" w:uiPriority="72"/>
+    <w:lsdException w:name="Colorful Grid Accent 6" w:uiPriority="73"/>
+    <w:lsdException w:name="Subtle Emphasis" w:uiPriority="19" w:qFormat="1"/>
+    <w:lsdException w:name="Intense Emphasis" w:uiPriority="21" w:qFormat="1"/>
+    <w:lsdException w:name="Subtle Reference" w:uiPriority="31" w:qFormat="1"/>
+    <w:lsdException w:name="Intense Reference" w:uiPriority="32" w:qFormat="1"/>
+    <w:lsdException w:name="Book Title" w:uiPriority="33" w:qFormat="1"/>
+    <w:lsdException w:name="Bibliography" w:semiHidden="1" w:uiPriority="37" w:unhideWhenUsed="1"/>
+    <w:lsdException w:name="TOC Heading" w:semiHidden="1" w:uiPriority="39" w:unhideWhenUsed="1" w:qFormat="1"/>
+    <w:lsdException w:name="Plain Table 1" w:uiPriority="41"/>
+    <w:lsdException w:name="Plain Table 2" w:uiPriority="42"/>
+    <w:lsdException w:name="Plain Table 3" w:uiPriority="43"/>
+    <w:lsdException w:name="Plain Table 4" w:uiPriority="44"/>
+    <w:lsdException w:name="Plain Table 5" w:uiPriority="45"/>
+    <w:lsdException w:name="Grid Table Light" w:uiPriority="40"/>
+    <w:lsdException w:name="Grid Table 1 Light" w:uiPriority="46"/>
+    <w:lsdException w:name="Grid Table 2" w:uiPriority="47"/>
+    <w:lsdException w:name="Grid Table 3" w:uiPriority="48"/>
+    <w:lsdException w:name="Grid Table 4" w:uiPriority="49"/>
+    <w:lsdException w:name="Grid Table 5 Dark" w:uiPriority="50"/>
+    <w:lsdException w:name="Grid Table 6 Colorful" w:uiPriority="51"/>
+    <w:lsdException w:name="Grid Table 7 Colorful" w:uiPriority="52"/>
+    <w:lsdException w:name="Grid Table 1 Light Accent 1" w:uiPriority="46"/>
+    <w:lsdException w:name="Grid Table 2 Accent 1" w:uiPriority="47"/>
+    <w:lsdException w:name="Grid Table 3 Accent 1" w:uiPriority="48"/>
+    <w:lsdException w:name="Grid Table 4 Accent 1" w:uiPriority="49"/>
+    <w:lsdException w:name="Grid Table 5 Dark Accent 1" w:uiPriority="50"/>
+    <w:lsdException w:name="Grid Table 6 Colorful Accent 1" w:uiPriority="51"/>
+    <w:lsdException w:name="Grid Table 7 Colorful Accent 1" w:uiPriority="52"/>
+    <w:lsdException w:name="Grid Table 1 Light Accent 2" w:uiPriority="46"/>
+    <w:lsdException w:name="Grid Table 2 Accent 2" w:uiPriority="47"/>
+    <w:lsdException w:name="Grid Table 3 Accent 2" w:uiPriority="48"/>
+    <w:lsdException w:name="Grid Table 4 Accent 2" w:uiPriority="49"/>
+    <w:lsdException w:name="Grid Table 5 Dark Accent 2" w:uiPriority="50"/>
+    <w:lsdException w:name="Grid Table 6 Colorful Accent 2" w:uiPriority="51"/>
+    <w:lsdException w:name="Grid Table 7 Colorful Accent 2" w:uiPriority="52"/>
+    <w:lsdException w:name="Grid Table 1 Light Accent 3" w:uiPriority="46"/>
+    <w:lsdException w:name="Grid Table 2 Accent 3" w:uiPriority="47"/>
+    <w:lsdException w:name="Grid Table 3 Accent 3" w:uiPriority="48"/>
+    <w:lsdException w:name="Grid Table 4 Accent 3" w:uiPriority="49"/>
+    <w:lsdException w:name="Grid Table 5 Dark Accent 3" w:uiPriority="50"/>
+    <w:lsdException w:name="Grid Table 6 Colorful Accent 3" w:uiPriority="51"/>
+    <w:lsdException w:name="Grid Table 7 Colorful Accent 3" w:uiPriority="52"/>
+    <w:lsdException w:name="Grid Table 1 Light Accent 4" w:uiPriority="46"/>
+    <w:lsdException w:name="Grid Table 2 Accent 4" w:uiPriority="47"/>
+    <w:lsdException w:name="Grid Table 3 Accent 4" w:uiPriority="48"/>
+    <w:lsdException w:name="Grid Table 4 Accent 4" w:uiPriority="49"/>
+    <w:lsdException w:name="Grid Table 5 Dark Accent 4" w:uiPriority="50"/>
+    <w:lsdException w:name="Grid Table 6 Colorful Accent 4" w:uiPriority="51"/>
+    <w:lsdException w:name="Grid Table 7 Colorful Accent 4" w:uiPriority="52"/>
+    <w:lsdException w:name="Grid Table 1 Light Accent 5" w:uiPriority="46"/>
+    <w:lsdException w:name="Grid Table 2 Accent 5" w:uiPriority="47"/>
+    <w:lsdException w:name="Grid Table 3 Accent 5" w:uiPriority="48"/>
+    <w:lsdException w:name="Grid Table 4 Accent 5" w:uiPriority="49"/>
+    <w:lsdException w:name="Grid Table 5 Dark Accent 5" w:uiPriority="50"/>
+    <w:lsdException w:name="Grid Table 6 Colorful Accent 5" w:uiPriority="51"/>
+    <w:lsdException w:name="Grid Table 7 Colorful Accent 5" w:uiPriority="52"/>
+    <w:lsdException w:name="Grid Table 1 Light Accent 6" w:uiPriority="46"/>
+    <w:lsdException w:name="Grid Table 2 Accent 6" w:uiPriority="47"/>
+    <w:lsdException w:name="Grid Table 3 Accent 6" w:uiPriority="48"/>
+    <w:lsdException w:name="Grid Table 4 Accent 6" w:uiPriority="49"/>
+    <w:lsdException w:name="Grid Table 5 Dark Accent 6" w:uiPriority="50"/>
+    <w:lsdException w:name="Grid Table 6 Colorful Accent 6" w:uiPriority="51"/>
+    <w:lsdException w:name="Grid Table 7 Colorful Accent 6" w:uiPriority="52"/>
+    <w:lsdException w:name="List Table 1 Light" w:uiPriority="46"/>
+    <w:lsdException w:name="List Table 2" w:uiPriority="47"/>
+    <w:lsdException w:name="List Table 3" w:uiPriority="48"/>
+    <w:lsdException w:name="List Table 4" w:uiPriority="49"/>
+    <w:lsdException w:name="List Table 5 Dark" w:uiPriority="50"/>
+    <w:lsdException w:name="List Table 6 Colorful" w:uiPriority="51"/>
+    <w:lsdException w:name="List Table 7 Colorful" w:uiPriority="52"/>
+    <w:lsdException w:name="List Table 1 Light Accent 1" w:uiPriority="46"/>
+    <w:lsdException w:name="List Table 2 Accent 1" w:uiPriority="47"/>
+    <w:lsdException w:name="List Table 3 Accent 1" w:uiPriority="48"/>
+    <w:lsdException w:name="List Table 4 Accent 1" w:uiPriority="49"/>
+    <w:lsdException w:name="List Table 5 Dark Accent 1" w:uiPriority="50"/>
+    <w:lsdException w:name="List Table 6 Colorful Accent 1" w:uiPriority="51"/>
+    <w:lsdException w:name="List Table 7 Colorful Accent 1" w:uiPriority="52"/>
+    <w:lsdException w:name="List Table 1 Light Accent 2" w:uiPriority="46"/>
+    <w:lsdException w:name="List Table 2 Accent 2" w:uiPriority="47"/>
+    <w:lsdException w:name="List Table 3 Accent 2" w:uiPriority="48"/>
+    <w:lsdException w:name="List Table 4 Accent 2" w:uiPriority="49"/>
+    <w:lsdException w:name="List Table 5 Dark Accent 2" w:uiPriority="50"/>
+    <w:lsdException w:name="List Table 6 Colorful Accent 2" w:uiPriority="51"/>
+    <w:lsdException w:name="List Table 7 Colorful Accent 2" w:uiPriority="52"/>
+    <w:lsdException w:name="List Table 1 Light Accent 3" w:uiPriority="46"/>
+    <w:lsdException w:name="List Table 2 Accent 3" w:uiPriority="47"/>
+    <w:lsdException w:name="List Table 3 Accent 3" w:uiPriority="48"/>
+    <w:lsdException w:name="List Table 4 Accent 3" w:uiPriority="49"/>
+    <w:lsdException w:name="List Table 5 Dark Accent 3" w:uiPriority="50"/>
+    <w:lsdException w:name="List Table 6 Colorful Accent 3" w:uiPriority="51"/>
+    <w:lsdException w:name="List Table 7 Colorful Accent 3" w:uiPriority="52"/>
+    <w:lsdException w:name="List Table 1 Light Accent 4" w:uiPriority="46"/>
+    <w:lsdException w:name="List Table 2 Accent 4" w:uiPriority="47"/>
+    <w:lsdException w:name="List Table 3 Accent 4" w:uiPriority="48"/>
+    <w:lsdException w:name="List Table 4 Accent 4" w:uiPriority="49"/>
+    <w:lsdException w:name="List Table 5 Dark Accent 4" w:uiPriority="50"/>
+    <w:lsdException w:name="List Table 6 Colorful Accent 4" w:uiPriority="51"/>
+    <w:lsdException w:name="List Table 7 Colorful Accent 4" w:uiPriority="52"/>
+    <w:lsdException w:name="List Table 1 Light Accent 5" w:uiPriority="46"/>
+    <w:lsdException w:name="List Table 2 Accent 5" w:uiPriority="47"/>
+    <w:lsdException w:name="List Table 3 Accent 5" w:uiPriority="48"/>
+    <w:lsdException w:name="List Table 4 Accent 5" w:uiPriority="49"/>
+    <w:lsdException w:name="List Table 5 Dark Accent 5" w:uiPriority="50"/>
+    <w:lsdException w:name="List Table 6 Colorful Accent 5" w:uiPriority="51"/>
+    <w:lsdException w:name="List Table 7 Colorful Accent 5" w:uiPriority="52"/>
+    <w:lsdException w:name="List Table 1 Light Accent 6" w:uiPriority="46"/>
+    <w:lsdException w:name="List Table 2 Accent 6" w:uiPriority="47"/>
+    <w:lsdException w:name="List Table 3 Accent 6" w:uiPriority="48"/>
+    <w:lsdException w:name="List Table 4 Accent 6" w:uiPriority="49"/>
+    <w:lsdException w:name="List Table 5 Dark Accent 6" w:uiPriority="50"/>
+    <w:lsdException w:name="List Table 6 Colorful Accent 6" w:uiPriority="51"/>
+    <w:lsdException w:name="List Table 7 Colorful Accent 6" w:uiPriority="52"/>
+    <w:lsdException w:name="Mention" w:semiHidden="1" w:unhideWhenUsed="1"/>
+    <w:lsdException w:name="Smart Hyperlink" w:semiHidden="1" w:unhideWhenUsed="1"/>
+    <w:lsdException w:name="Hashtag" w:semiHidden="1" w:unhideWhenUsed="1"/>
+    <w:lsdException w:name="Unresolved Mention" w:semiHidden="1" w:unhideWhenUsed="1"/>
+    <w:lsdException w:name="Smart Link" w:semiHidden="1" w:unhideWhenUsed="1"/>
+  </w:latentStyles>
+  <w:style w:type="paragraph" w:default="1" w:styleId="Normal">
+    <w:name w:val="Normal"/>
+    <w:qFormat/>
+  </w:style>
+  <w:style w:type="character" w:default="1" w:styleId="DefaultParagraphFont">
+    <w:name w:val="Default Paragraph Font"/>
+    <w:uiPriority w:val="1"/>
+    <w:semiHidden/>
+    <w:unhideWhenUsed/>
+  </w:style>
+  <w:style w:type="table" w:default="1" w:styleId="TableNormal">
+    <w:name w:val="Normal Table"/>
+    <w:uiPriority w:val="99"/>
+    <w:semiHidden/>
+    <w:unhideWhenUsed/>
+    <w:tblPr>
+      <w:tblInd w:w="0" w:type="dxa"/>
+      <w:tblCellMar>
+        <w:top w:w="0" w:type="dxa"/>
+        <w:left w:w="108" w:type="dxa"/>
+        <w:bottom w:w="0" w:type="dxa"/>
+        <w:right w:w="108" w:type="dxa"/>
+      </w:tblCellMar>
+    </w:tblPr>
+  </w:style>
+  <w:style w:type="numbering" w:default="1" w:styleId="NoList">
+    <w:name w:val="No List"/>
+    <w:uiPriority w:val="99"/>
+    <w:semiHidden/>
+    <w:unhideWhenUsed/>
+  </w:style>
+  <w:style w:type="character" w:styleId="PlaceholderText">
+    <w:name w:val="Placeholder Text"/>
+    <w:basedOn w:val="DefaultParagraphFont"/>
+    <w:uiPriority w:val="99"/>
+    <w:semiHidden/>
+    <w:rsid w:val="00457BB0"/>
+    <w:rPr>
+      <w:color w:val="666666"/>
+    </w:rPr>
+  </w:style>
+</w:styles>
+</file>
+
+<file path=word/glossary/webSettings.xml><?xml version="1.0" encoding="utf-8"?>
+<w:webSettings xmlns:mc="http://schemas.openxmlformats.org/markup-compatibility/2006" xmlns:r="http://schemas.openxmlformats.org/officeDocument/2006/relationships" xmlns:w="http://schemas.openxmlformats.org/wordprocessingml/2006/main" xmlns:w14="http://schemas.microsoft.com/office/word/2010/wordml" xmlns:w15="http://schemas.microsoft.com/office/word/2012/wordml" xmlns:w16cex="http://schemas.microsoft.com/office/word/2018/wordml/cex" xmlns:w16cid="http://schemas.microsoft.com/office/word/2016/wordml/cid" xmlns:w16="http://schemas.microsoft.com/office/word/2018/wordml" xmlns:w16du="http://schemas.microsoft.com/office/word/2023/wordml/word16du" xmlns:w16sdtdh="http://schemas.microsoft.com/office/word/2020/wordml/sdtdatahash" xmlns:w16sdtfl="http://schemas.microsoft.com/office/word/2024/wordml/sdtformatlock" xmlns:w16se="http://schemas.microsoft.com/office/word/2015/wordml/symex" mc:Ignorable="w14 w15 w16se w16cid w16 w16cex w16sdtdh w16sdtfl w16du">
+  <w:optimizeForBrowser/>
+  <w:allowPNG/>
+</w:webSettings>
+</file>
+
 <file path=word/theme/theme1.xml><?xml version="1.0" encoding="utf-8"?>
 <a:theme xmlns:a="http://schemas.openxmlformats.org/drawingml/2006/main" name="Office Theme">
   <a:themeElements>
@@ -962,7 +1682,9 @@
 </a:theme>
 </file>
 
-<file path=customXml/item1.xml>��< ? x m l   v e r s i o n = " 1 . 0 "   e n c o d i n g = " u t f - 1 6 " ? > < N a v W o r d R e p o r t X m l P a r t   x m l n s = " u r n : m i c r o s o f t - d y n a m i c s - n a v / r e p o r t s / C e r t i f i c a t e / 5 0 2 0 0 / " > +<file path=customXml/item1.xml>��< ? x m l   v e r s i o n = " 1 . 0 "   e n c o d i n g = " u t f - 1 6 " ? > + 
+ < N a v W o r d R e p o r t X m l P a r t   x m l n s = " u r n : m i c r o s o f t - d y n a m i c s - n a v / r e p o r t s / C e r t i f i c a t e / 5 0 2 0 0 / " >   
      < B C R e p o r t I n f o r m a t i o n >   
@@ -1028,32 +1750,36 @@
  
      < / B C R e p o r t I n f o r m a t i o n >   
-     < S a f e t y C e r t i f i c a t e > - 
-         < C e r t i f i c a t e N o > C e r t i f i c a t e N o < / C e r t i f i c a t e N o > - 
-         < C u s t o m e r N a m e > C u s t o m e r N a m e < / C u s t o m e r N a m e > - 
-         < C u s t o m e r N o > C u s t o m e r N o < / C u s t o m e r N o > - 
-         < D a t e O f S a l e > D a t e O f S a l e < / D a t e O f S a l e > - 
-         < E n t r y N o > E n t r y N o < / E n t r y N o > - 
-         < M a n u f a c t u r e r > M a n u f a c t u r e r < / M a n u f a c t u r e r > - 
-         < P r o d u c t N a m e > P r o d u c t N a m e < / P r o d u c t N a m e > - 
-         < S a l e s O r d e r N o > S a l e s O r d e r N o < / S a l e s O r d e r N o > - 
-         < V a l i d T o > V a l i d T o < / V a l i d T o > - 
-     < / S a f e t y C e r t i f i c a t e > +     < S a l e s I n v o i c e H e a d e r > + 
+         < S a l e s I n v o i c e L i n e > + 
+             < C e r t i f i c a t e N o > C e r t i f i c a t e N o < / C e r t i f i c a t e N o > + 
+             < C u s t o m e r N a m e > C u s t o m e r N a m e < / C u s t o m e r N a m e > + 
+             < C u s t o m e r N o > C u s t o m e r N o < / C u s t o m e r N o > + 
+             < D a t e O f S a l e > D a t e O f S a l e < / D a t e O f S a l e > + 
+             < M a n u f a c t u r e r > M a n u f a c t u r e r < / M a n u f a c t u r e r > + 
+             < P r o d u c t N a m e > P r o d u c t N a m e < / P r o d u c t N a m e > + 
+             < S a l e s O r d e r N o > S a l e s O r d e r N o < / S a l e s O r d e r N o > + 
+             < V a l i d T o > V a l i d T o < / V a l i d T o > + 
+         < / S a l e s I n v o i c e L i n e > + 
+     < / S a l e s I n v o i c e H e a d e r >   
  < / N a v W o r d R e p o r t X m l P a r t > 
 </file>
 
-<file path=customXml/item2.xml>��< ? x m l   v e r s i o n = " 1 . 0 "   e n c o d i n g = " u t f - 1 6 " ? > < N a v W o r d R e p o r t X m l P a r t   x m l n s = " u r n : m i c r o s o f t - d y n a m i c s - b u s i n e s s c e n t r a l / i n t e r n a l / e x t e n d e d / r e p o r t s / C e r t i f i c a t e / 5 0 2 0 0 / " > +<file path=customXml/item2.xml>��< ? x m l   v e r s i o n = " 1 . 0 "   e n c o d i n g = " u t f - 1 6 " ? > + 
+ < N a v W o r d R e p o r t X m l P a r t   x m l n s = " u r n : m i c r o s o f t - d y n a m i c s - b u s i n e s s c e n t r a l / i n t e r n a l / e x t e n d e d / r e p o r t s / C e r t i f i c a t e / 5 0 2 0 0 / " >   
      < B C R e p o r t I n f o r m a t i o n >   
@@ -1119,29 +1845,39 @@
  
      < / B C R e p o r t I n f o r m a t i o n >   
-     < T o o l t i p s / > - 
-     < S a f e t y C e r t i f i c a t e   E l e m e n t T y p e = " D a t a I t e m "   E l e m e n t I d = " 1 2 4 9 7 3 1 6 0 4 " > - 
-         < C e r t i f i c a t e N o   E l e m e n t T y p e = " C o l u m n "   E l e m e n t I d = " 1 5 9 2 1 1 5 9 2 9 "   D a t a T y p e = " C o d e " > C e r t i f i c a t e N o < / C e r t i f i c a t e N o > - 
-         < C u s t o m e r N a m e   E l e m e n t T y p e = " C o l u m n "   E l e m e n t I d = " 2 6 5 4 9 6 8 2 6 "   D a t a T y p e = " T e x t " > C u s t o m e r N a m e < / C u s t o m e r N a m e > - 
-         < C u s t o m e r N o   E l e m e n t T y p e = " C o l u m n "   E l e m e n t I d = " 1 5 4 2 0 5 1 5 6 0 "   D a t a T y p e = " C o d e " > C u s t o m e r N o < / C u s t o m e r N o > - 
-         < D a t e O f S a l e   E l e m e n t T y p e = " C o l u m n "   E l e m e n t I d = " 2 0 0 9 4 8 9 9 1 7 "   D a t a T y p e = " D a t e " > D a t e O f S a l e < / D a t e O f S a l e > - 
-         < E n t r y N o   E l e m e n t T y p e = " C o l u m n "   E l e m e n t I d = " 1 1 3 1 3 5 3 5 3 6 "   D a t a T y p e = " I n t e g e r " > E n t r y N o < / E n t r y N o > - 
-         < M a n u f a c t u r e r   E l e m e n t T y p e = " C o l u m n "   E l e m e n t I d = " 1 4 9 9 6 4 4 9 0 6 "   D a t a T y p e = " T e x t " > M a n u f a c t u r e r < / M a n u f a c t u r e r > - 
-         < P r o d u c t N a m e   E l e m e n t T y p e = " C o l u m n "   E l e m e n t I d = " 6 2 5 7 4 8 3 9 9 "   D a t a T y p e = " T e x t " > P r o d u c t N a m e < / P r o d u c t N a m e > - 
-         < S a l e s O r d e r N o   E l e m e n t T y p e = " C o l u m n "   E l e m e n t I d = " 5 8 7 0 2 0 7 5 4 "   D a t a T y p e = " C o d e " > S a l e s O r d e r N o < / S a l e s O r d e r N o > - 
-         < V a l i d T o   E l e m e n t T y p e = " C o l u m n "   E l e m e n t I d = " 1 8 4 9 2 0 4 3 4 4 "   D a t a T y p e = " D a t e " > V a l i d T o < / V a l i d T o > - 
-     < / S a f e t y C e r t i f i c a t e > +     < T o o l t i p s > + 
+         < T o o l t i p   c o l u m n = " C u s t o m e r N o "   E l e m e n t I d = " 1 5 4 2 0 5 1 5 6 0 " > + 
+             < T o o l t i p T e x t   l a n g = " e n - U S " > S p e c i f i e s   t h e   n u m b e r   o f   t h e   c u s t o m e r   t h a t   y o u   s h i p p e d   t h e   i t e m s   o n   t h e   i n v o i c e   t o . < / T o o l t i p T e x t > + 
+         < / T o o l t i p > + 
+     < / T o o l t i p s > + 
+     < S a l e s I n v o i c e H e a d e r   E l e m e n t T y p e = " D a t a I t e m "   E l e m e n t I d = " 8 1 1 7 7 1 2 1 3 " > + 
+         < S a l e s I n v o i c e L i n e   E l e m e n t T y p e = " D a t a I t e m "   E l e m e n t I d = " 5 2 5 7 7 7 4 9 8 " > + 
+             < C e r t i f i c a t e N o   E l e m e n t T y p e = " C o l u m n "   E l e m e n t I d = " 1 5 9 2 1 1 5 9 2 9 "   D a t a T y p e = " C o d e " > C e r t i f i c a t e N o < / C e r t i f i c a t e N o > + 
+             < C u s t o m e r N a m e   E l e m e n t T y p e = " C o l u m n "   E l e m e n t I d = " 2 6 5 4 9 6 8 2 6 "   D a t a T y p e = " T e x t " > C u s t o m e r N a m e < / C u s t o m e r N a m e > + 
+             < C u s t o m e r N o   E l e m e n t T y p e = " C o l u m n "   E l e m e n t I d = " 1 5 4 2 0 5 1 5 6 0 "   D a t a T y p e = " C o d e " > C u s t o m e r N o < / C u s t o m e r N o > + 
+             < D a t e O f S a l e   E l e m e n t T y p e = " C o l u m n "   E l e m e n t I d = " 2 0 0 9 4 8 9 9 1 7 "   D a t a T y p e = " D a t e " > D a t e O f S a l e < / D a t e O f S a l e > + 
+             < M a n u f a c t u r e r   E l e m e n t T y p e = " C o l u m n "   E l e m e n t I d = " 1 4 9 9 6 4 4 9 0 6 "   D a t a T y p e = " T e x t " > M a n u f a c t u r e r < / M a n u f a c t u r e r > + 
+             < P r o d u c t N a m e   E l e m e n t T y p e = " C o l u m n "   E l e m e n t I d = " 6 2 5 7 4 8 3 9 9 "   D a t a T y p e = " T e x t " > P r o d u c t N a m e < / P r o d u c t N a m e > + 
+             < S a l e s O r d e r N o   E l e m e n t T y p e = " C o l u m n "   E l e m e n t I d = " 5 8 7 0 2 0 7 5 4 "   D a t a T y p e = " C o d e " > S a l e s O r d e r N o < / S a l e s O r d e r N o > + 
+             < V a l i d T o   E l e m e n t T y p e = " C o l u m n "   E l e m e n t I d = " 1 8 4 9 2 0 4 3 4 4 "   D a t a T y p e = " D a t e " > V a l i d T o < / V a l i d T o > + 
+         < / S a l e s I n v o i c e L i n e > + 
+     < / S a l e s I n v o i c e H e a d e r >   
  < / N a v W o r d R e p o r t X m l P a r t > 
 </file>

</xml_diff>

<commit_message>
Refactors certificate generation process
Updates the certificate generation process to handle all items with certificates in a sales invoice, instead of requiring a specific item selection.
This change simplifies the user experience and ensures all relevant items are included in the certificate.
It also modifies the action on the Posted Sales Invoice page to work without a selected line, improving usability.
</commit_message>
<xml_diff>
--- a/Certificate.docx
+++ b/Certificate.docx
@@ -1,6 +1,6 @@
 
 <file path=word/document.xml><?xml version="1.0" encoding="utf-8"?>
-<w:document xmlns:a="http://schemas.openxmlformats.org/drawingml/2006/main" xmlns:pic="http://schemas.openxmlformats.org/drawingml/2006/picture" xmlns:a14="http://schemas.microsoft.com/office/drawing/2010/main" xmlns:wpc="http://schemas.microsoft.com/office/word/2010/wordprocessingCanvas" xmlns:cx="http://schemas.microsoft.com/office/drawing/2014/chartex" xmlns:cx1="http://schemas.microsoft.com/office/drawing/2015/9/8/chartex" xmlns:cx2="http://schemas.microsoft.com/office/drawing/2015/10/21/chartex" xmlns:cx3="http://schemas.microsoft.com/office/drawing/2016/5/9/chartex" xmlns:cx4="http://schemas.microsoft.com/office/drawing/2016/5/10/chartex" xmlns:cx5="http://schemas.microsoft.com/office/drawing/2016/5/11/chartex" xmlns:cx6="http://schemas.microsoft.com/office/drawing/2016/5/12/chartex" xmlns:cx7="http://schemas.microsoft.com/office/drawing/2016/5/13/chartex" xmlns:cx8="http://schemas.microsoft.com/office/drawing/2016/5/14/chartex" xmlns:mc="http://schemas.openxmlformats.org/markup-compatibility/2006" xmlns:aink="http://schemas.microsoft.com/office/drawing/2016/ink" xmlns:am3d="http://schemas.microsoft.com/office/drawing/2017/model3d" xmlns:o="urn:schemas-microsoft-com:office:office" xmlns:oel="http://schemas.microsoft.com/office/2019/extlst" xmlns:r="http://schemas.openxmlformats.org/officeDocument/2006/relationships" xmlns:m="http://schemas.openxmlformats.org/officeDocument/2006/math" xmlns:v="urn:schemas-microsoft-com:vml" xmlns:wp14="http://schemas.microsoft.com/office/word/2010/wordprocessingDrawing" xmlns:wp="http://schemas.openxmlformats.org/drawingml/2006/wordprocessingDrawing" xmlns:w10="urn:schemas-microsoft-com:office:word" xmlns:w="http://schemas.openxmlformats.org/wordprocessingml/2006/main" xmlns:w14="http://schemas.microsoft.com/office/word/2010/wordml" xmlns:w15="http://schemas.microsoft.com/office/word/2012/wordml" xmlns:w16cex="http://schemas.microsoft.com/office/word/2018/wordml/cex" xmlns:w16cid="http://schemas.microsoft.com/office/word/2016/wordml/cid" xmlns:w16="http://schemas.microsoft.com/office/word/2018/wordml" xmlns:w16du="http://schemas.microsoft.com/office/word/2023/wordml/word16du" xmlns:w16sdtdh="http://schemas.microsoft.com/office/word/2020/wordml/sdtdatahash" xmlns:w16sdtfl="http://schemas.microsoft.com/office/word/2024/wordml/sdtformatlock" xmlns:w16se="http://schemas.microsoft.com/office/word/2015/wordml/symex" xmlns:wpg="http://schemas.microsoft.com/office/word/2010/wordprocessingGroup" xmlns:wpi="http://schemas.microsoft.com/office/word/2010/wordprocessingInk" xmlns:wne="http://schemas.microsoft.com/office/word/2006/wordml" xmlns:wps="http://schemas.microsoft.com/office/word/2010/wordprocessingShape" mc:Ignorable="w14 w15 w16se w16cid w16 w16cex w16sdtdh w16sdtfl w16du wp14">
+<w:document xmlns:wpc="http://schemas.microsoft.com/office/word/2010/wordprocessingCanvas" xmlns:cx="http://schemas.microsoft.com/office/drawing/2014/chartex" xmlns:cx1="http://schemas.microsoft.com/office/drawing/2015/9/8/chartex" xmlns:cx2="http://schemas.microsoft.com/office/drawing/2015/10/21/chartex" xmlns:cx3="http://schemas.microsoft.com/office/drawing/2016/5/9/chartex" xmlns:cx4="http://schemas.microsoft.com/office/drawing/2016/5/10/chartex" xmlns:cx5="http://schemas.microsoft.com/office/drawing/2016/5/11/chartex" xmlns:cx6="http://schemas.microsoft.com/office/drawing/2016/5/12/chartex" xmlns:cx7="http://schemas.microsoft.com/office/drawing/2016/5/13/chartex" xmlns:cx8="http://schemas.microsoft.com/office/drawing/2016/5/14/chartex" xmlns:mc="http://schemas.openxmlformats.org/markup-compatibility/2006" xmlns:aink="http://schemas.microsoft.com/office/drawing/2016/ink" xmlns:am3d="http://schemas.microsoft.com/office/drawing/2017/model3d" xmlns:o="urn:schemas-microsoft-com:office:office" xmlns:oel="http://schemas.microsoft.com/office/2019/extlst" xmlns:r="http://schemas.openxmlformats.org/officeDocument/2006/relationships" xmlns:m="http://schemas.openxmlformats.org/officeDocument/2006/math" xmlns:v="urn:schemas-microsoft-com:vml" xmlns:wp14="http://schemas.microsoft.com/office/word/2010/wordprocessingDrawing" xmlns:wp="http://schemas.openxmlformats.org/drawingml/2006/wordprocessingDrawing" xmlns:w10="urn:schemas-microsoft-com:office:word" xmlns:w="http://schemas.openxmlformats.org/wordprocessingml/2006/main" xmlns:w14="http://schemas.microsoft.com/office/word/2010/wordml" xmlns:w15="http://schemas.microsoft.com/office/word/2012/wordml" xmlns:w16cex="http://schemas.microsoft.com/office/word/2018/wordml/cex" xmlns:w16cid="http://schemas.microsoft.com/office/word/2016/wordml/cid" xmlns:w16="http://schemas.microsoft.com/office/word/2018/wordml" xmlns:w16du="http://schemas.microsoft.com/office/word/2023/wordml/word16du" xmlns:w16sdtdh="http://schemas.microsoft.com/office/word/2020/wordml/sdtdatahash" xmlns:w16sdtfl="http://schemas.microsoft.com/office/word/2024/wordml/sdtformatlock" xmlns:w16se="http://schemas.microsoft.com/office/word/2015/wordml/symex" xmlns:wpg="http://schemas.microsoft.com/office/word/2010/wordprocessingGroup" xmlns:wpi="http://schemas.microsoft.com/office/word/2010/wordprocessingInk" xmlns:wne="http://schemas.microsoft.com/office/word/2006/wordml" xmlns:wps="http://schemas.microsoft.com/office/word/2010/wordprocessingShape" mc:Ignorable="w14 w15 w16se w16cid w16 w16cex w16sdtdh w16sdtfl w16du wp14">
   <w:body>
     <w:p>
       <w:r>
@@ -109,6 +109,7 @@
       <w:r>
         <w:t>Date of Sale: </w:t>
       </w:r>
+      <w:proofErr w:type="spellStart"/>
       <w:sdt>
         <w:sdtPr>
           <w:alias w:val="#Nav: /SalesInvoiceHeader/SalesInvoiceLine/DateOfSale"/>
@@ -124,6 +125,7 @@
           <w:r>
             <w:t>DateOfSale</w:t>
           </w:r>
+          <w:proofErr w:type="spellEnd"/>
         </w:sdtContent>
       </w:sdt>
     </w:p>
@@ -139,19 +141,21 @@
       </w:r>
       <w:sdt>
         <w:sdtPr>
+          <w:alias w:val="#Nav: /SalesInvoiceHeader/SalesInvoiceLine/SalesOrderNo"/>
+          <w:tag w:val="#Nav: Certificate/50200"/>
           <w:id w:val="158433671"/>
           <w:placeholder>
             <w:docPart w:val="DefaultPlaceholder_-1854013440"/>
           </w:placeholder>
           <w:dataBinding w:prefixMappings="xmlns:ns0='urn:microsoft-dynamics-nav/reports/Certificate/50200/' " w:xpath="/ns0:NavWordReportXmlPart[1]/ns0:SalesInvoiceHeader[1]/ns0:SalesInvoiceLine[1]/ns0:SalesOrderNo[1]" w:storeItemID="{6A36634F-392F-4F9D-A102-FC53C401238A}"/>
           <w:text/>
-          <w:alias w:val="#Nav: /SalesInvoiceHeader/SalesInvoiceLine/SalesOrderNo"/>
-          <w:tag w:val="#Nav: Certificate/50200"/>
         </w:sdtPr>
         <w:sdtContent>
+          <w:proofErr w:type="spellStart"/>
           <w:r>
             <w:t>SalesOrderNo</w:t>
           </w:r>
+          <w:proofErr w:type="spellEnd"/>
         </w:sdtContent>
       </w:sdt>
     </w:p>
@@ -160,210 +164,299 @@
         <w:t> </w:t>
       </w:r>
     </w:p>
+    <w:tbl>
+      <w:tblPr>
+        <w:tblStyle w:val="TableGrid"/>
+        <w:tblW w:w="0" w:type="auto"/>
+        <w:tblLook w:val="04A0" w:firstRow="1" w:lastRow="0" w:firstColumn="1" w:lastColumn="0" w:noHBand="0" w:noVBand="1"/>
+      </w:tblPr>
+      <w:tblGrid>
+        <w:gridCol w:w="2407"/>
+        <w:gridCol w:w="2407"/>
+        <w:gridCol w:w="2407"/>
+        <w:gridCol w:w="2407"/>
+      </w:tblGrid>
+      <w:tr>
+        <w:tc>
+          <w:tcPr>
+            <w:tcW w:w="2407" w:type="dxa"/>
+            <w:tcBorders>
+              <w:top w:val="nil"/>
+              <w:left w:val="nil"/>
+            </w:tcBorders>
+          </w:tcPr>
+          <w:p>
+            <w:pPr>
+              <w:jc w:val="center"/>
+              <w:rPr>
+                <w:b/>
+                <w:bCs/>
+              </w:rPr>
+            </w:pPr>
+            <w:r>
+              <w:rPr>
+                <w:b/>
+                <w:bCs/>
+              </w:rPr>
+              <w:t>Product Name</w:t>
+            </w:r>
+          </w:p>
+        </w:tc>
+        <w:tc>
+          <w:tcPr>
+            <w:tcW w:w="2407" w:type="dxa"/>
+            <w:tcBorders>
+              <w:top w:val="nil"/>
+            </w:tcBorders>
+          </w:tcPr>
+          <w:p>
+            <w:pPr>
+              <w:jc w:val="center"/>
+              <w:rPr>
+                <w:b/>
+                <w:bCs/>
+              </w:rPr>
+            </w:pPr>
+            <w:r>
+              <w:rPr>
+                <w:b/>
+                <w:bCs/>
+              </w:rPr>
+              <w:t>Manufacturer</w:t>
+            </w:r>
+          </w:p>
+        </w:tc>
+        <w:tc>
+          <w:tcPr>
+            <w:tcW w:w="2407" w:type="dxa"/>
+            <w:tcBorders>
+              <w:top w:val="nil"/>
+            </w:tcBorders>
+          </w:tcPr>
+          <w:p>
+            <w:pPr>
+              <w:jc w:val="center"/>
+              <w:rPr>
+                <w:b/>
+                <w:bCs/>
+              </w:rPr>
+            </w:pPr>
+            <w:r>
+              <w:rPr>
+                <w:b/>
+                <w:bCs/>
+              </w:rPr>
+              <w:t>Certificate No.</w:t>
+            </w:r>
+          </w:p>
+        </w:tc>
+        <w:tc>
+          <w:tcPr>
+            <w:tcW w:w="2407" w:type="dxa"/>
+            <w:tcBorders>
+              <w:top w:val="nil"/>
+              <w:right w:val="nil"/>
+            </w:tcBorders>
+          </w:tcPr>
+          <w:p>
+            <w:pPr>
+              <w:jc w:val="center"/>
+              <w:rPr>
+                <w:b/>
+                <w:bCs/>
+              </w:rPr>
+            </w:pPr>
+            <w:r>
+              <w:rPr>
+                <w:b/>
+                <w:bCs/>
+              </w:rPr>
+              <w:t>Valid To</w:t>
+            </w:r>
+          </w:p>
+        </w:tc>
+      </w:tr>
+      <w:sdt>
+        <w:sdtPr>
+          <w:alias w:val="#Nav: /SalesInvoiceHeader/SalesInvoiceLine"/>
+          <w:tag w:val="#Nav: Certificate/50200"/>
+          <w:id w:val="-1039435828"/>
+          <w15:dataBinding w:prefixMappings="xmlns:ns0='urn:microsoft-dynamics-nav/reports/Certificate/50200/' " w:xpath="/ns0:NavWordReportXmlPart[1]/ns0:SalesInvoiceHeader[1]/ns0:SalesInvoiceLine" w:storeItemID="{6A36634F-392F-4F9D-A102-FC53C401238A}"/>
+          <w15:repeatingSection/>
+        </w:sdtPr>
+        <w:sdtContent>
+          <w:sdt>
+            <w:sdtPr>
+              <w:id w:val="506097931"/>
+              <w:placeholder>
+                <w:docPart w:val="DefaultPlaceholder_-1854013435"/>
+              </w:placeholder>
+              <w15:repeatingSectionItem/>
+            </w:sdtPr>
+            <w:sdtContent>
+              <w:tr>
+                <w:sdt>
+                  <w:sdtPr>
+                    <w:alias w:val="#Nav: /SalesInvoiceHeader/SalesInvoiceLine/ProductName"/>
+                    <w:tag w:val="#Nav: Certificate/50200"/>
+                    <w:id w:val="1567990360"/>
+                    <w:placeholder>
+                      <w:docPart w:val="DefaultPlaceholder_-1854013440"/>
+                    </w:placeholder>
+                    <w:dataBinding w:prefixMappings="xmlns:ns0='urn:microsoft-dynamics-nav/reports/Certificate/50200/' " w:xpath="/ns0:NavWordReportXmlPart[1]/ns0:SalesInvoiceHeader[1]/ns0:SalesInvoiceLine[1]/ns0:ProductName[1]" w:storeItemID="{6A36634F-392F-4F9D-A102-FC53C401238A}"/>
+                    <w:text/>
+                  </w:sdtPr>
+                  <w:sdtContent>
+                    <w:tc>
+                      <w:tcPr>
+                        <w:tcW w:w="2407" w:type="dxa"/>
+                      </w:tcPr>
+                      <w:p>
+                        <w:pPr>
+                          <w:jc w:val="center"/>
+                        </w:pPr>
+                        <w:r>
+                          <w:t>ProductName</w:t>
+                        </w:r>
+                      </w:p>
+                    </w:tc>
+                  </w:sdtContent>
+                </w:sdt>
+                <w:sdt>
+                  <w:sdtPr>
+                    <w:alias w:val="#Nav: /SalesInvoiceHeader/SalesInvoiceLine/Manufacturer"/>
+                    <w:tag w:val="#Nav: Certificate/50200"/>
+                    <w:id w:val="326865873"/>
+                    <w:placeholder>
+                      <w:docPart w:val="DefaultPlaceholder_-1854013440"/>
+                    </w:placeholder>
+                    <w:dataBinding w:prefixMappings="xmlns:ns0='urn:microsoft-dynamics-nav/reports/Certificate/50200/' " w:xpath="/ns0:NavWordReportXmlPart[1]/ns0:SalesInvoiceHeader[1]/ns0:SalesInvoiceLine[1]/ns0:Manufacturer[1]" w:storeItemID="{6A36634F-392F-4F9D-A102-FC53C401238A}"/>
+                    <w:text/>
+                  </w:sdtPr>
+                  <w:sdtContent>
+                    <w:tc>
+                      <w:tcPr>
+                        <w:tcW w:w="2407" w:type="dxa"/>
+                      </w:tcPr>
+                      <w:p>
+                        <w:pPr>
+                          <w:jc w:val="center"/>
+                        </w:pPr>
+                        <w:r>
+                          <w:t>Manufacturer</w:t>
+                        </w:r>
+                      </w:p>
+                    </w:tc>
+                  </w:sdtContent>
+                </w:sdt>
+                <w:sdt>
+                  <w:sdtPr>
+                    <w:alias w:val="#Nav: /SalesInvoiceHeader/SalesInvoiceLine/CertificateNo"/>
+                    <w:tag w:val="#Nav: Certificate/50200"/>
+                    <w:id w:val="1443579366"/>
+                    <w:placeholder>
+                      <w:docPart w:val="DefaultPlaceholder_-1854013440"/>
+                    </w:placeholder>
+                    <w:dataBinding w:prefixMappings="xmlns:ns0='urn:microsoft-dynamics-nav/reports/Certificate/50200/' " w:xpath="/ns0:NavWordReportXmlPart[1]/ns0:SalesInvoiceHeader[1]/ns0:SalesInvoiceLine[1]/ns0:CertificateNo[1]" w:storeItemID="{6A36634F-392F-4F9D-A102-FC53C401238A}"/>
+                    <w:text/>
+                  </w:sdtPr>
+                  <w:sdtContent>
+                    <w:tc>
+                      <w:tcPr>
+                        <w:tcW w:w="2407" w:type="dxa"/>
+                      </w:tcPr>
+                      <w:p>
+                        <w:pPr>
+                          <w:jc w:val="center"/>
+                        </w:pPr>
+                        <w:proofErr w:type="spellStart"/>
+                        <w:r>
+                          <w:t>CertificateNo</w:t>
+                        </w:r>
+                        <w:proofErr w:type="spellEnd"/>
+                      </w:p>
+                    </w:tc>
+                  </w:sdtContent>
+                </w:sdt>
+                <w:sdt>
+                  <w:sdtPr>
+                    <w:alias w:val="#Nav: /SalesInvoiceHeader/SalesInvoiceLine/ValidTo"/>
+                    <w:tag w:val="#Nav: Certificate/50200"/>
+                    <w:id w:val="-1784181467"/>
+                    <w:placeholder>
+                      <w:docPart w:val="DefaultPlaceholder_-1854013440"/>
+                    </w:placeholder>
+                    <w:dataBinding w:prefixMappings="xmlns:ns0='urn:microsoft-dynamics-nav/reports/Certificate/50200/' " w:xpath="/ns0:NavWordReportXmlPart[1]/ns0:SalesInvoiceHeader[1]/ns0:SalesInvoiceLine[1]/ns0:ValidTo[1]" w:storeItemID="{6A36634F-392F-4F9D-A102-FC53C401238A}"/>
+                    <w:text/>
+                  </w:sdtPr>
+                  <w:sdtContent>
+                    <w:tc>
+                      <w:tcPr>
+                        <w:tcW w:w="2407" w:type="dxa"/>
+                      </w:tcPr>
+                      <w:p>
+                        <w:pPr>
+                          <w:jc w:val="center"/>
+                        </w:pPr>
+                        <w:proofErr w:type="spellStart"/>
+                        <w:r>
+                          <w:t>ValidTo</w:t>
+                        </w:r>
+                        <w:proofErr w:type="spellEnd"/>
+                      </w:p>
+                    </w:tc>
+                  </w:sdtContent>
+                </w:sdt>
+              </w:tr>
+            </w:sdtContent>
+          </w:sdt>
+        </w:sdtContent>
+      </w:sdt>
+    </w:tbl>
+    <w:p/>
     <w:p>
       <w:r>
         <w:t> </w:t>
       </w:r>
     </w:p>
     <w:p>
-      <w:pPr>
-        <w:rPr>
-          <w:b/>
-          <w:bCs/>
-        </w:rPr>
-      </w:pPr>
-      <w:r>
-        <w:rPr>
-          <w:b/>
-          <w:bCs/>
-        </w:rPr>
-        <w:t>Product Information </w:t>
+      <w:r>
+        <w:t> </w:t>
       </w:r>
     </w:p>
     <w:p>
       <w:r>
-        <w:t>Product Name: </w:t>
-      </w:r>
-      <w:sdt>
-        <w:sdtPr>
-          <w:id w:val="1480660213"/>
-          <w:placeholder>
-            <w:docPart w:val="DefaultPlaceholder_-1854013440"/>
-          </w:placeholder>
-          <w:dataBinding w:prefixMappings="xmlns:ns0='urn:microsoft-dynamics-nav/reports/Certificate/50200/' " w:xpath="/ns0:NavWordReportXmlPart[1]/ns0:SalesInvoiceHeader[1]/ns0:SalesInvoiceLine[1]/ns0:ProductName[1]" w:storeItemID="{6A36634F-392F-4F9D-A102-FC53C401238A}"/>
-          <w:text/>
-          <w:alias w:val="#Nav: /SalesInvoiceHeader/SalesInvoiceLine/ProductName"/>
-          <w:tag w:val="#Nav: Certificate/50200"/>
-        </w:sdtPr>
-        <w:sdtContent>
-          <w:r>
-            <w:t>ProductName</w:t>
-          </w:r>
-        </w:sdtContent>
-      </w:sdt>
+        <w:t> </w:t>
+      </w:r>
     </w:p>
     <w:p>
       <w:r>
-        <w:t>Manufacturer:</w:t>
-      </w:r>
-      <w:r>
-        <w:t xml:space="preserve"> </w:t>
-      </w:r>
-      <w:sdt>
-        <w:sdtPr>
-          <w:id w:val="-345258685"/>
-          <w:placeholder>
-            <w:docPart w:val="DefaultPlaceholder_-1854013440"/>
-          </w:placeholder>
-          <w:dataBinding w:prefixMappings="xmlns:ns0='urn:microsoft-dynamics-nav/reports/Certificate/50200/' " w:xpath="/ns0:NavWordReportXmlPart[1]/ns0:SalesInvoiceHeader[1]/ns0:SalesInvoiceLine[1]/ns0:Manufacturer[1]" w:storeItemID="{6A36634F-392F-4F9D-A102-FC53C401238A}"/>
-          <w:text/>
-          <w:alias w:val="#Nav: /SalesInvoiceHeader/SalesInvoiceLine/Manufacturer"/>
-          <w:tag w:val="#Nav: Certificate/50200"/>
-        </w:sdtPr>
-        <w:sdtContent>
-          <w:r>
-            <w:t>Manufacturer</w:t>
-          </w:r>
-        </w:sdtContent>
-      </w:sdt>
+        <w:t> </w:t>
+      </w:r>
     </w:p>
     <w:p>
-      <w:pPr>
-        <w:rPr>
-          <w:lang w:val="pt-PT"/>
-        </w:rPr>
-      </w:pPr>
-      <w:r>
-        <w:rPr>
-          <w:lang w:val="pt-PT"/>
-        </w:rPr>
-        <w:t>Certificate No.: </w:t>
-      </w:r>
-      <w:sdt>
-        <w:sdtPr>
-          <w:rPr>
-            <w:lang w:val="pt-PT"/>
-          </w:rPr>
-          <w:id w:val="2018733862"/>
-          <w:placeholder>
-            <w:docPart w:val="DefaultPlaceholder_-1854013440"/>
-          </w:placeholder>
-          <w:dataBinding w:prefixMappings="xmlns:ns0='urn:microsoft-dynamics-nav/reports/Certificate/50200/' " w:xpath="/ns0:NavWordReportXmlPart[1]/ns0:SalesInvoiceHeader[1]/ns0:SalesInvoiceLine[1]/ns0:CertificateNo[1]" w:storeItemID="{6A36634F-392F-4F9D-A102-FC53C401238A}"/>
-          <w:text/>
-          <w:alias w:val="#Nav: /SalesInvoiceHeader/SalesInvoiceLine/CertificateNo"/>
-          <w:tag w:val="#Nav: Certificate/50200"/>
-        </w:sdtPr>
-        <w:sdtContent>
-          <w:r>
-            <w:rPr>
-              <w:lang w:val="pt-PT"/>
-            </w:rPr>
-            <w:t>CertificateNo</w:t>
-          </w:r>
-        </w:sdtContent>
-      </w:sdt>
+      <w:r>
+        <w:t> </w:t>
+      </w:r>
     </w:p>
     <w:p>
-      <w:pPr>
-        <w:rPr>
-          <w:lang w:val="pt-PT"/>
-        </w:rPr>
-      </w:pPr>
-      <w:r>
-        <w:rPr>
-          <w:lang w:val="pt-PT"/>
-        </w:rPr>
-        <w:t>Valid To: </w:t>
-      </w:r>
-      <w:sdt>
-        <w:sdtPr>
-          <w:rPr>
-            <w:lang w:val="pt-PT"/>
-          </w:rPr>
-          <w:id w:val="1879884930"/>
-          <w:placeholder>
-            <w:docPart w:val="DefaultPlaceholder_-1854013440"/>
-          </w:placeholder>
-          <w:dataBinding w:prefixMappings="xmlns:ns0='urn:microsoft-dynamics-nav/reports/Certificate/50200/' " w:xpath="/ns0:NavWordReportXmlPart[1]/ns0:SalesInvoiceHeader[1]/ns0:SalesInvoiceLine[1]/ns0:ValidTo[1]" w:storeItemID="{6A36634F-392F-4F9D-A102-FC53C401238A}"/>
-          <w:text/>
-          <w:alias w:val="#Nav: /SalesInvoiceHeader/SalesInvoiceLine/ValidTo"/>
-          <w:tag w:val="#Nav: Certificate/50200"/>
-        </w:sdtPr>
-        <w:sdtContent>
-          <w:r>
-            <w:rPr>
-              <w:lang w:val="pt-PT"/>
-            </w:rPr>
-            <w:t>ValidTo</w:t>
-          </w:r>
-        </w:sdtContent>
-      </w:sdt>
+      <w:r>
+        <w:t>Certification Summary </w:t>
+      </w:r>
     </w:p>
     <w:p>
-      <w:pPr>
-        <w:rPr>
-          <w:lang w:val="pt-PT"/>
-        </w:rPr>
-      </w:pPr>
-      <w:r>
-        <w:rPr>
-          <w:lang w:val="pt-PT"/>
-        </w:rPr>
-        <w:t> </w:t>
+      <w:r>
+        <w:t>This document certifies that the above-listed product has undergone standard </w:t>
       </w:r>
     </w:p>
     <w:p>
-      <w:pPr>
-        <w:rPr>
-          <w:lang w:val="pt-PT"/>
-        </w:rPr>
-      </w:pPr>
-      <w:r>
-        <w:rPr>
-          <w:lang w:val="pt-PT"/>
-        </w:rPr>
-        <w:t> </w:t>
-      </w:r>
-    </w:p>
-    <w:p>
-      <w:pPr>
-        <w:rPr>
-          <w:lang w:val="pt-PT"/>
-        </w:rPr>
-      </w:pPr>
-      <w:r>
-        <w:rPr>
-          <w:lang w:val="pt-PT"/>
-        </w:rPr>
-        <w:t> </w:t>
-      </w:r>
-    </w:p>
-    <w:p>
-      <w:pPr>
-        <w:rPr>
-          <w:lang w:val="pt-PT"/>
-        </w:rPr>
-      </w:pPr>
-      <w:r>
-        <w:rPr>
-          <w:lang w:val="pt-PT"/>
-        </w:rPr>
-        <w:t> </w:t>
-      </w:r>
-    </w:p>
-    <w:p>
-      <w:r>
-        <w:t>Certification Summary </w:t>
-      </w:r>
-    </w:p>
-    <w:p>
-      <w:r>
-        <w:t>This document certifies that the above-listed product has undergone standard </w:t>
-      </w:r>
-    </w:p>
-    <w:p>
-      <w:r>
-        <w:t>electrical, mechanical, and environmental safety evaluation and meets the compliance requirements for our distribution within the UK C EU markets. </w:t>
+      <w:proofErr w:type="gramStart"/>
+      <w:r>
+        <w:t>electrical</w:t>
+      </w:r>
+      <w:proofErr w:type="gramEnd"/>
+      <w:r>
+        <w:t>, mechanical, and environmental safety evaluation and meets the compliance requirements for our distribution within the UK C EU markets. </w:t>
       </w:r>
     </w:p>
     <w:p/>
@@ -815,6 +908,25 @@
       <w:color w:val="666666"/>
     </w:rPr>
   </w:style>
+  <w:style w:type="table" w:styleId="TableGrid">
+    <w:name w:val="Table Grid"/>
+    <w:basedOn w:val="TableNormal"/>
+    <w:uiPriority w:val="39"/>
+    <w:rsid w:val="00B41638"/>
+    <w:pPr>
+      <w:spacing w:after="0" w:line="240" w:lineRule="auto"/>
+    </w:pPr>
+    <w:tblPr>
+      <w:tblBorders>
+        <w:top w:val="single" w:sz="4" w:space="0" w:color="auto"/>
+        <w:left w:val="single" w:sz="4" w:space="0" w:color="auto"/>
+        <w:bottom w:val="single" w:sz="4" w:space="0" w:color="auto"/>
+        <w:right w:val="single" w:sz="4" w:space="0" w:color="auto"/>
+        <w:insideH w:val="single" w:sz="4" w:space="0" w:color="auto"/>
+        <w:insideV w:val="single" w:sz="4" w:space="0" w:color="auto"/>
+      </w:tblBorders>
+    </w:tblPr>
+  </w:style>
 </w:styles>
 </file>
 
@@ -843,6 +955,32 @@
               <w:rStyle w:val="PlaceholderText"/>
             </w:rPr>
             <w:t>Click or tap here to enter text.</w:t>
+          </w:r>
+        </w:p>
+      </w:docPartBody>
+    </w:docPart>
+    <w:docPart>
+      <w:docPartPr>
+        <w:name w:val="DefaultPlaceholder_-1854013435"/>
+        <w:category>
+          <w:name w:val="General"/>
+          <w:gallery w:val="placeholder"/>
+        </w:category>
+        <w:types>
+          <w:type w:val="bbPlcHdr"/>
+        </w:types>
+        <w:behaviors>
+          <w:behavior w:val="content"/>
+        </w:behaviors>
+        <w:guid w:val="{A61757B5-3207-4154-A794-9FB98D671757}"/>
+      </w:docPartPr>
+      <w:docPartBody>
+        <w:p>
+          <w:r>
+            <w:rPr>
+              <w:rStyle w:val="PlaceholderText"/>
+            </w:rPr>
+            <w:t>Enter any content that you want to repeat, including other content controls. You can also insert this control around table rows in order to repeat parts of a table.</w:t>
           </w:r>
         </w:p>
       </w:docPartBody>
@@ -891,12 +1029,20 @@
   </w:compat>
   <w:rsids>
     <w:rsidRoot w:val="00457BB0"/>
+    <w:rsid w:val="00174924"/>
+    <w:rsid w:val="00201199"/>
     <w:rsid w:val="00457BB0"/>
     <w:rsid w:val="004D6E62"/>
     <w:rsid w:val="00530AAA"/>
+    <w:rsid w:val="008C0086"/>
     <w:rsid w:val="00AC512B"/>
     <w:rsid w:val="00B75DE2"/>
+    <w:rsid w:val="00BD230D"/>
+    <w:rsid w:val="00CD6AEB"/>
+    <w:rsid w:val="00CF0581"/>
     <w:rsid w:val="00EB25D7"/>
+    <w:rsid w:val="00F71459"/>
+    <w:rsid w:val="00FB74E0"/>
   </w:rsids>
   <m:mathPr>
     <m:mathFont m:val="Cambria Math"/>
@@ -1352,7 +1498,7 @@
     <w:basedOn w:val="DefaultParagraphFont"/>
     <w:uiPriority w:val="99"/>
     <w:semiHidden/>
-    <w:rsid w:val="00457BB0"/>
+    <w:rsid w:val="00F71459"/>
     <w:rPr>
       <w:color w:val="666666"/>
     </w:rPr>
@@ -1682,9 +1828,7 @@
 </a:theme>
 </file>
 
-<file path=customXml/item1.xml>��< ? x m l   v e r s i o n = " 1 . 0 "   e n c o d i n g = " u t f - 1 6 " ? > - 
- < N a v W o r d R e p o r t X m l P a r t   x m l n s = " u r n : m i c r o s o f t - d y n a m i c s - n a v / r e p o r t s / C e r t i f i c a t e / 5 0 2 0 0 / " > +<file path=customXml/item1.xml>��< ? x m l   v e r s i o n = " 1 . 0 "   e n c o d i n g = " u t f - 1 6 " ? > < N a v W o r d R e p o r t X m l P a r t   x m l n s = " u r n : m i c r o s o f t - d y n a m i c s - b u s i n e s s c e n t r a l / i n t e r n a l / e x t e n d e d / r e p o r t s / C e r t i f i c a t e / 5 0 2 0 0 / " >   
      < B C R e p o r t I n f o r m a t i o n >   
@@ -1750,25 +1894,35 @@
  
      < / B C R e p o r t I n f o r m a t i o n >   
-     < S a l e s I n v o i c e H e a d e r > - 
-         < S a l e s I n v o i c e L i n e > - 
-             < C e r t i f i c a t e N o > C e r t i f i c a t e N o < / C e r t i f i c a t e N o > - 
-             < C u s t o m e r N a m e > C u s t o m e r N a m e < / C u s t o m e r N a m e > - 
-             < C u s t o m e r N o > C u s t o m e r N o < / C u s t o m e r N o > - 
-             < D a t e O f S a l e > D a t e O f S a l e < / D a t e O f S a l e > - 
-             < M a n u f a c t u r e r > M a n u f a c t u r e r < / M a n u f a c t u r e r > - 
-             < P r o d u c t N a m e > P r o d u c t N a m e < / P r o d u c t N a m e > - 
-             < S a l e s O r d e r N o > S a l e s O r d e r N o < / S a l e s O r d e r N o > - 
-             < V a l i d T o > V a l i d T o < / V a l i d T o > +     < T o o l t i p s > + 
+         < T o o l t i p   c o l u m n = " C u s t o m e r N o "   E l e m e n t I d = " 1 5 4 2 0 5 1 5 6 0 " > + 
+             < T o o l t i p T e x t   l a n g = " e n - U S " > S p e c i f i e s   t h e   n u m b e r   o f   t h e   c u s t o m e r   t h a t   y o u   s h i p p e d   t h e   i t e m s   o n   t h e   i n v o i c e   t o . < / T o o l t i p T e x t > + 
+         < / T o o l t i p > + 
+     < / T o o l t i p s > + 
+     < S a l e s I n v o i c e H e a d e r   E l e m e n t T y p e = " D a t a I t e m "   E l e m e n t I d = " 8 1 1 7 7 1 2 1 3 " > + 
+         < S a l e s I n v o i c e L i n e   E l e m e n t T y p e = " D a t a I t e m "   E l e m e n t I d = " 5 2 5 7 7 7 4 9 8 " > + 
+             < C e r t i f i c a t e N o   E l e m e n t T y p e = " C o l u m n "   E l e m e n t I d = " 1 5 9 2 1 1 5 9 2 9 "   D a t a T y p e = " C o d e " > C e r t i f i c a t e N o < / C e r t i f i c a t e N o > + 
+             < C u s t o m e r N a m e   E l e m e n t T y p e = " C o l u m n "   E l e m e n t I d = " 2 6 5 4 9 6 8 2 6 "   D a t a T y p e = " T e x t " > C u s t o m e r N a m e < / C u s t o m e r N a m e > + 
+             < C u s t o m e r N o   E l e m e n t T y p e = " C o l u m n "   E l e m e n t I d = " 1 5 4 2 0 5 1 5 6 0 "   D a t a T y p e = " C o d e " > C u s t o m e r N o < / C u s t o m e r N o > + 
+             < D a t e O f S a l e   E l e m e n t T y p e = " C o l u m n "   E l e m e n t I d = " 2 0 0 9 4 8 9 9 1 7 "   D a t a T y p e = " D a t e " > D a t e O f S a l e < / D a t e O f S a l e > + 
+             < M a n u f a c t u r e r   E l e m e n t T y p e = " C o l u m n "   E l e m e n t I d = " 1 4 9 9 6 4 4 9 0 6 "   D a t a T y p e = " T e x t " > M a n u f a c t u r e r < / M a n u f a c t u r e r > + 
+             < P r o d u c t N a m e   E l e m e n t T y p e = " C o l u m n "   E l e m e n t I d = " 6 2 5 7 4 8 3 9 9 "   D a t a T y p e = " T e x t " > P r o d u c t N a m e < / P r o d u c t N a m e > + 
+             < S a l e s O r d e r N o   E l e m e n t T y p e = " C o l u m n "   E l e m e n t I d = " 5 8 7 0 2 0 7 5 4 "   D a t a T y p e = " C o d e " > S a l e s O r d e r N o < / S a l e s O r d e r N o > + 
+             < V a l i d T o   E l e m e n t T y p e = " C o l u m n "   E l e m e n t I d = " 1 8 4 9 2 0 4 3 4 4 "   D a t a T y p e = " D a t e " > V a l i d T o < / V a l i d T o >   
          < / S a l e s I n v o i c e L i n e >   
@@ -1777,9 +1931,7 @@
  < / N a v W o r d R e p o r t X m l P a r t > 
 </file>
 
-<file path=customXml/item2.xml>��< ? x m l   v e r s i o n = " 1 . 0 "   e n c o d i n g = " u t f - 1 6 " ? > - 
- < N a v W o r d R e p o r t X m l P a r t   x m l n s = " u r n : m i c r o s o f t - d y n a m i c s - b u s i n e s s c e n t r a l / i n t e r n a l / e x t e n d e d / r e p o r t s / C e r t i f i c a t e / 5 0 2 0 0 / " > +<file path=customXml/item2.xml>��< ? x m l   v e r s i o n = " 1 . 0 "   e n c o d i n g = " u t f - 1 6 " ? > < N a v W o r d R e p o r t X m l P a r t   x m l n s = " u r n : m i c r o s o f t - d y n a m i c s - n a v / r e p o r t s / C e r t i f i c a t e / 5 0 2 0 0 / " >   
      < B C R e p o r t I n f o r m a t i o n >   
@@ -1845,35 +1997,25 @@
  
      < / B C R e p o r t I n f o r m a t i o n >   
-     < T o o l t i p s > - 
-         < T o o l t i p   c o l u m n = " C u s t o m e r N o "   E l e m e n t I d = " 1 5 4 2 0 5 1 5 6 0 " > - 
-             < T o o l t i p T e x t   l a n g = " e n - U S " > S p e c i f i e s   t h e   n u m b e r   o f   t h e   c u s t o m e r   t h a t   y o u   s h i p p e d   t h e   i t e m s   o n   t h e   i n v o i c e   t o . < / T o o l t i p T e x t > - 
-         < / T o o l t i p > - 
-     < / T o o l t i p s > - 
-     < S a l e s I n v o i c e H e a d e r   E l e m e n t T y p e = " D a t a I t e m "   E l e m e n t I d = " 8 1 1 7 7 1 2 1 3 " > - 
-         < S a l e s I n v o i c e L i n e   E l e m e n t T y p e = " D a t a I t e m "   E l e m e n t I d = " 5 2 5 7 7 7 4 9 8 " > - 
-             < C e r t i f i c a t e N o   E l e m e n t T y p e = " C o l u m n "   E l e m e n t I d = " 1 5 9 2 1 1 5 9 2 9 "   D a t a T y p e = " C o d e " > C e r t i f i c a t e N o < / C e r t i f i c a t e N o > - 
-             < C u s t o m e r N a m e   E l e m e n t T y p e = " C o l u m n "   E l e m e n t I d = " 2 6 5 4 9 6 8 2 6 "   D a t a T y p e = " T e x t " > C u s t o m e r N a m e < / C u s t o m e r N a m e > - 
-             < C u s t o m e r N o   E l e m e n t T y p e = " C o l u m n "   E l e m e n t I d = " 1 5 4 2 0 5 1 5 6 0 "   D a t a T y p e = " C o d e " > C u s t o m e r N o < / C u s t o m e r N o > - 
-             < D a t e O f S a l e   E l e m e n t T y p e = " C o l u m n "   E l e m e n t I d = " 2 0 0 9 4 8 9 9 1 7 "   D a t a T y p e = " D a t e " > D a t e O f S a l e < / D a t e O f S a l e > - 
-             < M a n u f a c t u r e r   E l e m e n t T y p e = " C o l u m n "   E l e m e n t I d = " 1 4 9 9 6 4 4 9 0 6 "   D a t a T y p e = " T e x t " > M a n u f a c t u r e r < / M a n u f a c t u r e r > - 
-             < P r o d u c t N a m e   E l e m e n t T y p e = " C o l u m n "   E l e m e n t I d = " 6 2 5 7 4 8 3 9 9 "   D a t a T y p e = " T e x t " > P r o d u c t N a m e < / P r o d u c t N a m e > - 
-             < S a l e s O r d e r N o   E l e m e n t T y p e = " C o l u m n "   E l e m e n t I d = " 5 8 7 0 2 0 7 5 4 "   D a t a T y p e = " C o d e " > S a l e s O r d e r N o < / S a l e s O r d e r N o > - 
-             < V a l i d T o   E l e m e n t T y p e = " C o l u m n "   E l e m e n t I d = " 1 8 4 9 2 0 4 3 4 4 "   D a t a T y p e = " D a t e " > V a l i d T o < / V a l i d T o > +     < S a l e s I n v o i c e H e a d e r > + 
+         < S a l e s I n v o i c e L i n e > + 
+             < C e r t i f i c a t e N o > C e r t i f i c a t e N o < / C e r t i f i c a t e N o > + 
+             < C u s t o m e r N a m e > C u s t o m e r N a m e < / C u s t o m e r N a m e > + 
+             < C u s t o m e r N o > C u s t o m e r N o < / C u s t o m e r N o > + 
+             < D a t e O f S a l e > D a t e O f S a l e < / D a t e O f S a l e > + 
+             < M a n u f a c t u r e r > M a n u f a c t u r e r < / M a n u f a c t u r e r > + 
+             < P r o d u c t N a m e > P r o d u c t N a m e < / P r o d u c t N a m e > + 
+             < S a l e s O r d e r N o > S a l e s O r d e r N o < / S a l e s O r d e r N o > + 
+             < V a l i d T o > V a l i d T o < / V a l i d T o >   
          < / S a l e s I n v o i c e L i n e >   
@@ -1883,17 +2025,17 @@
 </file>
 
 <file path=customXml/itemProps1.xml><?xml version="1.0" encoding="utf-8"?>
+<ds:datastoreItem xmlns:ds="http://schemas.openxmlformats.org/officeDocument/2006/customXml" ds:itemID="{2074CFC1-222B-449D-A67E-469654D51151}">
+  <ds:schemaRefs>
+    <ds:schemaRef ds:uri="urn:microsoft-dynamics-businesscentral/internal/extended/reports/Certificate/50200/"/>
+  </ds:schemaRefs>
+</ds:datastoreItem>
+</file>
+
+<file path=customXml/itemProps2.xml><?xml version="1.0" encoding="utf-8"?>
 <ds:datastoreItem xmlns:ds="http://schemas.openxmlformats.org/officeDocument/2006/customXml" ds:itemID="{6A36634F-392F-4F9D-A102-FC53C401238A}">
   <ds:schemaRefs>
     <ds:schemaRef ds:uri="urn:microsoft-dynamics-nav/reports/Certificate/50200/"/>
   </ds:schemaRefs>
 </ds:datastoreItem>
-</file>
-
-<file path=customXml/itemProps2.xml><?xml version="1.0" encoding="utf-8"?>
-<ds:datastoreItem xmlns:ds="http://schemas.openxmlformats.org/officeDocument/2006/customXml" ds:itemID="{2074CFC1-222B-449D-A67E-469654D51151}">
-  <ds:schemaRefs>
-    <ds:schemaRef ds:uri="urn:microsoft-dynamics-businesscentral/internal/extended/reports/Certificate/50200/"/>
-  </ds:schemaRefs>
-</ds:datastoreItem>
 </file>
</xml_diff>